<commit_message>
report and code updated for first half of task 6
</commit_message>
<xml_diff>
--- a/WAD_Report.docx
+++ b/WAD_Report.docx
@@ -640,35 +640,7 @@
         <w:rPr>
           <w:rFonts w:ascii="Trebuchet MS" w:eastAsia="Trebuchet MS" w:hAnsi="Trebuchet MS" w:cs="Trebuchet MS"/>
         </w:rPr>
-        <w:t xml:space="preserve"> the previous GET endpoint, I will be able to easily test it in the browser and will be contained in a </w:t>
-      </w:r>
-      <w:proofErr w:type="gramStart"/>
-      <w:r>
-        <w:rPr>
-          <w:rFonts w:ascii="Trebuchet MS" w:eastAsia="Trebuchet MS" w:hAnsi="Trebuchet MS" w:cs="Trebuchet MS"/>
-        </w:rPr>
-        <w:t>try{</w:t>
-      </w:r>
-      <w:proofErr w:type="gramEnd"/>
-      <w:r>
-        <w:rPr>
-          <w:rFonts w:ascii="Trebuchet MS" w:eastAsia="Trebuchet MS" w:hAnsi="Trebuchet MS" w:cs="Trebuchet MS"/>
-        </w:rPr>
-        <w:t xml:space="preserve">} and </w:t>
-      </w:r>
-      <w:proofErr w:type="gramStart"/>
-      <w:r>
-        <w:rPr>
-          <w:rFonts w:ascii="Trebuchet MS" w:eastAsia="Trebuchet MS" w:hAnsi="Trebuchet MS" w:cs="Trebuchet MS"/>
-        </w:rPr>
-        <w:t>catch{</w:t>
-      </w:r>
-      <w:proofErr w:type="gramEnd"/>
-      <w:r>
-        <w:rPr>
-          <w:rFonts w:ascii="Trebuchet MS" w:eastAsia="Trebuchet MS" w:hAnsi="Trebuchet MS" w:cs="Trebuchet MS"/>
-        </w:rPr>
-        <w:t>} statement similarly to the previous task.</w:t>
+        <w:t xml:space="preserve"> the previous GET endpoint, I will be able to easily test it in the browser and will be contained in a try{} and catch{} statement similarly to the previous task.</w:t>
       </w:r>
       <w:r>
         <w:rPr>
@@ -1432,19 +1404,7 @@
         <w:rPr>
           <w:rFonts w:ascii="Trebuchet MS" w:eastAsia="Trebuchet MS" w:hAnsi="Trebuchet MS" w:cs="Trebuchet MS"/>
         </w:rPr>
-        <w:t xml:space="preserve"> and</w:t>
-      </w:r>
-      <w:r>
-        <w:rPr>
-          <w:rFonts w:ascii="Trebuchet MS" w:eastAsia="Trebuchet MS" w:hAnsi="Trebuchet MS" w:cs="Trebuchet MS"/>
-        </w:rPr>
-        <w:t xml:space="preserve"> </w:t>
-      </w:r>
-      <w:r>
-        <w:rPr>
-          <w:rFonts w:ascii="Trebuchet MS" w:eastAsia="Trebuchet MS" w:hAnsi="Trebuchet MS" w:cs="Trebuchet MS"/>
-        </w:rPr>
-        <w:t xml:space="preserve">pass the parsed JSON up to App via the </w:t>
+        <w:t xml:space="preserve"> and pass the parsed JSON up to App via the </w:t>
       </w:r>
       <w:proofErr w:type="spellStart"/>
       <w:r>
@@ -1680,6 +1640,193 @@
           <w:right w:val="nil"/>
           <w:between w:val="nil"/>
         </w:pBdr>
+        <w:spacing w:after="240"/>
+        <w:ind w:left="720"/>
+        <w:rPr>
+          <w:rFonts w:ascii="Trebuchet MS" w:eastAsia="Trebuchet MS" w:hAnsi="Trebuchet MS" w:cs="Trebuchet MS"/>
+        </w:rPr>
+      </w:pPr>
+    </w:p>
+    <w:p/>
+    <w:p/>
+    <w:p>
+      <w:pPr>
+        <w:pStyle w:val="Heading1"/>
+        <w:spacing w:after="240"/>
+        <w:rPr>
+          <w:b/>
+          <w:bCs/>
+        </w:rPr>
+      </w:pPr>
+      <w:r>
+        <w:rPr>
+          <w:b/>
+          <w:bCs/>
+        </w:rPr>
+        <w:lastRenderedPageBreak/>
+        <w:t>Part C – Adding simple error-checking</w:t>
+      </w:r>
+    </w:p>
+    <w:p>
+      <w:pPr>
+        <w:rPr>
+          <w:rFonts w:ascii="Trebuchet MS" w:hAnsi="Trebuchet MS" w:cs="Trebuchet MS"/>
+        </w:rPr>
+      </w:pPr>
+    </w:p>
+    <w:p>
+      <w:pPr>
+        <w:spacing w:after="240"/>
+        <w:rPr>
+          <w:rFonts w:ascii="Trebuchet MS" w:eastAsia="Trebuchet MS" w:hAnsi="Trebuchet MS" w:cs="Trebuchet MS"/>
+          <w:i/>
+          <w:iCs/>
+        </w:rPr>
+      </w:pPr>
+      <w:r>
+        <w:rPr>
+          <w:rFonts w:ascii="Trebuchet MS" w:eastAsia="Trebuchet MS" w:hAnsi="Trebuchet MS" w:cs="Trebuchet MS"/>
+          <w:i/>
+          <w:iCs/>
+        </w:rPr>
+        <w:t xml:space="preserve">6. </w:t>
+      </w:r>
+      <w:r>
+        <w:rPr>
+          <w:rFonts w:ascii="Trebuchet MS" w:eastAsia="Trebuchet MS" w:hAnsi="Trebuchet MS" w:cs="Trebuchet MS"/>
+          <w:i/>
+          <w:iCs/>
+        </w:rPr>
+        <w:t>“</w:t>
+      </w:r>
+      <w:r>
+        <w:rPr>
+          <w:rFonts w:ascii="Trebuchet MS" w:eastAsia="Trebuchet MS" w:hAnsi="Trebuchet MS" w:cs="Trebuchet MS"/>
+          <w:i/>
+          <w:iCs/>
+        </w:rPr>
+        <w:t>Add error-checking to task 3, so that if any of the details (ID, number of people, date) are blank, an appropriate HTTP error code is sent back to the client. Then, modify task 5 to test for the HTTP code returned from the server and display an appropriate user-friendly message to the user, which will be understood by a non-technical user.</w:t>
+      </w:r>
+      <w:r>
+        <w:rPr>
+          <w:rFonts w:ascii="Trebuchet MS" w:eastAsia="Trebuchet MS" w:hAnsi="Trebuchet MS" w:cs="Trebuchet MS"/>
+          <w:i/>
+          <w:iCs/>
+        </w:rPr>
+        <w:t>”</w:t>
+      </w:r>
+    </w:p>
+    <w:p>
+      <w:pPr>
+        <w:spacing w:after="240"/>
+        <w:ind w:left="720"/>
+        <w:rPr>
+          <w:rFonts w:ascii="Trebuchet MS" w:eastAsia="Trebuchet MS" w:hAnsi="Trebuchet MS" w:cs="Trebuchet MS"/>
+        </w:rPr>
+      </w:pPr>
+      <w:r>
+        <w:rPr>
+          <w:noProof/>
+        </w:rPr>
+        <w:drawing>
+          <wp:anchor distT="0" distB="0" distL="114300" distR="114300" simplePos="0" relativeHeight="251664384" behindDoc="0" locked="0" layoutInCell="1" allowOverlap="1" wp14:anchorId="3A3AD79F" wp14:editId="62B93B01">
+            <wp:simplePos x="0" y="0"/>
+            <wp:positionH relativeFrom="margin">
+              <wp:align>center</wp:align>
+            </wp:positionH>
+            <wp:positionV relativeFrom="paragraph">
+              <wp:posOffset>1455420</wp:posOffset>
+            </wp:positionV>
+            <wp:extent cx="4943475" cy="2019300"/>
+            <wp:effectExtent l="0" t="0" r="9525" b="0"/>
+            <wp:wrapTopAndBottom/>
+            <wp:docPr id="1513084909" name="Picture 1"/>
+            <wp:cNvGraphicFramePr>
+              <a:graphicFrameLocks xmlns:a="http://schemas.openxmlformats.org/drawingml/2006/main" noChangeAspect="1"/>
+            </wp:cNvGraphicFramePr>
+            <a:graphic xmlns:a="http://schemas.openxmlformats.org/drawingml/2006/main">
+              <a:graphicData uri="http://schemas.openxmlformats.org/drawingml/2006/picture">
+                <pic:pic xmlns:pic="http://schemas.openxmlformats.org/drawingml/2006/picture">
+                  <pic:nvPicPr>
+                    <pic:cNvPr id="1513084909" name=""/>
+                    <pic:cNvPicPr/>
+                  </pic:nvPicPr>
+                  <pic:blipFill>
+                    <a:blip r:embed="rId11">
+                      <a:extLst>
+                        <a:ext uri="{28A0092B-C50C-407E-A947-70E740481C1C}">
+                          <a14:useLocalDpi xmlns:a14="http://schemas.microsoft.com/office/drawing/2010/main" val="0"/>
+                        </a:ext>
+                      </a:extLst>
+                    </a:blip>
+                    <a:stretch>
+                      <a:fillRect/>
+                    </a:stretch>
+                  </pic:blipFill>
+                  <pic:spPr>
+                    <a:xfrm>
+                      <a:off x="0" y="0"/>
+                      <a:ext cx="4943475" cy="2019300"/>
+                    </a:xfrm>
+                    <a:prstGeom prst="rect">
+                      <a:avLst/>
+                    </a:prstGeom>
+                  </pic:spPr>
+                </pic:pic>
+              </a:graphicData>
+            </a:graphic>
+          </wp:anchor>
+        </w:drawing>
+      </w:r>
+      <w:r>
+        <w:rPr>
+          <w:rFonts w:ascii="Trebuchet MS" w:eastAsia="Trebuchet MS" w:hAnsi="Trebuchet MS" w:cs="Trebuchet MS"/>
+        </w:rPr>
+        <w:t xml:space="preserve">Although I had already added error checking to task 3 when originally doing the task. I will tweak the error handling to be broader and include more potential </w:t>
+      </w:r>
+      <w:r>
+        <w:rPr>
+          <w:rFonts w:ascii="Trebuchet MS" w:eastAsia="Trebuchet MS" w:hAnsi="Trebuchet MS" w:cs="Trebuchet MS"/>
+        </w:rPr>
+        <w:t xml:space="preserve">misinputs/incorrect inputs that the user could make. For instance, I will make the error handling include if the user inputs 0 for the </w:t>
+      </w:r>
+      <w:proofErr w:type="spellStart"/>
+      <w:r>
+        <w:rPr>
+          <w:rFonts w:ascii="Trebuchet MS" w:eastAsia="Trebuchet MS" w:hAnsi="Trebuchet MS" w:cs="Trebuchet MS"/>
+        </w:rPr>
+        <w:t>accomodationID</w:t>
+      </w:r>
+      <w:proofErr w:type="spellEnd"/>
+      <w:r>
+        <w:rPr>
+          <w:rFonts w:ascii="Trebuchet MS" w:eastAsia="Trebuchet MS" w:hAnsi="Trebuchet MS" w:cs="Trebuchet MS"/>
+        </w:rPr>
+        <w:t xml:space="preserve"> or the number of people, as the ID can’t be zero nor can the number of people for the booking. Moreover, I will make </w:t>
+      </w:r>
+      <w:proofErr w:type="gramStart"/>
+      <w:r>
+        <w:rPr>
+          <w:rFonts w:ascii="Trebuchet MS" w:eastAsia="Trebuchet MS" w:hAnsi="Trebuchet MS" w:cs="Trebuchet MS"/>
+        </w:rPr>
+        <w:t>it</w:t>
+      </w:r>
+      <w:proofErr w:type="gramEnd"/>
+      <w:r>
+        <w:rPr>
+          <w:rFonts w:ascii="Trebuchet MS" w:eastAsia="Trebuchet MS" w:hAnsi="Trebuchet MS" w:cs="Trebuchet MS"/>
+        </w:rPr>
+        <w:t xml:space="preserve"> so the error handling also prevents an empty string for the date to ensure that the availability is correctly reduced for the given date.</w:t>
+      </w:r>
+      <w:r>
+        <w:rPr>
+          <w:rFonts w:ascii="Trebuchet MS" w:eastAsia="Trebuchet MS" w:hAnsi="Trebuchet MS" w:cs="Trebuchet MS"/>
+        </w:rPr>
+        <w:t xml:space="preserve"> I will also change the returned error message that is given to the user to better reflect the broader error handler.</w:t>
+      </w:r>
+    </w:p>
+    <w:p>
+      <w:pPr>
         <w:spacing w:after="240"/>
         <w:ind w:left="720"/>
         <w:rPr>

</xml_diff>

<commit_message>
Finished report and code for task 6
</commit_message>
<xml_diff>
--- a/WAD_Report.docx
+++ b/WAD_Report.docx
@@ -1823,6 +1823,114 @@
           <w:rFonts w:ascii="Trebuchet MS" w:eastAsia="Trebuchet MS" w:hAnsi="Trebuchet MS" w:cs="Trebuchet MS"/>
         </w:rPr>
         <w:t xml:space="preserve"> I will also change the returned error message that is given to the user to better reflect the broader error handler.</w:t>
+      </w:r>
+    </w:p>
+    <w:p>
+      <w:pPr>
+        <w:spacing w:after="240"/>
+        <w:ind w:left="720"/>
+        <w:rPr>
+          <w:rFonts w:ascii="Trebuchet MS" w:eastAsia="Trebuchet MS" w:hAnsi="Trebuchet MS" w:cs="Trebuchet MS"/>
+        </w:rPr>
+      </w:pPr>
+    </w:p>
+    <w:p>
+      <w:pPr>
+        <w:spacing w:after="240"/>
+        <w:ind w:left="720"/>
+        <w:rPr>
+          <w:rFonts w:ascii="Trebuchet MS" w:eastAsia="Trebuchet MS" w:hAnsi="Trebuchet MS" w:cs="Trebuchet MS"/>
+        </w:rPr>
+      </w:pPr>
+      <w:r>
+        <w:rPr>
+          <w:noProof/>
+        </w:rPr>
+        <w:drawing>
+          <wp:anchor distT="0" distB="0" distL="114300" distR="114300" simplePos="0" relativeHeight="251665408" behindDoc="0" locked="0" layoutInCell="1" allowOverlap="1" wp14:anchorId="3D485B72" wp14:editId="04866FC5">
+            <wp:simplePos x="0" y="0"/>
+            <wp:positionH relativeFrom="margin">
+              <wp:align>right</wp:align>
+            </wp:positionH>
+            <wp:positionV relativeFrom="paragraph">
+              <wp:posOffset>1889760</wp:posOffset>
+            </wp:positionV>
+            <wp:extent cx="6858000" cy="1721485"/>
+            <wp:effectExtent l="0" t="0" r="0" b="0"/>
+            <wp:wrapTopAndBottom/>
+            <wp:docPr id="2142721523" name="Picture 1"/>
+            <wp:cNvGraphicFramePr>
+              <a:graphicFrameLocks xmlns:a="http://schemas.openxmlformats.org/drawingml/2006/main" noChangeAspect="1"/>
+            </wp:cNvGraphicFramePr>
+            <a:graphic xmlns:a="http://schemas.openxmlformats.org/drawingml/2006/main">
+              <a:graphicData uri="http://schemas.openxmlformats.org/drawingml/2006/picture">
+                <pic:pic xmlns:pic="http://schemas.openxmlformats.org/drawingml/2006/picture">
+                  <pic:nvPicPr>
+                    <pic:cNvPr id="2142721523" name=""/>
+                    <pic:cNvPicPr/>
+                  </pic:nvPicPr>
+                  <pic:blipFill>
+                    <a:blip r:embed="rId12">
+                      <a:extLst>
+                        <a:ext uri="{28A0092B-C50C-407E-A947-70E740481C1C}">
+                          <a14:useLocalDpi xmlns:a14="http://schemas.microsoft.com/office/drawing/2010/main" val="0"/>
+                        </a:ext>
+                      </a:extLst>
+                    </a:blip>
+                    <a:stretch>
+                      <a:fillRect/>
+                    </a:stretch>
+                  </pic:blipFill>
+                  <pic:spPr>
+                    <a:xfrm>
+                      <a:off x="0" y="0"/>
+                      <a:ext cx="6858000" cy="1721485"/>
+                    </a:xfrm>
+                    <a:prstGeom prst="rect">
+                      <a:avLst/>
+                    </a:prstGeom>
+                  </pic:spPr>
+                </pic:pic>
+              </a:graphicData>
+            </a:graphic>
+          </wp:anchor>
+        </w:drawing>
+      </w:r>
+      <w:r>
+        <w:rPr>
+          <w:rFonts w:ascii="Trebuchet MS" w:eastAsia="Trebuchet MS" w:hAnsi="Trebuchet MS" w:cs="Trebuchet MS"/>
+        </w:rPr>
+        <w:t>Similarly to the task 3 error handling, I will improve upon tasks 5 current error handling. I plan to change the if statement</w:t>
+      </w:r>
+      <w:r>
+        <w:rPr>
+          <w:rFonts w:ascii="Trebuchet MS" w:eastAsia="Trebuchet MS" w:hAnsi="Trebuchet MS" w:cs="Trebuchet MS"/>
+        </w:rPr>
+        <w:t>,</w:t>
+      </w:r>
+      <w:r>
+        <w:rPr>
+          <w:rFonts w:ascii="Trebuchet MS" w:eastAsia="Trebuchet MS" w:hAnsi="Trebuchet MS" w:cs="Trebuchet MS"/>
+        </w:rPr>
+        <w:t xml:space="preserve"> which checks whether the response is okay</w:t>
+      </w:r>
+      <w:r>
+        <w:rPr>
+          <w:rFonts w:ascii="Trebuchet MS" w:eastAsia="Trebuchet MS" w:hAnsi="Trebuchet MS" w:cs="Trebuchet MS"/>
+        </w:rPr>
+        <w:t>,</w:t>
+      </w:r>
+      <w:r>
+        <w:rPr>
+          <w:rFonts w:ascii="Trebuchet MS" w:eastAsia="Trebuchet MS" w:hAnsi="Trebuchet MS" w:cs="Trebuchet MS"/>
+        </w:rPr>
+        <w:t xml:space="preserve"> to also include specific error statuses so the message that is returned better reflects the error shown to the user. For example</w:t>
+      </w:r>
+      <w:r>
+        <w:rPr>
+          <w:rFonts w:ascii="Trebuchet MS" w:eastAsia="Trebuchet MS" w:hAnsi="Trebuchet MS" w:cs="Trebuchet MS"/>
+        </w:rPr>
+        <w:t>, if a status of 400 is returned, which reflects an invalid input by the user, it will display the appropriate message informing the user that the given details are invalid. On the other hand, if a status of 500 is returned, which reflects a server-side error, it will inform the user that there is an error on our end. If any other status code is returned, not including an okay response, the user is simply informed that an unknown error has occurred. This will make sure that all errors are handled and displayed appropriately.</w:t>
       </w:r>
     </w:p>
     <w:p>

</xml_diff>

<commit_message>
Added Map component for mapping
</commit_message>
<xml_diff>
--- a/WAD_Report.docx
+++ b/WAD_Report.docx
@@ -1935,12 +1935,274 @@
     </w:p>
     <w:p>
       <w:pPr>
-        <w:spacing w:after="240"/>
+        <w:pStyle w:val="Heading1"/>
+        <w:spacing w:after="240"/>
+        <w:rPr>
+          <w:b/>
+          <w:bCs/>
+        </w:rPr>
+      </w:pPr>
+      <w:r>
+        <w:rPr>
+          <w:b/>
+          <w:bCs/>
+        </w:rPr>
+        <w:lastRenderedPageBreak/>
+        <w:t>Part D – Adding a map</w:t>
+      </w:r>
+    </w:p>
+    <w:p>
+      <w:pPr>
+        <w:rPr>
+          <w:i/>
+          <w:iCs/>
+        </w:rPr>
+      </w:pPr>
+      <w:r>
+        <w:rPr>
+          <w:rFonts w:ascii="Trebuchet MS" w:hAnsi="Trebuchet MS" w:cs="Trebuchet MS"/>
+        </w:rPr>
+        <w:t xml:space="preserve">7. </w:t>
+      </w:r>
+      <w:r>
+        <w:rPr>
+          <w:rFonts w:ascii="Trebuchet MS" w:hAnsi="Trebuchet MS" w:cs="Trebuchet MS"/>
+          <w:i/>
+          <w:iCs/>
+        </w:rPr>
+        <w:t>“</w:t>
+      </w:r>
+      <w:r>
+        <w:rPr>
+          <w:rFonts w:ascii="Trebuchet MS" w:hAnsi="Trebuchet MS" w:cs="Trebuchet MS"/>
+          <w:i/>
+          <w:iCs/>
+        </w:rPr>
+        <w:t>Using Leaflet, add an OpenStreetMap map to Task 4, so that the results are displayed as markers on the map. When a user clicks a marker, the accommodation name and description should appear as a popup.</w:t>
+      </w:r>
+    </w:p>
+    <w:p>
+      <w:pPr>
+        <w:rPr>
+          <w:rFonts w:ascii="Trebuchet MS" w:hAnsi="Trebuchet MS" w:cs="Trebuchet MS"/>
+          <w:i/>
+          <w:iCs/>
+          <w:u w:val="single"/>
+        </w:rPr>
+      </w:pPr>
+      <w:r>
+        <w:rPr>
+          <w:rFonts w:ascii="Trebuchet MS" w:hAnsi="Trebuchet MS" w:cs="Trebuchet MS"/>
+          <w:i/>
+          <w:iCs/>
+          <w:u w:val="single"/>
+        </w:rPr>
+        <w:t xml:space="preserve">You must use Leaflet and OpenStreetMap. </w:t>
+      </w:r>
+      <w:proofErr w:type="gramStart"/>
+      <w:r>
+        <w:rPr>
+          <w:rFonts w:ascii="Trebuchet MS" w:hAnsi="Trebuchet MS" w:cs="Trebuchet MS"/>
+          <w:i/>
+          <w:iCs/>
+          <w:u w:val="single"/>
+        </w:rPr>
+        <w:t>In particular, Google</w:t>
+      </w:r>
+      <w:proofErr w:type="gramEnd"/>
+      <w:r>
+        <w:rPr>
+          <w:rFonts w:ascii="Trebuchet MS" w:hAnsi="Trebuchet MS" w:cs="Trebuchet MS"/>
+          <w:i/>
+          <w:iCs/>
+          <w:u w:val="single"/>
+        </w:rPr>
+        <w:t xml:space="preserve"> Maps is NOT acceptable.</w:t>
+      </w:r>
+      <w:r>
+        <w:rPr>
+          <w:rFonts w:ascii="Trebuchet MS" w:hAnsi="Trebuchet MS" w:cs="Trebuchet MS"/>
+          <w:i/>
+          <w:iCs/>
+          <w:u w:val="single"/>
+        </w:rPr>
+        <w:t>”</w:t>
+      </w:r>
+    </w:p>
+    <w:p>
+      <w:pPr>
+        <w:rPr>
+          <w:rFonts w:ascii="Trebuchet MS" w:hAnsi="Trebuchet MS" w:cs="Trebuchet MS"/>
+          <w:i/>
+          <w:iCs/>
+          <w:u w:val="single"/>
+        </w:rPr>
+      </w:pPr>
+    </w:p>
+    <w:p>
+      <w:pPr>
         <w:ind w:left="720"/>
         <w:rPr>
-          <w:rFonts w:ascii="Trebuchet MS" w:eastAsia="Trebuchet MS" w:hAnsi="Trebuchet MS" w:cs="Trebuchet MS"/>
-        </w:rPr>
-      </w:pPr>
+          <w:rFonts w:ascii="Trebuchet MS" w:hAnsi="Trebuchet MS" w:cs="Trebuchet MS"/>
+        </w:rPr>
+      </w:pPr>
+      <w:r>
+        <w:rPr>
+          <w:noProof/>
+        </w:rPr>
+        <w:drawing>
+          <wp:anchor distT="0" distB="0" distL="114300" distR="114300" simplePos="0" relativeHeight="251666432" behindDoc="0" locked="0" layoutInCell="1" allowOverlap="1" wp14:anchorId="520D8CE5" wp14:editId="40546271">
+            <wp:simplePos x="0" y="0"/>
+            <wp:positionH relativeFrom="column">
+              <wp:posOffset>857885</wp:posOffset>
+            </wp:positionH>
+            <wp:positionV relativeFrom="paragraph">
+              <wp:posOffset>1432560</wp:posOffset>
+            </wp:positionV>
+            <wp:extent cx="5189855" cy="5690870"/>
+            <wp:effectExtent l="0" t="0" r="0" b="5080"/>
+            <wp:wrapTopAndBottom/>
+            <wp:docPr id="1965031455" name="Picture 1"/>
+            <wp:cNvGraphicFramePr>
+              <a:graphicFrameLocks xmlns:a="http://schemas.openxmlformats.org/drawingml/2006/main" noChangeAspect="1"/>
+            </wp:cNvGraphicFramePr>
+            <a:graphic xmlns:a="http://schemas.openxmlformats.org/drawingml/2006/main">
+              <a:graphicData uri="http://schemas.openxmlformats.org/drawingml/2006/picture">
+                <pic:pic xmlns:pic="http://schemas.openxmlformats.org/drawingml/2006/picture">
+                  <pic:nvPicPr>
+                    <pic:cNvPr id="1965031455" name=""/>
+                    <pic:cNvPicPr/>
+                  </pic:nvPicPr>
+                  <pic:blipFill>
+                    <a:blip r:embed="rId13">
+                      <a:extLst>
+                        <a:ext uri="{28A0092B-C50C-407E-A947-70E740481C1C}">
+                          <a14:useLocalDpi xmlns:a14="http://schemas.microsoft.com/office/drawing/2010/main" val="0"/>
+                        </a:ext>
+                      </a:extLst>
+                    </a:blip>
+                    <a:stretch>
+                      <a:fillRect/>
+                    </a:stretch>
+                  </pic:blipFill>
+                  <pic:spPr>
+                    <a:xfrm>
+                      <a:off x="0" y="0"/>
+                      <a:ext cx="5189855" cy="5690870"/>
+                    </a:xfrm>
+                    <a:prstGeom prst="rect">
+                      <a:avLst/>
+                    </a:prstGeom>
+                  </pic:spPr>
+                </pic:pic>
+              </a:graphicData>
+            </a:graphic>
+            <wp14:sizeRelH relativeFrom="margin">
+              <wp14:pctWidth>0</wp14:pctWidth>
+            </wp14:sizeRelH>
+            <wp14:sizeRelV relativeFrom="margin">
+              <wp14:pctHeight>0</wp14:pctHeight>
+            </wp14:sizeRelV>
+          </wp:anchor>
+        </w:drawing>
+      </w:r>
+      <w:r>
+        <w:rPr>
+          <w:rFonts w:ascii="Trebuchet MS" w:hAnsi="Trebuchet MS" w:cs="Trebuchet MS"/>
+        </w:rPr>
+        <w:t xml:space="preserve">Since I am using </w:t>
+      </w:r>
+      <w:r>
+        <w:rPr>
+          <w:rFonts w:ascii="Trebuchet MS" w:hAnsi="Trebuchet MS" w:cs="Trebuchet MS"/>
+        </w:rPr>
+        <w:t>react,</w:t>
+      </w:r>
+      <w:r>
+        <w:rPr>
+          <w:rFonts w:ascii="Trebuchet MS" w:hAnsi="Trebuchet MS" w:cs="Trebuchet MS"/>
+        </w:rPr>
+        <w:t xml:space="preserve"> I will need to set up a separate component for the map to use Leaflet directly inside React using </w:t>
+      </w:r>
+      <w:proofErr w:type="spellStart"/>
+      <w:r>
+        <w:rPr>
+          <w:rFonts w:ascii="Trebuchet MS" w:hAnsi="Trebuchet MS" w:cs="Trebuchet MS"/>
+        </w:rPr>
+        <w:t>useref</w:t>
+      </w:r>
+      <w:proofErr w:type="spellEnd"/>
+      <w:r>
+        <w:rPr>
+          <w:rFonts w:ascii="Trebuchet MS" w:hAnsi="Trebuchet MS" w:cs="Trebuchet MS"/>
+        </w:rPr>
+        <w:t xml:space="preserve">, which will reference the map div, and </w:t>
+      </w:r>
+      <w:proofErr w:type="spellStart"/>
+      <w:r>
+        <w:rPr>
+          <w:rFonts w:ascii="Trebuchet MS" w:hAnsi="Trebuchet MS" w:cs="Trebuchet MS"/>
+        </w:rPr>
+        <w:t>useEffect</w:t>
+      </w:r>
+      <w:proofErr w:type="spellEnd"/>
+      <w:r>
+        <w:rPr>
+          <w:rFonts w:ascii="Trebuchet MS" w:hAnsi="Trebuchet MS" w:cs="Trebuchet MS"/>
+        </w:rPr>
+        <w:t xml:space="preserve">, which will </w:t>
+      </w:r>
+      <w:proofErr w:type="spellStart"/>
+      <w:r>
+        <w:rPr>
+          <w:rFonts w:ascii="Trebuchet MS" w:hAnsi="Trebuchet MS" w:cs="Trebuchet MS"/>
+        </w:rPr>
+        <w:t>initiali</w:t>
+      </w:r>
+      <w:r>
+        <w:rPr>
+          <w:rFonts w:ascii="Trebuchet MS" w:hAnsi="Trebuchet MS" w:cs="Trebuchet MS"/>
+        </w:rPr>
+        <w:t>s</w:t>
+      </w:r>
+      <w:r>
+        <w:rPr>
+          <w:rFonts w:ascii="Trebuchet MS" w:hAnsi="Trebuchet MS" w:cs="Trebuchet MS"/>
+        </w:rPr>
+        <w:t>e</w:t>
+      </w:r>
+      <w:proofErr w:type="spellEnd"/>
+      <w:r>
+        <w:rPr>
+          <w:rFonts w:ascii="Trebuchet MS" w:hAnsi="Trebuchet MS" w:cs="Trebuchet MS"/>
+        </w:rPr>
+        <w:t xml:space="preserve"> the map and markers.</w:t>
+      </w:r>
+      <w:r>
+        <w:rPr>
+          <w:rFonts w:ascii="Trebuchet MS" w:hAnsi="Trebuchet MS" w:cs="Trebuchet MS"/>
+        </w:rPr>
+        <w:t xml:space="preserve"> For each Accommodation inside an Accommodation list given in the parameter of the component, a marker will be added for each Accommodation, being given their own popup including their name and description when the marker is clicked. I will also, for ease of visuals, make it so the map initially shows all the current markers on the map. This will allow me to quickly test visual if all accommodations have been correctly added to the map.</w:t>
+      </w:r>
+    </w:p>
+    <w:p>
+      <w:pPr>
+        <w:ind w:left="720"/>
+      </w:pPr>
+    </w:p>
+    <w:p>
+      <w:pPr>
+        <w:spacing w:after="240"/>
+        <w:rPr>
+          <w:rFonts w:ascii="Trebuchet MS" w:eastAsia="Trebuchet MS" w:hAnsi="Trebuchet MS" w:cs="Trebuchet MS"/>
+        </w:rPr>
+      </w:pPr>
+      <w:r>
+        <w:rPr>
+          <w:rFonts w:ascii="Trebuchet MS" w:eastAsia="Trebuchet MS" w:hAnsi="Trebuchet MS" w:cs="Trebuchet MS"/>
+        </w:rPr>
+        <w:tab/>
+      </w:r>
     </w:p>
     <w:p/>
     <w:sectPr>

</xml_diff>

<commit_message>
Added map component to App.tsx
</commit_message>
<xml_diff>
--- a/WAD_Report.docx
+++ b/WAD_Report.docx
@@ -1970,26 +1970,28 @@
           <w:i/>
           <w:iCs/>
         </w:rPr>
-        <w:t>“</w:t>
-      </w:r>
-      <w:r>
+        <w:t>“Using Leaflet, add an OpenStreetMap map to Task 4, so that the results are displayed as markers on the map. When a user clicks a marker, the accommodation name and description should appear as a popup.</w:t>
+      </w:r>
+    </w:p>
+    <w:p>
+      <w:pPr>
         <w:rPr>
           <w:rFonts w:ascii="Trebuchet MS" w:hAnsi="Trebuchet MS" w:cs="Trebuchet MS"/>
           <w:i/>
           <w:iCs/>
-        </w:rPr>
-        <w:t>Using Leaflet, add an OpenStreetMap map to Task 4, so that the results are displayed as markers on the map. When a user clicks a marker, the accommodation name and description should appear as a popup.</w:t>
-      </w:r>
-    </w:p>
-    <w:p>
-      <w:pPr>
+          <w:u w:val="single"/>
+        </w:rPr>
+      </w:pPr>
+      <w:r>
         <w:rPr>
           <w:rFonts w:ascii="Trebuchet MS" w:hAnsi="Trebuchet MS" w:cs="Trebuchet MS"/>
           <w:i/>
           <w:iCs/>
           <w:u w:val="single"/>
         </w:rPr>
-      </w:pPr>
+        <w:t xml:space="preserve">You must use Leaflet and OpenStreetMap. </w:t>
+      </w:r>
+      <w:proofErr w:type="gramStart"/>
       <w:r>
         <w:rPr>
           <w:rFonts w:ascii="Trebuchet MS" w:hAnsi="Trebuchet MS" w:cs="Trebuchet MS"/>
@@ -1997,9 +1999,9 @@
           <w:iCs/>
           <w:u w:val="single"/>
         </w:rPr>
-        <w:t xml:space="preserve">You must use Leaflet and OpenStreetMap. </w:t>
-      </w:r>
-      <w:proofErr w:type="gramStart"/>
+        <w:t>In particular, Google</w:t>
+      </w:r>
+      <w:proofErr w:type="gramEnd"/>
       <w:r>
         <w:rPr>
           <w:rFonts w:ascii="Trebuchet MS" w:hAnsi="Trebuchet MS" w:cs="Trebuchet MS"/>
@@ -2007,43 +2009,24 @@
           <w:iCs/>
           <w:u w:val="single"/>
         </w:rPr>
-        <w:t>In particular, Google</w:t>
-      </w:r>
-      <w:proofErr w:type="gramEnd"/>
-      <w:r>
+        <w:t xml:space="preserve"> Maps is NOT acceptable.”</w:t>
+      </w:r>
+    </w:p>
+    <w:p>
+      <w:pPr>
         <w:rPr>
           <w:rFonts w:ascii="Trebuchet MS" w:hAnsi="Trebuchet MS" w:cs="Trebuchet MS"/>
           <w:i/>
           <w:iCs/>
           <w:u w:val="single"/>
         </w:rPr>
-        <w:t xml:space="preserve"> Maps is NOT acceptable.</w:t>
-      </w:r>
-      <w:r>
+      </w:pPr>
+    </w:p>
+    <w:p>
+      <w:pPr>
+        <w:ind w:left="720"/>
         <w:rPr>
           <w:rFonts w:ascii="Trebuchet MS" w:hAnsi="Trebuchet MS" w:cs="Trebuchet MS"/>
-          <w:i/>
-          <w:iCs/>
-          <w:u w:val="single"/>
-        </w:rPr>
-        <w:t>”</w:t>
-      </w:r>
-    </w:p>
-    <w:p>
-      <w:pPr>
-        <w:rPr>
-          <w:rFonts w:ascii="Trebuchet MS" w:hAnsi="Trebuchet MS" w:cs="Trebuchet MS"/>
-          <w:i/>
-          <w:iCs/>
-          <w:u w:val="single"/>
-        </w:rPr>
-      </w:pPr>
-    </w:p>
-    <w:p>
-      <w:pPr>
-        <w:ind w:left="720"/>
-        <w:rPr>
-          <w:rFonts w:ascii="Trebuchet MS" w:hAnsi="Trebuchet MS" w:cs="Trebuchet MS"/>
         </w:rPr>
       </w:pPr>
       <w:r>
@@ -2051,13 +2034,13 @@
           <w:noProof/>
         </w:rPr>
         <w:drawing>
-          <wp:anchor distT="0" distB="0" distL="114300" distR="114300" simplePos="0" relativeHeight="251666432" behindDoc="0" locked="0" layoutInCell="1" allowOverlap="1" wp14:anchorId="520D8CE5" wp14:editId="40546271">
+          <wp:anchor distT="0" distB="0" distL="114300" distR="114300" simplePos="0" relativeHeight="251666432" behindDoc="0" locked="0" layoutInCell="1" allowOverlap="1" wp14:anchorId="520D8CE5" wp14:editId="5C145F47">
             <wp:simplePos x="0" y="0"/>
             <wp:positionH relativeFrom="column">
-              <wp:posOffset>857885</wp:posOffset>
+              <wp:posOffset>838835</wp:posOffset>
             </wp:positionH>
             <wp:positionV relativeFrom="paragraph">
-              <wp:posOffset>1432560</wp:posOffset>
+              <wp:posOffset>1556385</wp:posOffset>
             </wp:positionV>
             <wp:extent cx="5189855" cy="5690870"/>
             <wp:effectExtent l="0" t="0" r="0" b="5080"/>
@@ -2182,7 +2165,77 @@
         <w:rPr>
           <w:rFonts w:ascii="Trebuchet MS" w:hAnsi="Trebuchet MS" w:cs="Trebuchet MS"/>
         </w:rPr>
-        <w:t xml:space="preserve"> For each Accommodation inside an Accommodation list given in the parameter of the component, a marker will be added for each Accommodation, being given their own popup including their name and description when the marker is clicked. I will also, for ease of visuals, make it so the map initially shows all the current markers on the map. This will allow me to quickly test visual if all accommodations have been correctly added to the map.</w:t>
+        <w:t xml:space="preserve"> For each Accommodation inside an Accommodation list given in the parameter of the component, a marker will be added for each Accommodation, being given their own popup including their name and description when the marker is clicked. I will also, for ease of visuals, make it so the map initially shows all the current markers on the map. </w:t>
+      </w:r>
+      <w:proofErr w:type="gramStart"/>
+      <w:r>
+        <w:rPr>
+          <w:rFonts w:ascii="Trebuchet MS" w:hAnsi="Trebuchet MS" w:cs="Trebuchet MS"/>
+        </w:rPr>
+        <w:t>Of course</w:t>
+      </w:r>
+      <w:proofErr w:type="gramEnd"/>
+      <w:r>
+        <w:rPr>
+          <w:rFonts w:ascii="Trebuchet MS" w:hAnsi="Trebuchet MS" w:cs="Trebuchet MS"/>
+        </w:rPr>
+        <w:t xml:space="preserve"> this is difficult with the </w:t>
+      </w:r>
+      <w:proofErr w:type="gramStart"/>
+      <w:r>
+        <w:rPr>
+          <w:rFonts w:ascii="Trebuchet MS" w:hAnsi="Trebuchet MS" w:cs="Trebuchet MS"/>
+        </w:rPr>
+        <w:t>given database</w:t>
+      </w:r>
+      <w:proofErr w:type="gramEnd"/>
+      <w:r>
+        <w:rPr>
+          <w:rFonts w:ascii="Trebuchet MS" w:hAnsi="Trebuchet MS" w:cs="Trebuchet MS"/>
+        </w:rPr>
+        <w:t xml:space="preserve"> as the </w:t>
+      </w:r>
+      <w:proofErr w:type="gramStart"/>
+      <w:r>
+        <w:rPr>
+          <w:rFonts w:ascii="Trebuchet MS" w:hAnsi="Trebuchet MS" w:cs="Trebuchet MS"/>
+        </w:rPr>
+        <w:t>accommodations are</w:t>
+      </w:r>
+      <w:proofErr w:type="gramEnd"/>
+      <w:r>
+        <w:rPr>
+          <w:rFonts w:ascii="Trebuchet MS" w:hAnsi="Trebuchet MS" w:cs="Trebuchet MS"/>
+        </w:rPr>
+        <w:t xml:space="preserve"> in many different </w:t>
+      </w:r>
+      <w:proofErr w:type="gramStart"/>
+      <w:r>
+        <w:rPr>
+          <w:rFonts w:ascii="Trebuchet MS" w:hAnsi="Trebuchet MS" w:cs="Trebuchet MS"/>
+        </w:rPr>
+        <w:t>places</w:t>
+      </w:r>
+      <w:proofErr w:type="gramEnd"/>
+      <w:r>
+        <w:rPr>
+          <w:rFonts w:ascii="Trebuchet MS" w:hAnsi="Trebuchet MS" w:cs="Trebuchet MS"/>
+        </w:rPr>
+        <w:t xml:space="preserve"> but this can prove very useful if the database is ever refined or is changed to contain </w:t>
+      </w:r>
+      <w:proofErr w:type="gramStart"/>
+      <w:r>
+        <w:rPr>
+          <w:rFonts w:ascii="Trebuchet MS" w:hAnsi="Trebuchet MS" w:cs="Trebuchet MS"/>
+        </w:rPr>
+        <w:t>more close</w:t>
+      </w:r>
+      <w:proofErr w:type="gramEnd"/>
+      <w:r>
+        <w:rPr>
+          <w:rFonts w:ascii="Trebuchet MS" w:hAnsi="Trebuchet MS" w:cs="Trebuchet MS"/>
+        </w:rPr>
+        <w:t xml:space="preserve"> together accommodations.</w:t>
       </w:r>
     </w:p>
     <w:p>
@@ -2204,7 +2257,100 @@
         <w:tab/>
       </w:r>
     </w:p>
+    <w:p>
+      <w:r>
+        <w:rPr>
+          <w:noProof/>
+        </w:rPr>
+        <w:lastRenderedPageBreak/>
+        <w:drawing>
+          <wp:anchor distT="0" distB="0" distL="114300" distR="114300" simplePos="0" relativeHeight="251667456" behindDoc="0" locked="0" layoutInCell="1" allowOverlap="1" wp14:anchorId="75098BDD" wp14:editId="625E4BDC">
+            <wp:simplePos x="0" y="0"/>
+            <wp:positionH relativeFrom="margin">
+              <wp:align>center</wp:align>
+            </wp:positionH>
+            <wp:positionV relativeFrom="paragraph">
+              <wp:posOffset>314325</wp:posOffset>
+            </wp:positionV>
+            <wp:extent cx="2987040" cy="3733800"/>
+            <wp:effectExtent l="0" t="0" r="3810" b="0"/>
+            <wp:wrapTopAndBottom/>
+            <wp:docPr id="2093924742" name="Picture 1"/>
+            <wp:cNvGraphicFramePr>
+              <a:graphicFrameLocks xmlns:a="http://schemas.openxmlformats.org/drawingml/2006/main" noChangeAspect="1"/>
+            </wp:cNvGraphicFramePr>
+            <a:graphic xmlns:a="http://schemas.openxmlformats.org/drawingml/2006/main">
+              <a:graphicData uri="http://schemas.openxmlformats.org/drawingml/2006/picture">
+                <pic:pic xmlns:pic="http://schemas.openxmlformats.org/drawingml/2006/picture">
+                  <pic:nvPicPr>
+                    <pic:cNvPr id="2093924742" name=""/>
+                    <pic:cNvPicPr/>
+                  </pic:nvPicPr>
+                  <pic:blipFill>
+                    <a:blip r:embed="rId14">
+                      <a:extLst>
+                        <a:ext uri="{28A0092B-C50C-407E-A947-70E740481C1C}">
+                          <a14:useLocalDpi xmlns:a14="http://schemas.microsoft.com/office/drawing/2010/main" val="0"/>
+                        </a:ext>
+                      </a:extLst>
+                    </a:blip>
+                    <a:stretch>
+                      <a:fillRect/>
+                    </a:stretch>
+                  </pic:blipFill>
+                  <pic:spPr>
+                    <a:xfrm>
+                      <a:off x="0" y="0"/>
+                      <a:ext cx="2987040" cy="3733800"/>
+                    </a:xfrm>
+                    <a:prstGeom prst="rect">
+                      <a:avLst/>
+                    </a:prstGeom>
+                  </pic:spPr>
+                </pic:pic>
+              </a:graphicData>
+            </a:graphic>
+            <wp14:sizeRelH relativeFrom="margin">
+              <wp14:pctWidth>0</wp14:pctWidth>
+            </wp14:sizeRelH>
+            <wp14:sizeRelV relativeFrom="margin">
+              <wp14:pctHeight>0</wp14:pctHeight>
+            </wp14:sizeRelV>
+          </wp:anchor>
+        </w:drawing>
+      </w:r>
+      <w:r>
+        <w:tab/>
+        <w:t xml:space="preserve">To </w:t>
+      </w:r>
+      <w:proofErr w:type="spellStart"/>
+      <w:r>
+        <w:t>finalise</w:t>
+      </w:r>
+      <w:proofErr w:type="spellEnd"/>
+      <w:r>
+        <w:t xml:space="preserve"> this </w:t>
+      </w:r>
+      <w:proofErr w:type="gramStart"/>
+      <w:r>
+        <w:t>task</w:t>
+      </w:r>
+      <w:proofErr w:type="gramEnd"/>
+      <w:r>
+        <w:t xml:space="preserve"> I then simply need to add the component to the </w:t>
+      </w:r>
+      <w:proofErr w:type="spellStart"/>
+      <w:r>
+        <w:t>App.tsx</w:t>
+      </w:r>
+      <w:proofErr w:type="spellEnd"/>
+    </w:p>
     <w:p/>
+    <w:p>
+      <w:r>
+        <w:tab/>
+      </w:r>
+    </w:p>
     <w:sectPr>
       <w:pgSz w:w="12240" w:h="15840"/>
       <w:pgMar w:top="720" w:right="720" w:bottom="720" w:left="720" w:header="720" w:footer="720" w:gutter="0"/>

</xml_diff>

<commit_message>
Added session declaration file and updated tsconfig
</commit_message>
<xml_diff>
--- a/WAD_Report.docx
+++ b/WAD_Report.docx
@@ -415,82 +415,23 @@
         <w:rPr>
           <w:rFonts w:ascii="Trebuchet MS" w:eastAsia="Trebuchet MS" w:hAnsi="Trebuchet MS" w:cs="Trebuchet MS"/>
         </w:rPr>
-        <w:t>For this first task, I will create a simple GET endpoint at /accommodation/location</w:t>
+        <w:t xml:space="preserve">For this first task, I will create a simple GET endpoint at /accommodation/location/:location. The location will be taken as a URL parameter and passed into a prepared statement querying the accommodation table of the given database. This should then return the full result set as JSON, and because it's a GET </w:t>
       </w:r>
       <w:proofErr w:type="gramStart"/>
       <w:r>
         <w:rPr>
           <w:rFonts w:ascii="Trebuchet MS" w:eastAsia="Trebuchet MS" w:hAnsi="Trebuchet MS" w:cs="Trebuchet MS"/>
         </w:rPr>
-        <w:t>/:location</w:t>
+        <w:t>request</w:t>
       </w:r>
       <w:proofErr w:type="gramEnd"/>
       <w:r>
         <w:rPr>
           <w:rFonts w:ascii="Trebuchet MS" w:eastAsia="Trebuchet MS" w:hAnsi="Trebuchet MS" w:cs="Trebuchet MS"/>
         </w:rPr>
-        <w:t xml:space="preserve">. The location will be taken as a URL parameter and passed into a prepared statement querying the accommodation table of the given database. This should then return the full result set as JSON, and because it's a GET </w:t>
-      </w:r>
-      <w:proofErr w:type="gramStart"/>
-      <w:r>
-        <w:rPr>
-          <w:rFonts w:ascii="Trebuchet MS" w:eastAsia="Trebuchet MS" w:hAnsi="Trebuchet MS" w:cs="Trebuchet MS"/>
-        </w:rPr>
-        <w:t>request</w:t>
-      </w:r>
-      <w:proofErr w:type="gramEnd"/>
-      <w:r>
-        <w:rPr>
-          <w:rFonts w:ascii="Trebuchet MS" w:eastAsia="Trebuchet MS" w:hAnsi="Trebuchet MS" w:cs="Trebuchet MS"/>
-        </w:rPr>
-        <w:t xml:space="preserve"> I can then test it directly </w:t>
-      </w:r>
-      <w:proofErr w:type="gramStart"/>
-      <w:r>
-        <w:rPr>
-          <w:rFonts w:ascii="Trebuchet MS" w:eastAsia="Trebuchet MS" w:hAnsi="Trebuchet MS" w:cs="Trebuchet MS"/>
-        </w:rPr>
-        <w:t>in</w:t>
-      </w:r>
-      <w:proofErr w:type="gramEnd"/>
-      <w:r>
-        <w:rPr>
-          <w:rFonts w:ascii="Trebuchet MS" w:eastAsia="Trebuchet MS" w:hAnsi="Trebuchet MS" w:cs="Trebuchet MS"/>
-        </w:rPr>
-        <w:t xml:space="preserve"> the browser. I will finally contain this in a </w:t>
-      </w:r>
-      <w:proofErr w:type="gramStart"/>
-      <w:r>
-        <w:rPr>
-          <w:rFonts w:ascii="Trebuchet MS" w:eastAsia="Trebuchet MS" w:hAnsi="Trebuchet MS" w:cs="Trebuchet MS"/>
-        </w:rPr>
-        <w:t>try{</w:t>
-      </w:r>
-      <w:proofErr w:type="gramEnd"/>
-      <w:r>
-        <w:rPr>
-          <w:rFonts w:ascii="Trebuchet MS" w:eastAsia="Trebuchet MS" w:hAnsi="Trebuchet MS" w:cs="Trebuchet MS"/>
-        </w:rPr>
-        <w:t xml:space="preserve">} and </w:t>
-      </w:r>
-      <w:proofErr w:type="gramStart"/>
-      <w:r>
-        <w:rPr>
-          <w:rFonts w:ascii="Trebuchet MS" w:eastAsia="Trebuchet MS" w:hAnsi="Trebuchet MS" w:cs="Trebuchet MS"/>
-        </w:rPr>
-        <w:t>catch{</w:t>
-      </w:r>
-      <w:proofErr w:type="gramEnd"/>
-      <w:r>
-        <w:rPr>
-          <w:rFonts w:ascii="Trebuchet MS" w:eastAsia="Trebuchet MS" w:hAnsi="Trebuchet MS" w:cs="Trebuchet MS"/>
-        </w:rPr>
-        <w:t>} statement so if the GET request results in an error, the error will be returned in place of the JSON from the database.</w:t>
-      </w:r>
-      <w:r>
-        <w:rPr>
-          <w:noProof/>
-        </w:rPr>
+        <w:t xml:space="preserve"> I can then test it directly in the browser. I will finally contain this in a try{} and catch{} statement so if the GET request results in an error, the error will be returned in place of the JSON from the database.</w:t>
+      </w:r>
+      <w:r>
         <w:drawing>
           <wp:anchor distT="114300" distB="114300" distL="114300" distR="114300" simplePos="0" relativeHeight="251658240" behindDoc="0" locked="0" layoutInCell="1" hidden="0" allowOverlap="1" wp14:anchorId="7F05CBF7" wp14:editId="1C6EAE8E">
             <wp:simplePos x="0" y="0"/>
@@ -598,35 +539,7 @@
         <w:rPr>
           <w:rFonts w:ascii="Trebuchet MS" w:eastAsia="Trebuchet MS" w:hAnsi="Trebuchet MS" w:cs="Trebuchet MS"/>
         </w:rPr>
-        <w:t>For Task 2, I will add a second GET endpoint at /accommodation/location</w:t>
-      </w:r>
-      <w:proofErr w:type="gramStart"/>
-      <w:r>
-        <w:rPr>
-          <w:rFonts w:ascii="Trebuchet MS" w:eastAsia="Trebuchet MS" w:hAnsi="Trebuchet MS" w:cs="Trebuchet MS"/>
-        </w:rPr>
-        <w:t>/:location</w:t>
-      </w:r>
-      <w:proofErr w:type="gramEnd"/>
-      <w:r>
-        <w:rPr>
-          <w:rFonts w:ascii="Trebuchet MS" w:eastAsia="Trebuchet MS" w:hAnsi="Trebuchet MS" w:cs="Trebuchet MS"/>
-        </w:rPr>
-        <w:t>/type</w:t>
-      </w:r>
-      <w:proofErr w:type="gramStart"/>
-      <w:r>
-        <w:rPr>
-          <w:rFonts w:ascii="Trebuchet MS" w:eastAsia="Trebuchet MS" w:hAnsi="Trebuchet MS" w:cs="Trebuchet MS"/>
-        </w:rPr>
-        <w:t>/:type</w:t>
-      </w:r>
-      <w:proofErr w:type="gramEnd"/>
-      <w:r>
-        <w:rPr>
-          <w:rFonts w:ascii="Trebuchet MS" w:eastAsia="Trebuchet MS" w:hAnsi="Trebuchet MS" w:cs="Trebuchet MS"/>
-        </w:rPr>
-        <w:t xml:space="preserve">. By using two URL parameters for the location and type, both parameters will then feed into a single prepared statement filtering using both the location and </w:t>
+        <w:t xml:space="preserve">For Task 2, I will add a second GET endpoint at /accommodation/location/:location/type/:type. By using two URL parameters for the location and type, both parameters will then feed into a single prepared statement filtering using both the location and </w:t>
       </w:r>
       <w:proofErr w:type="spellStart"/>
       <w:r>
@@ -643,9 +556,6 @@
         <w:t xml:space="preserve"> the previous GET endpoint, I will be able to easily test it in the browser and will be contained in a try{} and catch{} statement similarly to the previous task.</w:t>
       </w:r>
       <w:r>
-        <w:rPr>
-          <w:noProof/>
-        </w:rPr>
         <w:drawing>
           <wp:anchor distT="114300" distB="114300" distL="114300" distR="114300" simplePos="0" relativeHeight="251659264" behindDoc="0" locked="0" layoutInCell="1" hidden="0" allowOverlap="1" wp14:anchorId="5D2B3FBF" wp14:editId="5F396B23">
             <wp:simplePos x="0" y="0"/>
@@ -803,7 +713,6 @@
         <w:t xml:space="preserve">, inside a </w:t>
       </w:r>
       <w:proofErr w:type="spellStart"/>
-      <w:proofErr w:type="gramStart"/>
       <w:r>
         <w:rPr>
           <w:rFonts w:ascii="Trebuchet MS" w:eastAsia="Trebuchet MS" w:hAnsi="Trebuchet MS" w:cs="Trebuchet MS"/>
@@ -811,45 +720,13 @@
         <w:t>db.transaction</w:t>
       </w:r>
       <w:proofErr w:type="spellEnd"/>
-      <w:proofErr w:type="gramEnd"/>
-      <w:r>
-        <w:rPr>
-          <w:rFonts w:ascii="Trebuchet MS" w:eastAsia="Trebuchet MS" w:hAnsi="Trebuchet MS" w:cs="Trebuchet MS"/>
-        </w:rPr>
-        <w:t xml:space="preserve">(). This will make sure that both operations will either succeed or fail together, this would prevent one change happening without the other in the event of an error which would make the database inaccurate. I will then test the endpoint using the Thunder Client. Like the previous tasks I will also wrap this inside a </w:t>
-      </w:r>
-      <w:proofErr w:type="gramStart"/>
-      <w:r>
-        <w:rPr>
-          <w:rFonts w:ascii="Trebuchet MS" w:eastAsia="Trebuchet MS" w:hAnsi="Trebuchet MS" w:cs="Trebuchet MS"/>
-        </w:rPr>
-        <w:t>try{</w:t>
-      </w:r>
-      <w:proofErr w:type="gramEnd"/>
-      <w:r>
-        <w:rPr>
-          <w:rFonts w:ascii="Trebuchet MS" w:eastAsia="Trebuchet MS" w:hAnsi="Trebuchet MS" w:cs="Trebuchet MS"/>
-        </w:rPr>
-        <w:t xml:space="preserve">} and </w:t>
-      </w:r>
-      <w:proofErr w:type="gramStart"/>
-      <w:r>
-        <w:rPr>
-          <w:rFonts w:ascii="Trebuchet MS" w:eastAsia="Trebuchet MS" w:hAnsi="Trebuchet MS" w:cs="Trebuchet MS"/>
-        </w:rPr>
-        <w:t>catch{</w:t>
-      </w:r>
-      <w:proofErr w:type="gramEnd"/>
-      <w:r>
-        <w:rPr>
-          <w:rFonts w:ascii="Trebuchet MS" w:eastAsia="Trebuchet MS" w:hAnsi="Trebuchet MS" w:cs="Trebuchet MS"/>
-        </w:rPr>
-        <w:t>} statement.</w:t>
-      </w:r>
-      <w:r>
-        <w:rPr>
-          <w:noProof/>
-        </w:rPr>
+      <w:r>
+        <w:rPr>
+          <w:rFonts w:ascii="Trebuchet MS" w:eastAsia="Trebuchet MS" w:hAnsi="Trebuchet MS" w:cs="Trebuchet MS"/>
+        </w:rPr>
+        <w:t>(). This will make sure that both operations will either succeed or fail together, this would prevent one change happening without the other in the event of an error which would make the database inaccurate. I will then test the endpoint using the Thunder Client. Like the previous tasks I will also wrap this inside a try{} and catch{} statement.</w:t>
+      </w:r>
+      <w:r>
         <w:drawing>
           <wp:anchor distT="114300" distB="114300" distL="114300" distR="114300" simplePos="0" relativeHeight="251660288" behindDoc="0" locked="0" layoutInCell="1" hidden="0" allowOverlap="1" wp14:anchorId="38CFF502" wp14:editId="1CF718A8">
             <wp:simplePos x="0" y="0"/>
@@ -995,21 +872,7 @@
         <w:rPr>
           <w:rFonts w:ascii="Trebuchet MS" w:eastAsia="Trebuchet MS" w:hAnsi="Trebuchet MS" w:cs="Trebuchet MS"/>
         </w:rPr>
-        <w:t xml:space="preserve"> gain </w:t>
-      </w:r>
-      <w:proofErr w:type="gramStart"/>
-      <w:r>
-        <w:rPr>
-          <w:rFonts w:ascii="Trebuchet MS" w:eastAsia="Trebuchet MS" w:hAnsi="Trebuchet MS" w:cs="Trebuchet MS"/>
-        </w:rPr>
-        <w:t>the extra credits</w:t>
-      </w:r>
-      <w:proofErr w:type="gramEnd"/>
-      <w:r>
-        <w:rPr>
-          <w:rFonts w:ascii="Trebuchet MS" w:eastAsia="Trebuchet MS" w:hAnsi="Trebuchet MS" w:cs="Trebuchet MS"/>
-        </w:rPr>
-        <w:t>.</w:t>
+        <w:t xml:space="preserve"> gain the extra credits.</w:t>
       </w:r>
     </w:p>
     <w:p>
@@ -1112,9 +975,6 @@
         <w:t xml:space="preserve"> and then export it so both child components could share the same type, avoiding any unneeded duplication.</w:t>
       </w:r>
       <w:r>
-        <w:rPr>
-          <w:noProof/>
-        </w:rPr>
         <w:drawing>
           <wp:anchor distT="114300" distB="114300" distL="114300" distR="114300" simplePos="0" relativeHeight="251661312" behindDoc="0" locked="0" layoutInCell="1" hidden="0" allowOverlap="1" wp14:anchorId="4E79B115" wp14:editId="2D8B5A7B">
             <wp:simplePos x="0" y="0"/>
@@ -1325,9 +1185,6 @@
         </w:rPr>
       </w:pPr>
       <w:r>
-        <w:rPr>
-          <w:noProof/>
-        </w:rPr>
         <w:drawing>
           <wp:anchor distT="114300" distB="114300" distL="114300" distR="114300" simplePos="0" relativeHeight="251662336" behindDoc="0" locked="0" layoutInCell="1" hidden="0" allowOverlap="1" wp14:anchorId="561AF115" wp14:editId="06AE68B6">
             <wp:simplePos x="0" y="0"/>
@@ -1390,21 +1247,7 @@
         <w:rPr>
           <w:rFonts w:ascii="Trebuchet MS" w:eastAsia="Trebuchet MS" w:hAnsi="Trebuchet MS" w:cs="Trebuchet MS"/>
         </w:rPr>
-        <w:t xml:space="preserve"> I will create will manage its own location input state. When the user clicks Search, it will fire an async fetch to /accommodation/location</w:t>
-      </w:r>
-      <w:proofErr w:type="gramStart"/>
-      <w:r>
-        <w:rPr>
-          <w:rFonts w:ascii="Trebuchet MS" w:eastAsia="Trebuchet MS" w:hAnsi="Trebuchet MS" w:cs="Trebuchet MS"/>
-        </w:rPr>
-        <w:t>/:location</w:t>
-      </w:r>
-      <w:proofErr w:type="gramEnd"/>
-      <w:r>
-        <w:rPr>
-          <w:rFonts w:ascii="Trebuchet MS" w:eastAsia="Trebuchet MS" w:hAnsi="Trebuchet MS" w:cs="Trebuchet MS"/>
-        </w:rPr>
-        <w:t xml:space="preserve"> and pass the parsed JSON up to App via the </w:t>
+        <w:t xml:space="preserve"> I will create will manage its own location input state. When the user clicks Search, it will fire an async fetch to /accommodation/location/:location and pass the parsed JSON up to App via the </w:t>
       </w:r>
       <w:proofErr w:type="spellStart"/>
       <w:r>
@@ -1535,9 +1378,6 @@
         </w:rPr>
       </w:pPr>
       <w:r>
-        <w:rPr>
-          <w:noProof/>
-        </w:rPr>
         <w:drawing>
           <wp:anchor distT="114300" distB="114300" distL="114300" distR="114300" simplePos="0" relativeHeight="251663360" behindDoc="0" locked="0" layoutInCell="1" hidden="0" allowOverlap="1" wp14:anchorId="1D4A0FDD" wp14:editId="3F70267E">
             <wp:simplePos x="0" y="0"/>
@@ -1614,21 +1454,7 @@
         <w:rPr>
           <w:rFonts w:ascii="Trebuchet MS" w:eastAsia="Trebuchet MS" w:hAnsi="Trebuchet MS" w:cs="Trebuchet MS"/>
         </w:rPr>
-        <w:t xml:space="preserve"> set to the result's ID, with the people hard coded to 1, and </w:t>
-      </w:r>
-      <w:proofErr w:type="gramStart"/>
-      <w:r>
-        <w:rPr>
-          <w:rFonts w:ascii="Trebuchet MS" w:eastAsia="Trebuchet MS" w:hAnsi="Trebuchet MS" w:cs="Trebuchet MS"/>
-        </w:rPr>
-        <w:t>date</w:t>
-      </w:r>
-      <w:proofErr w:type="gramEnd"/>
-      <w:r>
-        <w:rPr>
-          <w:rFonts w:ascii="Trebuchet MS" w:eastAsia="Trebuchet MS" w:hAnsi="Trebuchet MS" w:cs="Trebuchet MS"/>
-        </w:rPr>
-        <w:t xml:space="preserve"> hard coded to a date present in the database such as 260601. The response will then be used to update the message shown to the user either a success confirmation or an error from the API.</w:t>
+        <w:t xml:space="preserve"> set to the result's ID, with the people hard coded to 1, and date hard coded to a date present in the database such as 260601. The response will then be used to update the message shown to the user either a success confirmation or an error from the API.</w:t>
       </w:r>
     </w:p>
     <w:p>
@@ -1689,31 +1515,7 @@
           <w:i/>
           <w:iCs/>
         </w:rPr>
-        <w:t xml:space="preserve">6. </w:t>
-      </w:r>
-      <w:r>
-        <w:rPr>
-          <w:rFonts w:ascii="Trebuchet MS" w:eastAsia="Trebuchet MS" w:hAnsi="Trebuchet MS" w:cs="Trebuchet MS"/>
-          <w:i/>
-          <w:iCs/>
-        </w:rPr>
-        <w:t>“</w:t>
-      </w:r>
-      <w:r>
-        <w:rPr>
-          <w:rFonts w:ascii="Trebuchet MS" w:eastAsia="Trebuchet MS" w:hAnsi="Trebuchet MS" w:cs="Trebuchet MS"/>
-          <w:i/>
-          <w:iCs/>
-        </w:rPr>
-        <w:t>Add error-checking to task 3, so that if any of the details (ID, number of people, date) are blank, an appropriate HTTP error code is sent back to the client. Then, modify task 5 to test for the HTTP code returned from the server and display an appropriate user-friendly message to the user, which will be understood by a non-technical user.</w:t>
-      </w:r>
-      <w:r>
-        <w:rPr>
-          <w:rFonts w:ascii="Trebuchet MS" w:eastAsia="Trebuchet MS" w:hAnsi="Trebuchet MS" w:cs="Trebuchet MS"/>
-          <w:i/>
-          <w:iCs/>
-        </w:rPr>
-        <w:t>”</w:t>
+        <w:t>6. “Add error-checking to task 3, so that if any of the details (ID, number of people, date) are blank, an appropriate HTTP error code is sent back to the client. Then, modify task 5 to test for the HTTP code returned from the server and display an appropriate user-friendly message to the user, which will be understood by a non-technical user.”</w:t>
       </w:r>
     </w:p>
     <w:p>
@@ -1725,9 +1527,6 @@
         </w:rPr>
       </w:pPr>
       <w:r>
-        <w:rPr>
-          <w:noProof/>
-        </w:rPr>
         <w:drawing>
           <wp:anchor distT="0" distB="0" distL="114300" distR="114300" simplePos="0" relativeHeight="251664384" behindDoc="0" locked="0" layoutInCell="1" allowOverlap="1" wp14:anchorId="3A3AD79F" wp14:editId="62B93B01">
             <wp:simplePos x="0" y="0"/>
@@ -1843,9 +1642,6 @@
         </w:rPr>
       </w:pPr>
       <w:r>
-        <w:rPr>
-          <w:noProof/>
-        </w:rPr>
         <w:drawing>
           <wp:anchor distT="0" distB="0" distL="114300" distR="114300" simplePos="0" relativeHeight="251665408" behindDoc="0" locked="0" layoutInCell="1" allowOverlap="1" wp14:anchorId="3D485B72" wp14:editId="04866FC5">
             <wp:simplePos x="0" y="0"/>
@@ -2030,9 +1826,6 @@
         </w:rPr>
       </w:pPr>
       <w:r>
-        <w:rPr>
-          <w:noProof/>
-        </w:rPr>
         <w:drawing>
           <wp:anchor distT="0" distB="0" distL="114300" distR="114300" simplePos="0" relativeHeight="251666432" behindDoc="0" locked="0" layoutInCell="1" allowOverlap="1" wp14:anchorId="520D8CE5" wp14:editId="5C145F47">
             <wp:simplePos x="0" y="0"/>
@@ -2135,7 +1928,6 @@
         </w:rPr>
         <w:t xml:space="preserve">, which will </w:t>
       </w:r>
-      <w:proofErr w:type="spellStart"/>
       <w:r>
         <w:rPr>
           <w:rFonts w:ascii="Trebuchet MS" w:hAnsi="Trebuchet MS" w:cs="Trebuchet MS"/>
@@ -2154,7 +1946,6 @@
         </w:rPr>
         <w:t>e</w:t>
       </w:r>
-      <w:proofErr w:type="spellEnd"/>
       <w:r>
         <w:rPr>
           <w:rFonts w:ascii="Trebuchet MS" w:hAnsi="Trebuchet MS" w:cs="Trebuchet MS"/>
@@ -2165,82 +1956,44 @@
         <w:rPr>
           <w:rFonts w:ascii="Trebuchet MS" w:hAnsi="Trebuchet MS" w:cs="Trebuchet MS"/>
         </w:rPr>
-        <w:t xml:space="preserve"> For each Accommodation inside an Accommodation list given in the parameter of the component, a marker will be added for each Accommodation, being given their own popup including their name and description when the marker is clicked. I will also, for ease of visuals, make it so the map initially shows all the current markers on the map. </w:t>
-      </w:r>
-      <w:proofErr w:type="gramStart"/>
-      <w:r>
-        <w:rPr>
-          <w:rFonts w:ascii="Trebuchet MS" w:hAnsi="Trebuchet MS" w:cs="Trebuchet MS"/>
-        </w:rPr>
-        <w:t>Of course</w:t>
-      </w:r>
-      <w:proofErr w:type="gramEnd"/>
-      <w:r>
-        <w:rPr>
-          <w:rFonts w:ascii="Trebuchet MS" w:hAnsi="Trebuchet MS" w:cs="Trebuchet MS"/>
-        </w:rPr>
-        <w:t xml:space="preserve"> this is difficult with the </w:t>
-      </w:r>
-      <w:proofErr w:type="gramStart"/>
-      <w:r>
-        <w:rPr>
-          <w:rFonts w:ascii="Trebuchet MS" w:hAnsi="Trebuchet MS" w:cs="Trebuchet MS"/>
-        </w:rPr>
-        <w:t>given database</w:t>
-      </w:r>
-      <w:proofErr w:type="gramEnd"/>
-      <w:r>
-        <w:rPr>
-          <w:rFonts w:ascii="Trebuchet MS" w:hAnsi="Trebuchet MS" w:cs="Trebuchet MS"/>
-        </w:rPr>
-        <w:t xml:space="preserve"> as the </w:t>
-      </w:r>
-      <w:proofErr w:type="gramStart"/>
-      <w:r>
-        <w:rPr>
-          <w:rFonts w:ascii="Trebuchet MS" w:hAnsi="Trebuchet MS" w:cs="Trebuchet MS"/>
-        </w:rPr>
-        <w:t>accommodations are</w:t>
-      </w:r>
-      <w:proofErr w:type="gramEnd"/>
-      <w:r>
-        <w:rPr>
-          <w:rFonts w:ascii="Trebuchet MS" w:hAnsi="Trebuchet MS" w:cs="Trebuchet MS"/>
-        </w:rPr>
-        <w:t xml:space="preserve"> in many different </w:t>
-      </w:r>
-      <w:proofErr w:type="gramStart"/>
-      <w:r>
-        <w:rPr>
-          <w:rFonts w:ascii="Trebuchet MS" w:hAnsi="Trebuchet MS" w:cs="Trebuchet MS"/>
-        </w:rPr>
-        <w:t>places</w:t>
-      </w:r>
-      <w:proofErr w:type="gramEnd"/>
-      <w:r>
-        <w:rPr>
-          <w:rFonts w:ascii="Trebuchet MS" w:hAnsi="Trebuchet MS" w:cs="Trebuchet MS"/>
-        </w:rPr>
-        <w:t xml:space="preserve"> but this can prove very useful if the database is ever refined or is changed to contain </w:t>
-      </w:r>
-      <w:proofErr w:type="gramStart"/>
-      <w:r>
-        <w:rPr>
-          <w:rFonts w:ascii="Trebuchet MS" w:hAnsi="Trebuchet MS" w:cs="Trebuchet MS"/>
-        </w:rPr>
-        <w:t>more close</w:t>
-      </w:r>
-      <w:proofErr w:type="gramEnd"/>
-      <w:r>
-        <w:rPr>
-          <w:rFonts w:ascii="Trebuchet MS" w:hAnsi="Trebuchet MS" w:cs="Trebuchet MS"/>
-        </w:rPr>
-        <w:t xml:space="preserve"> together accommodations.</w:t>
+        <w:t xml:space="preserve"> For each Accommodation inside an Accommodation list given in the parameter of the component, a marker will be added for each Accommodation, being given their own popup including their name and description when the marker is clicked. I will also, for ease of visuals, make it so the map shows all the current markers on the map</w:t>
+      </w:r>
+      <w:r>
+        <w:rPr>
+          <w:rFonts w:ascii="Trebuchet MS" w:hAnsi="Trebuchet MS" w:cs="Trebuchet MS"/>
+        </w:rPr>
+        <w:t xml:space="preserve"> of the location which was searched</w:t>
+      </w:r>
+      <w:r>
+        <w:rPr>
+          <w:rFonts w:ascii="Trebuchet MS" w:hAnsi="Trebuchet MS" w:cs="Trebuchet MS"/>
+        </w:rPr>
+        <w:t>.</w:t>
+      </w:r>
+      <w:r>
+        <w:rPr>
+          <w:rFonts w:ascii="Trebuchet MS" w:hAnsi="Trebuchet MS" w:cs="Trebuchet MS"/>
+        </w:rPr>
+        <w:t xml:space="preserve"> This puts all relevant markers on display for the user to see and select.</w:t>
+      </w:r>
+      <w:r>
+        <w:rPr>
+          <w:rFonts w:ascii="Trebuchet MS" w:hAnsi="Trebuchet MS" w:cs="Trebuchet MS"/>
+        </w:rPr>
+        <w:t xml:space="preserve"> </w:t>
       </w:r>
     </w:p>
     <w:p>
       <w:pPr>
         <w:ind w:left="720"/>
+        <w:rPr>
+          <w:rFonts w:ascii="Trebuchet MS" w:hAnsi="Trebuchet MS" w:cs="Trebuchet MS"/>
+        </w:rPr>
+      </w:pPr>
+    </w:p>
+    <w:p>
+      <w:pPr>
+        <w:ind w:left="720"/>
       </w:pPr>
     </w:p>
     <w:p>
@@ -2259,12 +2012,9 @@
     </w:p>
     <w:p>
       <w:r>
-        <w:rPr>
-          <w:noProof/>
-        </w:rPr>
         <w:lastRenderedPageBreak/>
         <w:drawing>
-          <wp:anchor distT="0" distB="0" distL="114300" distR="114300" simplePos="0" relativeHeight="251667456" behindDoc="0" locked="0" layoutInCell="1" allowOverlap="1" wp14:anchorId="75098BDD" wp14:editId="625E4BDC">
+          <wp:anchor distT="0" distB="0" distL="114300" distR="114300" simplePos="0" relativeHeight="251667456" behindDoc="0" locked="0" layoutInCell="1" allowOverlap="1" wp14:anchorId="75098BDD" wp14:editId="66425B34">
             <wp:simplePos x="0" y="0"/>
             <wp:positionH relativeFrom="margin">
               <wp:align>center</wp:align>
@@ -2321,34 +2071,386 @@
       </w:r>
       <w:r>
         <w:tab/>
-        <w:t xml:space="preserve">To </w:t>
+        <w:t xml:space="preserve">To finalise this </w:t>
+      </w:r>
+      <w:r>
+        <w:t>task,</w:t>
+      </w:r>
+      <w:r>
+        <w:t xml:space="preserve"> I then simply need to add the component to the </w:t>
       </w:r>
       <w:proofErr w:type="spellStart"/>
       <w:r>
-        <w:t>finalise</w:t>
+        <w:t>App.tsx</w:t>
       </w:r>
       <w:proofErr w:type="spellEnd"/>
-      <w:r>
-        <w:t xml:space="preserve"> this </w:t>
+    </w:p>
+    <w:p>
+      <w:r>
+        <w:tab/>
+      </w:r>
+    </w:p>
+    <w:p>
+      <w:pPr>
+        <w:pStyle w:val="Heading1"/>
+        <w:spacing w:after="240"/>
+        <w:rPr>
+          <w:b/>
+          <w:bCs/>
+        </w:rPr>
+      </w:pPr>
+      <w:r>
+        <w:rPr>
+          <w:b/>
+          <w:bCs/>
+        </w:rPr>
+        <w:t>Part E – logins and sessions</w:t>
+      </w:r>
+    </w:p>
+    <w:p>
+      <w:pPr>
+        <w:rPr>
+          <w:i/>
+          <w:iCs/>
+        </w:rPr>
+      </w:pPr>
+      <w:r>
+        <w:rPr>
+          <w:rFonts w:ascii="Trebuchet MS" w:hAnsi="Trebuchet MS" w:cs="Trebuchet MS"/>
+        </w:rPr>
+        <w:t xml:space="preserve">8. </w:t>
+      </w:r>
+      <w:r>
+        <w:rPr>
+          <w:rFonts w:ascii="Trebuchet MS" w:hAnsi="Trebuchet MS" w:cs="Trebuchet MS"/>
+          <w:i/>
+          <w:iCs/>
+        </w:rPr>
+        <w:t>“</w:t>
+      </w:r>
+      <w:r>
+        <w:rPr>
+          <w:rFonts w:ascii="Trebuchet MS" w:hAnsi="Trebuchet MS" w:cs="Trebuchet MS"/>
+          <w:i/>
+          <w:iCs/>
+        </w:rPr>
+        <w:t>Implement a session-based login system. A user should be able to login from the main index page via a login form. If a user logs in successfully, a message should appear within a &lt;div&gt; on the index page, e.g.</w:t>
+      </w:r>
+    </w:p>
+    <w:p>
+      <w:pPr>
+        <w:rPr>
+          <w:rFonts w:ascii="Trebuchet MS" w:hAnsi="Trebuchet MS" w:cs="Trebuchet MS"/>
+          <w:i/>
+          <w:iCs/>
+        </w:rPr>
+      </w:pPr>
+    </w:p>
+    <w:p>
+      <w:pPr>
+        <w:rPr>
+          <w:i/>
+          <w:iCs/>
+        </w:rPr>
+      </w:pPr>
+      <w:r>
+        <w:rPr>
+          <w:rFonts w:ascii="DejaVu Sans Mono" w:hAnsi="DejaVu Sans Mono" w:cs="Trebuchet MS"/>
+          <w:i/>
+          <w:iCs/>
+        </w:rPr>
+        <w:t xml:space="preserve">Logged in as </w:t>
+      </w:r>
+      <w:proofErr w:type="spellStart"/>
+      <w:r>
+        <w:rPr>
+          <w:rFonts w:ascii="DejaVu Sans Mono" w:hAnsi="DejaVu Sans Mono" w:cs="Trebuchet MS"/>
+          <w:i/>
+          <w:iCs/>
+        </w:rPr>
+        <w:t>jsmith</w:t>
+      </w:r>
+      <w:proofErr w:type="spellEnd"/>
+    </w:p>
+    <w:p>
+      <w:pPr>
+        <w:rPr>
+          <w:rFonts w:ascii="Trebuchet MS" w:hAnsi="Trebuchet MS" w:cs="Trebuchet MS"/>
+          <w:i/>
+          <w:iCs/>
+        </w:rPr>
+      </w:pPr>
+    </w:p>
+    <w:p>
+      <w:pPr>
+        <w:rPr>
+          <w:i/>
+          <w:iCs/>
+        </w:rPr>
+      </w:pPr>
+      <w:r>
+        <w:rPr>
+          <w:rFonts w:ascii="Trebuchet MS" w:hAnsi="Trebuchet MS" w:cs="Trebuchet MS"/>
+          <w:i/>
+          <w:iCs/>
+        </w:rPr>
+        <w:t>If the user reloads the page, the login status needs to be maintained, with the “Logged in as” message appearing if the user is logged in, or the login form if not.</w:t>
+      </w:r>
+    </w:p>
+    <w:p>
+      <w:pPr>
+        <w:rPr>
+          <w:rFonts w:ascii="Trebuchet MS" w:hAnsi="Trebuchet MS" w:cs="Trebuchet MS"/>
+          <w:i/>
+          <w:iCs/>
+        </w:rPr>
+      </w:pPr>
+      <w:r>
+        <w:rPr>
+          <w:rFonts w:ascii="Trebuchet MS" w:hAnsi="Trebuchet MS" w:cs="Trebuchet MS"/>
+          <w:i/>
+          <w:iCs/>
+        </w:rPr>
+        <w:t>There is no need to implement a signup facility, as the provided database contains existing users.</w:t>
+      </w:r>
+      <w:r>
+        <w:rPr>
+          <w:rFonts w:ascii="Trebuchet MS" w:hAnsi="Trebuchet MS" w:cs="Trebuchet MS"/>
+          <w:i/>
+          <w:iCs/>
+        </w:rPr>
+        <w:t>”</w:t>
+      </w:r>
+    </w:p>
+    <w:p>
+      <w:pPr>
+        <w:rPr>
+          <w:rFonts w:ascii="Trebuchet MS" w:hAnsi="Trebuchet MS" w:cs="Trebuchet MS"/>
+          <w:i/>
+          <w:iCs/>
+        </w:rPr>
+      </w:pPr>
+      <w:r>
+        <w:rPr>
+          <w:rFonts w:ascii="Trebuchet MS" w:hAnsi="Trebuchet MS" w:cs="Trebuchet MS"/>
+          <w:i/>
+          <w:iCs/>
+        </w:rPr>
+        <w:tab/>
+      </w:r>
+    </w:p>
+    <w:p>
+      <w:pPr>
+        <w:rPr>
+          <w:rFonts w:ascii="Trebuchet MS" w:hAnsi="Trebuchet MS" w:cs="Trebuchet MS"/>
+        </w:rPr>
+      </w:pPr>
+      <w:r>
+        <w:rPr>
+          <w:rFonts w:ascii="Trebuchet MS" w:hAnsi="Trebuchet MS" w:cs="Trebuchet MS"/>
+          <w:i/>
+          <w:iCs/>
+        </w:rPr>
+        <w:tab/>
+      </w:r>
+    </w:p>
+    <w:p>
+      <w:pPr>
+        <w:ind w:left="720"/>
+        <w:rPr>
+          <w:rFonts w:ascii="Trebuchet MS" w:hAnsi="Trebuchet MS" w:cs="Trebuchet MS"/>
+        </w:rPr>
+      </w:pPr>
+      <w:r>
+        <w:rPr>
+          <w:rFonts w:ascii="Trebuchet MS" w:hAnsi="Trebuchet MS" w:cs="Trebuchet MS"/>
+        </w:rPr>
+        <w:t xml:space="preserve">For the session-based login system I will first need to set up a declaration file for </w:t>
+      </w:r>
+      <w:r>
+        <w:rPr>
+          <w:rFonts w:ascii="Trebuchet MS" w:hAnsi="Trebuchet MS" w:cs="Trebuchet MS"/>
+        </w:rPr>
+        <w:t>express-session-better-sqlite3</w:t>
+      </w:r>
+      <w:r>
+        <w:rPr>
+          <w:rFonts w:ascii="Trebuchet MS" w:hAnsi="Trebuchet MS" w:cs="Trebuchet MS"/>
+        </w:rPr>
+        <w:t xml:space="preserve"> as it does not have the corresponding @</w:t>
       </w:r>
       <w:proofErr w:type="gramStart"/>
       <w:r>
-        <w:t>task</w:t>
+        <w:rPr>
+          <w:rFonts w:ascii="Trebuchet MS" w:hAnsi="Trebuchet MS" w:cs="Trebuchet MS"/>
+        </w:rPr>
+        <w:t>types</w:t>
       </w:r>
       <w:proofErr w:type="gramEnd"/>
       <w:r>
-        <w:t xml:space="preserve"> I then simply need to add the component to the </w:t>
+        <w:rPr>
+          <w:rFonts w:ascii="Trebuchet MS" w:hAnsi="Trebuchet MS" w:cs="Trebuchet MS"/>
+        </w:rPr>
+        <w:t xml:space="preserve"> declaration package.</w:t>
+      </w:r>
+    </w:p>
+    <w:p>
+      <w:pPr>
+        <w:ind w:left="720"/>
+      </w:pPr>
+      <w:r>
+        <w:rPr>
+          <w:noProof/>
+        </w:rPr>
+        <w:drawing>
+          <wp:anchor distT="0" distB="0" distL="114300" distR="114300" simplePos="0" relativeHeight="251668480" behindDoc="0" locked="0" layoutInCell="1" allowOverlap="1" wp14:anchorId="5E9CCDB5" wp14:editId="457B150A">
+            <wp:simplePos x="0" y="0"/>
+            <wp:positionH relativeFrom="margin">
+              <wp:align>center</wp:align>
+            </wp:positionH>
+            <wp:positionV relativeFrom="paragraph">
+              <wp:posOffset>197485</wp:posOffset>
+            </wp:positionV>
+            <wp:extent cx="3724275" cy="238125"/>
+            <wp:effectExtent l="0" t="0" r="9525" b="9525"/>
+            <wp:wrapTopAndBottom/>
+            <wp:docPr id="724357242" name="Picture 1"/>
+            <wp:cNvGraphicFramePr>
+              <a:graphicFrameLocks xmlns:a="http://schemas.openxmlformats.org/drawingml/2006/main" noChangeAspect="1"/>
+            </wp:cNvGraphicFramePr>
+            <a:graphic xmlns:a="http://schemas.openxmlformats.org/drawingml/2006/main">
+              <a:graphicData uri="http://schemas.openxmlformats.org/drawingml/2006/picture">
+                <pic:pic xmlns:pic="http://schemas.openxmlformats.org/drawingml/2006/picture">
+                  <pic:nvPicPr>
+                    <pic:cNvPr id="724357242" name=""/>
+                    <pic:cNvPicPr/>
+                  </pic:nvPicPr>
+                  <pic:blipFill>
+                    <a:blip r:embed="rId15">
+                      <a:extLst>
+                        <a:ext uri="{28A0092B-C50C-407E-A947-70E740481C1C}">
+                          <a14:useLocalDpi xmlns:a14="http://schemas.microsoft.com/office/drawing/2010/main" val="0"/>
+                        </a:ext>
+                      </a:extLst>
+                    </a:blip>
+                    <a:stretch>
+                      <a:fillRect/>
+                    </a:stretch>
+                  </pic:blipFill>
+                  <pic:spPr>
+                    <a:xfrm>
+                      <a:off x="0" y="0"/>
+                      <a:ext cx="3724275" cy="238125"/>
+                    </a:xfrm>
+                    <a:prstGeom prst="rect">
+                      <a:avLst/>
+                    </a:prstGeom>
+                  </pic:spPr>
+                </pic:pic>
+              </a:graphicData>
+            </a:graphic>
+          </wp:anchor>
+        </w:drawing>
+      </w:r>
+    </w:p>
+    <w:p>
+      <w:r>
+        <w:tab/>
+      </w:r>
+    </w:p>
+    <w:p>
+      <w:r>
+        <w:tab/>
+      </w:r>
+    </w:p>
+    <w:p/>
+    <w:p/>
+    <w:p/>
+    <w:p/>
+    <w:p/>
+    <w:p/>
+    <w:p>
+      <w:pPr>
+        <w:ind w:firstLine="720"/>
+      </w:pPr>
+      <w:r>
+        <w:rPr>
+          <w:noProof/>
+        </w:rPr>
+        <w:lastRenderedPageBreak/>
+        <w:drawing>
+          <wp:anchor distT="0" distB="0" distL="114300" distR="114300" simplePos="0" relativeHeight="251669504" behindDoc="0" locked="0" layoutInCell="1" allowOverlap="1" wp14:anchorId="43D52C7B" wp14:editId="492F46D7">
+            <wp:simplePos x="0" y="0"/>
+            <wp:positionH relativeFrom="margin">
+              <wp:align>center</wp:align>
+            </wp:positionH>
+            <wp:positionV relativeFrom="paragraph">
+              <wp:posOffset>276225</wp:posOffset>
+            </wp:positionV>
+            <wp:extent cx="2343150" cy="2838450"/>
+            <wp:effectExtent l="0" t="0" r="0" b="0"/>
+            <wp:wrapTopAndBottom/>
+            <wp:docPr id="1210939336" name="Picture 1"/>
+            <wp:cNvGraphicFramePr>
+              <a:graphicFrameLocks xmlns:a="http://schemas.openxmlformats.org/drawingml/2006/main" noChangeAspect="1"/>
+            </wp:cNvGraphicFramePr>
+            <a:graphic xmlns:a="http://schemas.openxmlformats.org/drawingml/2006/main">
+              <a:graphicData uri="http://schemas.openxmlformats.org/drawingml/2006/picture">
+                <pic:pic xmlns:pic="http://schemas.openxmlformats.org/drawingml/2006/picture">
+                  <pic:nvPicPr>
+                    <pic:cNvPr id="1210939336" name=""/>
+                    <pic:cNvPicPr/>
+                  </pic:nvPicPr>
+                  <pic:blipFill>
+                    <a:blip r:embed="rId16">
+                      <a:extLst>
+                        <a:ext uri="{28A0092B-C50C-407E-A947-70E740481C1C}">
+                          <a14:useLocalDpi xmlns:a14="http://schemas.microsoft.com/office/drawing/2010/main" val="0"/>
+                        </a:ext>
+                      </a:extLst>
+                    </a:blip>
+                    <a:stretch>
+                      <a:fillRect/>
+                    </a:stretch>
+                  </pic:blipFill>
+                  <pic:spPr>
+                    <a:xfrm>
+                      <a:off x="0" y="0"/>
+                      <a:ext cx="2343150" cy="2838450"/>
+                    </a:xfrm>
+                    <a:prstGeom prst="rect">
+                      <a:avLst/>
+                    </a:prstGeom>
+                  </pic:spPr>
+                </pic:pic>
+              </a:graphicData>
+            </a:graphic>
+          </wp:anchor>
+        </w:drawing>
+      </w:r>
+      <w:r>
+        <w:t xml:space="preserve">I will then update my </w:t>
       </w:r>
       <w:proofErr w:type="spellStart"/>
       <w:r>
-        <w:t>App.tsx</w:t>
+        <w:t>tsconfig</w:t>
       </w:r>
       <w:proofErr w:type="spellEnd"/>
-    </w:p>
-    <w:p/>
+      <w:r>
+        <w:t xml:space="preserve"> file by adding the paths option so Typescript can find the declaration file.</w:t>
+      </w:r>
+      <w:r>
+        <w:t xml:space="preserve"> </w:t>
+      </w:r>
+    </w:p>
     <w:p>
       <w:r>
         <w:tab/>
+      </w:r>
+    </w:p>
+    <w:p>
+      <w:r>
+        <w:t xml:space="preserve"> </w:t>
       </w:r>
     </w:p>
     <w:sectPr>
@@ -2881,6 +2983,9 @@
   <w:style w:type="paragraph" w:default="1" w:styleId="Normal">
     <w:name w:val="Normal"/>
     <w:qFormat/>
+    <w:rPr>
+      <w:lang w:val="en-GB"/>
+    </w:rPr>
   </w:style>
   <w:style w:type="paragraph" w:styleId="Heading1">
     <w:name w:val="heading 1"/>
@@ -2999,7 +3104,6 @@
   <w:style w:type="character" w:default="1" w:styleId="DefaultParagraphFont">
     <w:name w:val="Default Paragraph Font"/>
     <w:uiPriority w:val="1"/>
-    <w:semiHidden/>
     <w:unhideWhenUsed/>
   </w:style>
   <w:style w:type="table" w:default="1" w:styleId="TableNormal">

</xml_diff>

<commit_message>
Added routes for Login system
</commit_message>
<xml_diff>
--- a/WAD_Report.docx
+++ b/WAD_Report.docx
@@ -2449,9 +2449,115 @@
       </w:r>
     </w:p>
     <w:p>
+      <w:pPr>
+        <w:ind w:left="720"/>
+      </w:pPr>
+      <w:r>
+        <w:rPr>
+          <w:noProof/>
+        </w:rPr>
+        <w:drawing>
+          <wp:anchor distT="0" distB="0" distL="114300" distR="114300" simplePos="0" relativeHeight="251670528" behindDoc="0" locked="0" layoutInCell="1" allowOverlap="1" wp14:anchorId="5703BECE" wp14:editId="5E4C75BF">
+            <wp:simplePos x="0" y="0"/>
+            <wp:positionH relativeFrom="page">
+              <wp:posOffset>2190750</wp:posOffset>
+            </wp:positionH>
+            <wp:positionV relativeFrom="paragraph">
+              <wp:posOffset>1645285</wp:posOffset>
+            </wp:positionV>
+            <wp:extent cx="3695700" cy="4196080"/>
+            <wp:effectExtent l="0" t="0" r="0" b="0"/>
+            <wp:wrapTopAndBottom/>
+            <wp:docPr id="1836498006" name="Picture 1"/>
+            <wp:cNvGraphicFramePr>
+              <a:graphicFrameLocks xmlns:a="http://schemas.openxmlformats.org/drawingml/2006/main" noChangeAspect="1"/>
+            </wp:cNvGraphicFramePr>
+            <a:graphic xmlns:a="http://schemas.openxmlformats.org/drawingml/2006/main">
+              <a:graphicData uri="http://schemas.openxmlformats.org/drawingml/2006/picture">
+                <pic:pic xmlns:pic="http://schemas.openxmlformats.org/drawingml/2006/picture">
+                  <pic:nvPicPr>
+                    <pic:cNvPr id="1836498006" name=""/>
+                    <pic:cNvPicPr/>
+                  </pic:nvPicPr>
+                  <pic:blipFill>
+                    <a:blip r:embed="rId17">
+                      <a:extLst>
+                        <a:ext uri="{28A0092B-C50C-407E-A947-70E740481C1C}">
+                          <a14:useLocalDpi xmlns:a14="http://schemas.microsoft.com/office/drawing/2010/main" val="0"/>
+                        </a:ext>
+                      </a:extLst>
+                    </a:blip>
+                    <a:stretch>
+                      <a:fillRect/>
+                    </a:stretch>
+                  </pic:blipFill>
+                  <pic:spPr>
+                    <a:xfrm>
+                      <a:off x="0" y="0"/>
+                      <a:ext cx="3695700" cy="4196080"/>
+                    </a:xfrm>
+                    <a:prstGeom prst="rect">
+                      <a:avLst/>
+                    </a:prstGeom>
+                  </pic:spPr>
+                </pic:pic>
+              </a:graphicData>
+            </a:graphic>
+            <wp14:sizeRelH relativeFrom="margin">
+              <wp14:pctWidth>0</wp14:pctWidth>
+            </wp14:sizeRelH>
+            <wp14:sizeRelV relativeFrom="margin">
+              <wp14:pctHeight>0</wp14:pctHeight>
+            </wp14:sizeRelV>
+          </wp:anchor>
+        </w:drawing>
+      </w:r>
+      <w:r>
+        <w:t xml:space="preserve">I will next need to add three new routes to my </w:t>
+      </w:r>
+      <w:proofErr w:type="spellStart"/>
+      <w:r>
+        <w:t>server.ts</w:t>
+      </w:r>
+      <w:proofErr w:type="spellEnd"/>
+      <w:r>
+        <w:t xml:space="preserve"> file</w:t>
+      </w:r>
+      <w:r>
+        <w:t xml:space="preserve"> and set up the session middleware so that the requests pass through it</w:t>
+      </w:r>
+      <w:r>
+        <w:t>. Th</w:t>
+      </w:r>
+      <w:r>
+        <w:t>ese routes I will create</w:t>
+      </w:r>
+      <w:r>
+        <w:t xml:space="preserve"> will be for the login (POST), logout (POST) and another which will check the current login status (GET). The POST login route will send a username and password to the session database to be stored there. This will return the username of the person logged in or an error message if one has occurred. The POST logout will delete the session entry from the session database entirely, acting as a logout, as the session ID stored in the user’s cookie would no longer correspond to anything on the server. </w:t>
+      </w:r>
       <w:r>
         <w:t xml:space="preserve"> </w:t>
       </w:r>
+      <w:r>
+        <w:t>A confirmation should then be returned if successful. The GET route</w:t>
+      </w:r>
+      <w:r>
+        <w:t>,</w:t>
+      </w:r>
+      <w:r>
+        <w:t xml:space="preserve"> that checks the login status</w:t>
+      </w:r>
+      <w:r>
+        <w:t>,</w:t>
+      </w:r>
+      <w:r>
+        <w:t xml:space="preserve"> will simply return the username of the user inside the session database or return null if it is empty.</w:t>
+      </w:r>
+    </w:p>
+    <w:p>
+      <w:pPr>
+        <w:ind w:left="720"/>
+      </w:pPr>
     </w:p>
     <w:sectPr>
       <w:pgSz w:w="12240" w:h="15840"/>

</xml_diff>

<commit_message>
Added login react component
</commit_message>
<xml_diff>
--- a/WAD_Report.docx
+++ b/WAD_Report.docx
@@ -432,6 +432,9 @@
         <w:t xml:space="preserve"> I can then test it directly in the browser. I will finally contain this in a try{} and catch{} statement so if the GET request results in an error, the error will be returned in place of the JSON from the database.</w:t>
       </w:r>
       <w:r>
+        <w:rPr>
+          <w:noProof/>
+        </w:rPr>
         <w:drawing>
           <wp:anchor distT="114300" distB="114300" distL="114300" distR="114300" simplePos="0" relativeHeight="251658240" behindDoc="0" locked="0" layoutInCell="1" hidden="0" allowOverlap="1" wp14:anchorId="7F05CBF7" wp14:editId="1C6EAE8E">
             <wp:simplePos x="0" y="0"/>
@@ -556,6 +559,9 @@
         <w:t xml:space="preserve"> the previous GET endpoint, I will be able to easily test it in the browser and will be contained in a try{} and catch{} statement similarly to the previous task.</w:t>
       </w:r>
       <w:r>
+        <w:rPr>
+          <w:noProof/>
+        </w:rPr>
         <w:drawing>
           <wp:anchor distT="114300" distB="114300" distL="114300" distR="114300" simplePos="0" relativeHeight="251659264" behindDoc="0" locked="0" layoutInCell="1" hidden="0" allowOverlap="1" wp14:anchorId="5D2B3FBF" wp14:editId="5F396B23">
             <wp:simplePos x="0" y="0"/>
@@ -727,6 +733,9 @@
         <w:t>(). This will make sure that both operations will either succeed or fail together, this would prevent one change happening without the other in the event of an error which would make the database inaccurate. I will then test the endpoint using the Thunder Client. Like the previous tasks I will also wrap this inside a try{} and catch{} statement.</w:t>
       </w:r>
       <w:r>
+        <w:rPr>
+          <w:noProof/>
+        </w:rPr>
         <w:drawing>
           <wp:anchor distT="114300" distB="114300" distL="114300" distR="114300" simplePos="0" relativeHeight="251660288" behindDoc="0" locked="0" layoutInCell="1" hidden="0" allowOverlap="1" wp14:anchorId="38CFF502" wp14:editId="1CF718A8">
             <wp:simplePos x="0" y="0"/>
@@ -975,6 +984,9 @@
         <w:t xml:space="preserve"> and then export it so both child components could share the same type, avoiding any unneeded duplication.</w:t>
       </w:r>
       <w:r>
+        <w:rPr>
+          <w:noProof/>
+        </w:rPr>
         <w:drawing>
           <wp:anchor distT="114300" distB="114300" distL="114300" distR="114300" simplePos="0" relativeHeight="251661312" behindDoc="0" locked="0" layoutInCell="1" hidden="0" allowOverlap="1" wp14:anchorId="4E79B115" wp14:editId="2D8B5A7B">
             <wp:simplePos x="0" y="0"/>
@@ -1185,6 +1197,9 @@
         </w:rPr>
       </w:pPr>
       <w:r>
+        <w:rPr>
+          <w:noProof/>
+        </w:rPr>
         <w:drawing>
           <wp:anchor distT="114300" distB="114300" distL="114300" distR="114300" simplePos="0" relativeHeight="251662336" behindDoc="0" locked="0" layoutInCell="1" hidden="0" allowOverlap="1" wp14:anchorId="561AF115" wp14:editId="06AE68B6">
             <wp:simplePos x="0" y="0"/>
@@ -1378,6 +1393,9 @@
         </w:rPr>
       </w:pPr>
       <w:r>
+        <w:rPr>
+          <w:noProof/>
+        </w:rPr>
         <w:drawing>
           <wp:anchor distT="114300" distB="114300" distL="114300" distR="114300" simplePos="0" relativeHeight="251663360" behindDoc="0" locked="0" layoutInCell="1" hidden="0" allowOverlap="1" wp14:anchorId="1D4A0FDD" wp14:editId="3F70267E">
             <wp:simplePos x="0" y="0"/>
@@ -1527,6 +1545,9 @@
         </w:rPr>
       </w:pPr>
       <w:r>
+        <w:rPr>
+          <w:noProof/>
+        </w:rPr>
         <w:drawing>
           <wp:anchor distT="0" distB="0" distL="114300" distR="114300" simplePos="0" relativeHeight="251664384" behindDoc="0" locked="0" layoutInCell="1" allowOverlap="1" wp14:anchorId="3A3AD79F" wp14:editId="62B93B01">
             <wp:simplePos x="0" y="0"/>
@@ -1642,6 +1663,9 @@
         </w:rPr>
       </w:pPr>
       <w:r>
+        <w:rPr>
+          <w:noProof/>
+        </w:rPr>
         <w:drawing>
           <wp:anchor distT="0" distB="0" distL="114300" distR="114300" simplePos="0" relativeHeight="251665408" behindDoc="0" locked="0" layoutInCell="1" allowOverlap="1" wp14:anchorId="3D485B72" wp14:editId="04866FC5">
             <wp:simplePos x="0" y="0"/>
@@ -1826,6 +1850,9 @@
         </w:rPr>
       </w:pPr>
       <w:r>
+        <w:rPr>
+          <w:noProof/>
+        </w:rPr>
         <w:drawing>
           <wp:anchor distT="0" distB="0" distL="114300" distR="114300" simplePos="0" relativeHeight="251666432" behindDoc="0" locked="0" layoutInCell="1" allowOverlap="1" wp14:anchorId="520D8CE5" wp14:editId="5C145F47">
             <wp:simplePos x="0" y="0"/>
@@ -2012,6 +2039,9 @@
     </w:p>
     <w:p>
       <w:r>
+        <w:rPr>
+          <w:noProof/>
+        </w:rPr>
         <w:lastRenderedPageBreak/>
         <w:drawing>
           <wp:anchor distT="0" distB="0" distL="114300" distR="114300" simplePos="0" relativeHeight="251667456" behindDoc="0" locked="0" layoutInCell="1" allowOverlap="1" wp14:anchorId="75098BDD" wp14:editId="66425B34">
@@ -2126,15 +2156,7 @@
           <w:i/>
           <w:iCs/>
         </w:rPr>
-        <w:t>“</w:t>
-      </w:r>
-      <w:r>
-        <w:rPr>
-          <w:rFonts w:ascii="Trebuchet MS" w:hAnsi="Trebuchet MS" w:cs="Trebuchet MS"/>
-          <w:i/>
-          <w:iCs/>
-        </w:rPr>
-        <w:t>Implement a session-based login system. A user should be able to login from the main index page via a login form. If a user logs in successfully, a message should appear within a &lt;div&gt; on the index page, e.g.</w:t>
+        <w:t>“Implement a session-based login system. A user should be able to login from the main index page via a login form. If a user logs in successfully, a message should appear within a &lt;div&gt; on the index page, e.g.</w:t>
       </w:r>
     </w:p>
     <w:p>
@@ -2211,15 +2233,7 @@
           <w:i/>
           <w:iCs/>
         </w:rPr>
-        <w:t>There is no need to implement a signup facility, as the provided database contains existing users.</w:t>
-      </w:r>
-      <w:r>
-        <w:rPr>
-          <w:rFonts w:ascii="Trebuchet MS" w:hAnsi="Trebuchet MS" w:cs="Trebuchet MS"/>
-          <w:i/>
-          <w:iCs/>
-        </w:rPr>
-        <w:t>”</w:t>
+        <w:t>There is no need to implement a signup facility, as the provided database contains existing users.”</w:t>
       </w:r>
     </w:p>
     <w:p>
@@ -2552,6 +2566,127 @@
       </w:r>
       <w:r>
         <w:t xml:space="preserve"> will simply return the username of the user inside the session database or return null if it is empty.</w:t>
+      </w:r>
+    </w:p>
+    <w:p>
+      <w:pPr>
+        <w:ind w:left="720"/>
+      </w:pPr>
+      <w:r>
+        <w:rPr>
+          <w:noProof/>
+        </w:rPr>
+        <w:lastRenderedPageBreak/>
+        <w:drawing>
+          <wp:anchor distT="0" distB="0" distL="114300" distR="114300" simplePos="0" relativeHeight="251671552" behindDoc="0" locked="0" layoutInCell="1" allowOverlap="1" wp14:anchorId="11C93712" wp14:editId="4E119C5D">
+            <wp:simplePos x="0" y="0"/>
+            <wp:positionH relativeFrom="margin">
+              <wp:align>right</wp:align>
+            </wp:positionH>
+            <wp:positionV relativeFrom="paragraph">
+              <wp:posOffset>2095500</wp:posOffset>
+            </wp:positionV>
+            <wp:extent cx="6858000" cy="5015230"/>
+            <wp:effectExtent l="0" t="0" r="0" b="0"/>
+            <wp:wrapTopAndBottom/>
+            <wp:docPr id="994534223" name="Picture 1"/>
+            <wp:cNvGraphicFramePr>
+              <a:graphicFrameLocks xmlns:a="http://schemas.openxmlformats.org/drawingml/2006/main" noChangeAspect="1"/>
+            </wp:cNvGraphicFramePr>
+            <a:graphic xmlns:a="http://schemas.openxmlformats.org/drawingml/2006/main">
+              <a:graphicData uri="http://schemas.openxmlformats.org/drawingml/2006/picture">
+                <pic:pic xmlns:pic="http://schemas.openxmlformats.org/drawingml/2006/picture">
+                  <pic:nvPicPr>
+                    <pic:cNvPr id="994534223" name=""/>
+                    <pic:cNvPicPr/>
+                  </pic:nvPicPr>
+                  <pic:blipFill>
+                    <a:blip r:embed="rId18">
+                      <a:extLst>
+                        <a:ext uri="{28A0092B-C50C-407E-A947-70E740481C1C}">
+                          <a14:useLocalDpi xmlns:a14="http://schemas.microsoft.com/office/drawing/2010/main" val="0"/>
+                        </a:ext>
+                      </a:extLst>
+                    </a:blip>
+                    <a:stretch>
+                      <a:fillRect/>
+                    </a:stretch>
+                  </pic:blipFill>
+                  <pic:spPr>
+                    <a:xfrm>
+                      <a:off x="0" y="0"/>
+                      <a:ext cx="6858000" cy="5015230"/>
+                    </a:xfrm>
+                    <a:prstGeom prst="rect">
+                      <a:avLst/>
+                    </a:prstGeom>
+                  </pic:spPr>
+                </pic:pic>
+              </a:graphicData>
+            </a:graphic>
+          </wp:anchor>
+        </w:drawing>
+      </w:r>
+      <w:r>
+        <w:t>I will then add a new react component for the login functionality. This will utilise the three new routes I added to search through or change the database</w:t>
+      </w:r>
+      <w:r>
+        <w:t xml:space="preserve"> according to the async functions I give it. I will create the main </w:t>
+      </w:r>
+      <w:proofErr w:type="spellStart"/>
+      <w:r>
+        <w:t>loginComponent</w:t>
+      </w:r>
+      <w:proofErr w:type="spellEnd"/>
+      <w:r>
+        <w:t xml:space="preserve"> function which will take a </w:t>
+      </w:r>
+      <w:proofErr w:type="spellStart"/>
+      <w:r>
+        <w:t>LoginComponentProp</w:t>
+      </w:r>
+      <w:proofErr w:type="spellEnd"/>
+      <w:r>
+        <w:t xml:space="preserve"> as a parameter this will then contain two async functions. The first function will be used to log the user in using the login POST route. If the username and password are found in the database than the username is returned. If the username and password are not found, then the user should be displayed with an error message. The second function will logout the user using the POST logout route. If a username is returned by the login </w:t>
+      </w:r>
+      <w:r>
+        <w:t>function,</w:t>
+      </w:r>
+      <w:r>
+        <w:t xml:space="preserve"> then the </w:t>
+      </w:r>
+      <w:proofErr w:type="spellStart"/>
+      <w:r>
+        <w:t>loginComponent</w:t>
+      </w:r>
+      <w:proofErr w:type="spellEnd"/>
+      <w:r>
+        <w:t xml:space="preserve"> function will return the appropriate HTML to display the username of the user who is logged in </w:t>
+      </w:r>
+      <w:r>
+        <w:t>and</w:t>
+      </w:r>
+      <w:r>
+        <w:t xml:space="preserve"> a button to logout. </w:t>
+      </w:r>
+      <w:r>
+        <w:t xml:space="preserve">The </w:t>
+      </w:r>
+      <w:proofErr w:type="spellStart"/>
+      <w:r>
+        <w:t>loginComponent</w:t>
+      </w:r>
+      <w:proofErr w:type="spellEnd"/>
+      <w:r>
+        <w:t xml:space="preserve"> function will return HTML that will allow the user to enter their username and password accompanied by a button which would then be used to login.</w:t>
+      </w:r>
+    </w:p>
+    <w:p>
+      <w:pPr>
+        <w:ind w:left="720"/>
+      </w:pPr>
+      <w:r>
+        <w:t xml:space="preserve"> </w:t>
       </w:r>
     </w:p>
     <w:p>
@@ -3210,6 +3345,7 @@
   <w:style w:type="character" w:default="1" w:styleId="DefaultParagraphFont">
     <w:name w:val="Default Paragraph Font"/>
     <w:uiPriority w:val="1"/>
+    <w:semiHidden/>
     <w:unhideWhenUsed/>
   </w:style>
   <w:style w:type="table" w:default="1" w:styleId="TableNormal">

</xml_diff>

<commit_message>
Added LoginComponent to App.tsx
</commit_message>
<xml_diff>
--- a/WAD_Report.docx
+++ b/WAD_Report.docx
@@ -2687,6 +2687,144 @@
       </w:pPr>
       <w:r>
         <w:t xml:space="preserve"> </w:t>
+      </w:r>
+    </w:p>
+    <w:p>
+      <w:pPr>
+        <w:ind w:left="720"/>
+      </w:pPr>
+    </w:p>
+    <w:p>
+      <w:pPr>
+        <w:ind w:left="720"/>
+      </w:pPr>
+    </w:p>
+    <w:p>
+      <w:pPr>
+        <w:ind w:left="720"/>
+      </w:pPr>
+    </w:p>
+    <w:p>
+      <w:pPr>
+        <w:ind w:left="720"/>
+      </w:pPr>
+    </w:p>
+    <w:p>
+      <w:pPr>
+        <w:ind w:left="720"/>
+      </w:pPr>
+    </w:p>
+    <w:p>
+      <w:pPr>
+        <w:ind w:left="720"/>
+      </w:pPr>
+    </w:p>
+    <w:p>
+      <w:pPr>
+        <w:ind w:left="720"/>
+      </w:pPr>
+    </w:p>
+    <w:p>
+      <w:pPr>
+        <w:ind w:left="720"/>
+      </w:pPr>
+    </w:p>
+    <w:p>
+      <w:pPr>
+        <w:ind w:left="720"/>
+      </w:pPr>
+    </w:p>
+    <w:p>
+      <w:pPr>
+        <w:ind w:left="720"/>
+      </w:pPr>
+      <w:r>
+        <w:rPr>
+          <w:noProof/>
+        </w:rPr>
+        <w:lastRenderedPageBreak/>
+        <w:drawing>
+          <wp:anchor distT="0" distB="0" distL="114300" distR="114300" simplePos="0" relativeHeight="251672576" behindDoc="0" locked="0" layoutInCell="1" allowOverlap="1" wp14:anchorId="7BCDF547" wp14:editId="45C0E26C">
+            <wp:simplePos x="0" y="0"/>
+            <wp:positionH relativeFrom="margin">
+              <wp:align>center</wp:align>
+            </wp:positionH>
+            <wp:positionV relativeFrom="paragraph">
+              <wp:posOffset>1209675</wp:posOffset>
+            </wp:positionV>
+            <wp:extent cx="3937635" cy="7172325"/>
+            <wp:effectExtent l="0" t="0" r="5715" b="9525"/>
+            <wp:wrapTopAndBottom/>
+            <wp:docPr id="1413266055" name="Picture 1"/>
+            <wp:cNvGraphicFramePr>
+              <a:graphicFrameLocks xmlns:a="http://schemas.openxmlformats.org/drawingml/2006/main" noChangeAspect="1"/>
+            </wp:cNvGraphicFramePr>
+            <a:graphic xmlns:a="http://schemas.openxmlformats.org/drawingml/2006/main">
+              <a:graphicData uri="http://schemas.openxmlformats.org/drawingml/2006/picture">
+                <pic:pic xmlns:pic="http://schemas.openxmlformats.org/drawingml/2006/picture">
+                  <pic:nvPicPr>
+                    <pic:cNvPr id="1413266055" name=""/>
+                    <pic:cNvPicPr/>
+                  </pic:nvPicPr>
+                  <pic:blipFill>
+                    <a:blip r:embed="rId19">
+                      <a:extLst>
+                        <a:ext uri="{28A0092B-C50C-407E-A947-70E740481C1C}">
+                          <a14:useLocalDpi xmlns:a14="http://schemas.microsoft.com/office/drawing/2010/main" val="0"/>
+                        </a:ext>
+                      </a:extLst>
+                    </a:blip>
+                    <a:stretch>
+                      <a:fillRect/>
+                    </a:stretch>
+                  </pic:blipFill>
+                  <pic:spPr>
+                    <a:xfrm>
+                      <a:off x="0" y="0"/>
+                      <a:ext cx="3937635" cy="7172325"/>
+                    </a:xfrm>
+                    <a:prstGeom prst="rect">
+                      <a:avLst/>
+                    </a:prstGeom>
+                  </pic:spPr>
+                </pic:pic>
+              </a:graphicData>
+            </a:graphic>
+            <wp14:sizeRelH relativeFrom="margin">
+              <wp14:pctWidth>0</wp14:pctWidth>
+            </wp14:sizeRelH>
+            <wp14:sizeRelV relativeFrom="margin">
+              <wp14:pctHeight>0</wp14:pctHeight>
+            </wp14:sizeRelV>
+          </wp:anchor>
+        </w:drawing>
+      </w:r>
+      <w:r>
+        <w:t xml:space="preserve">I will then add the </w:t>
+      </w:r>
+      <w:proofErr w:type="spellStart"/>
+      <w:r>
+        <w:t>LoginComponent</w:t>
+      </w:r>
+      <w:proofErr w:type="spellEnd"/>
+      <w:r>
+        <w:t xml:space="preserve"> to the </w:t>
+      </w:r>
+      <w:proofErr w:type="spellStart"/>
+      <w:r>
+        <w:t>App.tsx</w:t>
+      </w:r>
+      <w:proofErr w:type="spellEnd"/>
+      <w:r>
+        <w:t xml:space="preserve"> so it displays on the index.html. To do this I will need to add a username state variable which will represent the username of the user who is currently logged in. This will be set using a </w:t>
+      </w:r>
+      <w:proofErr w:type="spellStart"/>
+      <w:r>
+        <w:t>useEffect</w:t>
+      </w:r>
+      <w:proofErr w:type="spellEnd"/>
+      <w:r>
+        <w:t xml:space="preserve"> function which will fetch the username of the user from the session database using the login GET route. This should be running first every time the page reloads as this allows the user to remained logged in even when the page reloads and only logs out when the users choose to.</w:t>
       </w:r>
     </w:p>
     <w:p>

</xml_diff>

<commit_message>
Added Login check for accom booking
</commit_message>
<xml_diff>
--- a/WAD_Report.docx
+++ b/WAD_Report.docx
@@ -2832,6 +2832,258 @@
         <w:ind w:left="720"/>
       </w:pPr>
     </w:p>
+    <w:p>
+      <w:pPr>
+        <w:ind w:left="720"/>
+      </w:pPr>
+    </w:p>
+    <w:p>
+      <w:pPr>
+        <w:ind w:left="720"/>
+      </w:pPr>
+    </w:p>
+    <w:p>
+      <w:pPr>
+        <w:ind w:left="720"/>
+      </w:pPr>
+    </w:p>
+    <w:p>
+      <w:r>
+        <w:rPr>
+          <w:rFonts w:ascii="Trebuchet MS" w:hAnsi="Trebuchet MS" w:cs="Trebuchet MS"/>
+        </w:rPr>
+        <w:lastRenderedPageBreak/>
+        <w:t xml:space="preserve">9. </w:t>
+      </w:r>
+      <w:r>
+        <w:rPr>
+          <w:rFonts w:ascii="Trebuchet MS" w:hAnsi="Trebuchet MS" w:cs="Trebuchet MS"/>
+          <w:i/>
+          <w:iCs/>
+        </w:rPr>
+        <w:t>“</w:t>
+      </w:r>
+      <w:r>
+        <w:rPr>
+          <w:rFonts w:ascii="Trebuchet MS" w:hAnsi="Trebuchet MS" w:cs="Trebuchet MS"/>
+          <w:i/>
+          <w:iCs/>
+        </w:rPr>
+        <w:t xml:space="preserve">Change task 3 so that a user must be </w:t>
+      </w:r>
+      <w:proofErr w:type="gramStart"/>
+      <w:r>
+        <w:rPr>
+          <w:rFonts w:ascii="Trebuchet MS" w:hAnsi="Trebuchet MS" w:cs="Trebuchet MS"/>
+          <w:i/>
+          <w:iCs/>
+        </w:rPr>
+        <w:t>logged-in</w:t>
+      </w:r>
+      <w:proofErr w:type="gramEnd"/>
+      <w:r>
+        <w:rPr>
+          <w:rFonts w:ascii="Trebuchet MS" w:hAnsi="Trebuchet MS" w:cs="Trebuchet MS"/>
+          <w:i/>
+          <w:iCs/>
+        </w:rPr>
+        <w:t xml:space="preserve"> to book accommodation, sending back an appropriate HTTP error if they are not. Also change task 5 so that this error is checked, and an appropriate user-friendly error message displayed to the user if they are not logged in.</w:t>
+      </w:r>
+      <w:r>
+        <w:rPr>
+          <w:rFonts w:ascii="Trebuchet MS" w:hAnsi="Trebuchet MS" w:cs="Trebuchet MS"/>
+          <w:i/>
+          <w:iCs/>
+        </w:rPr>
+        <w:t>”</w:t>
+      </w:r>
+    </w:p>
+    <w:p>
+      <w:pPr>
+        <w:ind w:left="720"/>
+      </w:pPr>
+    </w:p>
+    <w:p>
+      <w:pPr>
+        <w:ind w:left="720"/>
+      </w:pPr>
+      <w:r>
+        <w:t xml:space="preserve">For this task I will add a login check to my </w:t>
+      </w:r>
+      <w:r>
+        <w:t xml:space="preserve">booking route in the </w:t>
+      </w:r>
+      <w:proofErr w:type="spellStart"/>
+      <w:r>
+        <w:t>server.ts</w:t>
+      </w:r>
+      <w:proofErr w:type="spellEnd"/>
+      <w:r>
+        <w:t>. This will check whether there is a username in the session db. If there isn’t the route will return a 401 error which will contain the appropriate error message.</w:t>
+      </w:r>
+    </w:p>
+    <w:p>
+      <w:pPr>
+        <w:ind w:left="720"/>
+      </w:pPr>
+    </w:p>
+    <w:p>
+      <w:pPr>
+        <w:ind w:left="720"/>
+      </w:pPr>
+      <w:r>
+        <w:t xml:space="preserve">Then in my </w:t>
+      </w:r>
+      <w:proofErr w:type="spellStart"/>
+      <w:r>
+        <w:t>ResultsComponent</w:t>
+      </w:r>
+      <w:proofErr w:type="spellEnd"/>
+      <w:r>
+        <w:t xml:space="preserve"> I will add an extra response checker to include the 401 error so that the appropriate message is displayed to the user.</w:t>
+      </w:r>
+    </w:p>
+    <w:p>
+      <w:pPr>
+        <w:ind w:left="720"/>
+      </w:pPr>
+      <w:r>
+        <w:rPr>
+          <w:noProof/>
+        </w:rPr>
+        <w:drawing>
+          <wp:anchor distT="0" distB="0" distL="114300" distR="114300" simplePos="0" relativeHeight="251674624" behindDoc="0" locked="0" layoutInCell="1" allowOverlap="1" wp14:anchorId="7D4132DB" wp14:editId="4D00B388">
+            <wp:simplePos x="0" y="0"/>
+            <wp:positionH relativeFrom="margin">
+              <wp:align>center</wp:align>
+            </wp:positionH>
+            <wp:positionV relativeFrom="paragraph">
+              <wp:posOffset>1033145</wp:posOffset>
+            </wp:positionV>
+            <wp:extent cx="5705475" cy="445135"/>
+            <wp:effectExtent l="0" t="0" r="9525" b="0"/>
+            <wp:wrapTopAndBottom/>
+            <wp:docPr id="291913530" name="Picture 1"/>
+            <wp:cNvGraphicFramePr>
+              <a:graphicFrameLocks xmlns:a="http://schemas.openxmlformats.org/drawingml/2006/main" noChangeAspect="1"/>
+            </wp:cNvGraphicFramePr>
+            <a:graphic xmlns:a="http://schemas.openxmlformats.org/drawingml/2006/main">
+              <a:graphicData uri="http://schemas.openxmlformats.org/drawingml/2006/picture">
+                <pic:pic xmlns:pic="http://schemas.openxmlformats.org/drawingml/2006/picture">
+                  <pic:nvPicPr>
+                    <pic:cNvPr id="291913530" name=""/>
+                    <pic:cNvPicPr/>
+                  </pic:nvPicPr>
+                  <pic:blipFill>
+                    <a:blip r:embed="rId20">
+                      <a:extLst>
+                        <a:ext uri="{28A0092B-C50C-407E-A947-70E740481C1C}">
+                          <a14:useLocalDpi xmlns:a14="http://schemas.microsoft.com/office/drawing/2010/main" val="0"/>
+                        </a:ext>
+                      </a:extLst>
+                    </a:blip>
+                    <a:stretch>
+                      <a:fillRect/>
+                    </a:stretch>
+                  </pic:blipFill>
+                  <pic:spPr>
+                    <a:xfrm>
+                      <a:off x="0" y="0"/>
+                      <a:ext cx="5705475" cy="445135"/>
+                    </a:xfrm>
+                    <a:prstGeom prst="rect">
+                      <a:avLst/>
+                    </a:prstGeom>
+                  </pic:spPr>
+                </pic:pic>
+              </a:graphicData>
+            </a:graphic>
+            <wp14:sizeRelH relativeFrom="margin">
+              <wp14:pctWidth>0</wp14:pctWidth>
+            </wp14:sizeRelH>
+            <wp14:sizeRelV relativeFrom="margin">
+              <wp14:pctHeight>0</wp14:pctHeight>
+            </wp14:sizeRelV>
+          </wp:anchor>
+        </w:drawing>
+      </w:r>
+      <w:r>
+        <w:rPr>
+          <w:noProof/>
+        </w:rPr>
+        <w:drawing>
+          <wp:anchor distT="0" distB="0" distL="114300" distR="114300" simplePos="0" relativeHeight="251673600" behindDoc="0" locked="0" layoutInCell="1" allowOverlap="1" wp14:anchorId="19703B50" wp14:editId="7D4EA049">
+            <wp:simplePos x="0" y="0"/>
+            <wp:positionH relativeFrom="margin">
+              <wp:align>center</wp:align>
+            </wp:positionH>
+            <wp:positionV relativeFrom="paragraph">
+              <wp:posOffset>223520</wp:posOffset>
+            </wp:positionV>
+            <wp:extent cx="5543550" cy="753110"/>
+            <wp:effectExtent l="0" t="0" r="0" b="8890"/>
+            <wp:wrapTopAndBottom/>
+            <wp:docPr id="1291076721" name="Picture 1"/>
+            <wp:cNvGraphicFramePr>
+              <a:graphicFrameLocks xmlns:a="http://schemas.openxmlformats.org/drawingml/2006/main" noChangeAspect="1"/>
+            </wp:cNvGraphicFramePr>
+            <a:graphic xmlns:a="http://schemas.openxmlformats.org/drawingml/2006/main">
+              <a:graphicData uri="http://schemas.openxmlformats.org/drawingml/2006/picture">
+                <pic:pic xmlns:pic="http://schemas.openxmlformats.org/drawingml/2006/picture">
+                  <pic:nvPicPr>
+                    <pic:cNvPr id="1291076721" name=""/>
+                    <pic:cNvPicPr/>
+                  </pic:nvPicPr>
+                  <pic:blipFill>
+                    <a:blip r:embed="rId21">
+                      <a:extLst>
+                        <a:ext uri="{28A0092B-C50C-407E-A947-70E740481C1C}">
+                          <a14:useLocalDpi xmlns:a14="http://schemas.microsoft.com/office/drawing/2010/main" val="0"/>
+                        </a:ext>
+                      </a:extLst>
+                    </a:blip>
+                    <a:stretch>
+                      <a:fillRect/>
+                    </a:stretch>
+                  </pic:blipFill>
+                  <pic:spPr>
+                    <a:xfrm>
+                      <a:off x="0" y="0"/>
+                      <a:ext cx="5543550" cy="753110"/>
+                    </a:xfrm>
+                    <a:prstGeom prst="rect">
+                      <a:avLst/>
+                    </a:prstGeom>
+                  </pic:spPr>
+                </pic:pic>
+              </a:graphicData>
+            </a:graphic>
+            <wp14:sizeRelH relativeFrom="margin">
+              <wp14:pctWidth>0</wp14:pctWidth>
+            </wp14:sizeRelH>
+            <wp14:sizeRelV relativeFrom="margin">
+              <wp14:pctHeight>0</wp14:pctHeight>
+            </wp14:sizeRelV>
+          </wp:anchor>
+        </w:drawing>
+      </w:r>
+    </w:p>
+    <w:p/>
+    <w:p/>
+    <w:p/>
+    <w:p>
+      <w:pPr>
+        <w:tabs>
+          <w:tab w:val="left" w:pos="3270"/>
+        </w:tabs>
+      </w:pPr>
+      <w:r>
+        <w:tab/>
+      </w:r>
+    </w:p>
+    <w:p/>
+    <w:p/>
+    <w:p/>
     <w:sectPr>
       <w:pgSz w:w="12240" w:h="15840"/>
       <w:pgMar w:top="720" w:right="720" w:bottom="720" w:left="720" w:header="720" w:footer="720" w:gutter="0"/>

</xml_diff>

<commit_message>
Added inputs for date and people and error responses for the inputs
</commit_message>
<xml_diff>
--- a/WAD_Report.docx
+++ b/WAD_Report.docx
@@ -2861,15 +2861,7 @@
           <w:i/>
           <w:iCs/>
         </w:rPr>
-        <w:t>“</w:t>
-      </w:r>
-      <w:r>
-        <w:rPr>
-          <w:rFonts w:ascii="Trebuchet MS" w:hAnsi="Trebuchet MS" w:cs="Trebuchet MS"/>
-          <w:i/>
-          <w:iCs/>
-        </w:rPr>
-        <w:t xml:space="preserve">Change task 3 so that a user must be </w:t>
+        <w:t xml:space="preserve">“Change task 3 so that a user must be </w:t>
       </w:r>
       <w:proofErr w:type="gramStart"/>
       <w:r>
@@ -2887,15 +2879,7 @@
           <w:i/>
           <w:iCs/>
         </w:rPr>
-        <w:t xml:space="preserve"> to book accommodation, sending back an appropriate HTTP error if they are not. Also change task 5 so that this error is checked, and an appropriate user-friendly error message displayed to the user if they are not logged in.</w:t>
-      </w:r>
-      <w:r>
-        <w:rPr>
-          <w:rFonts w:ascii="Trebuchet MS" w:hAnsi="Trebuchet MS" w:cs="Trebuchet MS"/>
-          <w:i/>
-          <w:iCs/>
-        </w:rPr>
-        <w:t>”</w:t>
+        <w:t xml:space="preserve"> to book accommodation, sending back an appropriate HTTP error if they are not. Also change task 5 so that this error is checked, and an appropriate user-friendly error message displayed to the user if they are not logged in.”</w:t>
       </w:r>
     </w:p>
     <w:p>
@@ -3068,22 +3052,706 @@
         </w:drawing>
       </w:r>
     </w:p>
+    <w:p>
+      <w:r>
+        <w:tab/>
+      </w:r>
+    </w:p>
     <w:p/>
-    <w:p/>
-    <w:p/>
-    <w:p>
-      <w:pPr>
-        <w:tabs>
-          <w:tab w:val="left" w:pos="3270"/>
-        </w:tabs>
-      </w:pPr>
-      <w:r>
+    <w:p>
+      <w:pPr>
+        <w:rPr>
+          <w:rFonts w:ascii="Trebuchet MS" w:hAnsi="Trebuchet MS" w:cs="Trebuchet MS"/>
+        </w:rPr>
+      </w:pPr>
+    </w:p>
+    <w:p>
+      <w:pPr>
+        <w:pStyle w:val="Heading1"/>
+        <w:spacing w:after="240"/>
+        <w:rPr>
+          <w:b/>
+          <w:bCs/>
+        </w:rPr>
+      </w:pPr>
+      <w:r>
+        <w:rPr>
+          <w:b/>
+          <w:bCs/>
+        </w:rPr>
+        <w:t>Part G – More advanced tasks</w:t>
+      </w:r>
+    </w:p>
+    <w:p>
+      <w:pPr>
+        <w:rPr>
+          <w:rFonts w:ascii="Trebuchet MS" w:hAnsi="Trebuchet MS" w:cs="Trebuchet MS"/>
+        </w:rPr>
+      </w:pPr>
+    </w:p>
+    <w:p>
+      <w:pPr>
+        <w:rPr>
+          <w:rFonts w:ascii="Trebuchet MS" w:hAnsi="Trebuchet MS" w:cs="Trebuchet MS"/>
+          <w:i/>
+          <w:iCs/>
+        </w:rPr>
+      </w:pPr>
+      <w:r>
+        <w:rPr>
+          <w:rFonts w:ascii="Trebuchet MS" w:hAnsi="Trebuchet MS" w:cs="Trebuchet MS"/>
+        </w:rPr>
+        <w:t xml:space="preserve">10. </w:t>
+      </w:r>
+      <w:r>
+        <w:rPr>
+          <w:rFonts w:ascii="Trebuchet MS" w:hAnsi="Trebuchet MS" w:cs="Trebuchet MS"/>
+          <w:i/>
+          <w:iCs/>
+        </w:rPr>
+        <w:t>“</w:t>
+      </w:r>
+      <w:r>
+        <w:rPr>
+          <w:rFonts w:ascii="Trebuchet MS" w:hAnsi="Trebuchet MS" w:cs="Trebuchet MS"/>
+          <w:i/>
+          <w:iCs/>
+        </w:rPr>
+        <w:t xml:space="preserve">Modify task 3 to check that there is availability at that accommodation for that number of people on the specified date. Return an appropriate HTTP error code if there is no availability or if the date is in the </w:t>
+      </w:r>
+      <w:proofErr w:type="gramStart"/>
+      <w:r>
+        <w:rPr>
+          <w:rFonts w:ascii="Trebuchet MS" w:hAnsi="Trebuchet MS" w:cs="Trebuchet MS"/>
+          <w:i/>
+          <w:iCs/>
+        </w:rPr>
+        <w:t>past , and</w:t>
+      </w:r>
+      <w:proofErr w:type="gramEnd"/>
+      <w:r>
+        <w:rPr>
+          <w:rFonts w:ascii="Trebuchet MS" w:hAnsi="Trebuchet MS" w:cs="Trebuchet MS"/>
+          <w:i/>
+          <w:iCs/>
+        </w:rPr>
+        <w:t xml:space="preserve"> include the specific error within the JSON message sent back. Also, again modify task 5 to test the HTTP code returned from the server and display an appropriate user-friendly message to the user.</w:t>
+      </w:r>
+      <w:r>
+        <w:rPr>
+          <w:rFonts w:ascii="Trebuchet MS" w:hAnsi="Trebuchet MS" w:cs="Trebuchet MS"/>
+          <w:i/>
+          <w:iCs/>
+        </w:rPr>
+        <w:t>”</w:t>
+      </w:r>
+    </w:p>
+    <w:p>
+      <w:pPr>
+        <w:rPr>
+          <w:rFonts w:ascii="Trebuchet MS" w:hAnsi="Trebuchet MS" w:cs="Trebuchet MS"/>
+        </w:rPr>
+      </w:pPr>
+    </w:p>
+    <w:p>
+      <w:pPr>
+        <w:ind w:left="720"/>
+      </w:pPr>
+      <w:r>
+        <w:rPr>
+          <w:noProof/>
+        </w:rPr>
+        <w:drawing>
+          <wp:anchor distT="0" distB="0" distL="114300" distR="114300" simplePos="0" relativeHeight="251675648" behindDoc="0" locked="0" layoutInCell="1" allowOverlap="1" wp14:anchorId="42B1DB39" wp14:editId="06786D07">
+            <wp:simplePos x="0" y="0"/>
+            <wp:positionH relativeFrom="margin">
+              <wp:align>center</wp:align>
+            </wp:positionH>
+            <wp:positionV relativeFrom="paragraph">
+              <wp:posOffset>1453515</wp:posOffset>
+            </wp:positionV>
+            <wp:extent cx="6076950" cy="2105025"/>
+            <wp:effectExtent l="0" t="0" r="0" b="9525"/>
+            <wp:wrapTopAndBottom/>
+            <wp:docPr id="1229077931" name="Picture 1"/>
+            <wp:cNvGraphicFramePr>
+              <a:graphicFrameLocks xmlns:a="http://schemas.openxmlformats.org/drawingml/2006/main" noChangeAspect="1"/>
+            </wp:cNvGraphicFramePr>
+            <a:graphic xmlns:a="http://schemas.openxmlformats.org/drawingml/2006/main">
+              <a:graphicData uri="http://schemas.openxmlformats.org/drawingml/2006/picture">
+                <pic:pic xmlns:pic="http://schemas.openxmlformats.org/drawingml/2006/picture">
+                  <pic:nvPicPr>
+                    <pic:cNvPr id="1229077931" name=""/>
+                    <pic:cNvPicPr/>
+                  </pic:nvPicPr>
+                  <pic:blipFill>
+                    <a:blip r:embed="rId22">
+                      <a:extLst>
+                        <a:ext uri="{28A0092B-C50C-407E-A947-70E740481C1C}">
+                          <a14:useLocalDpi xmlns:a14="http://schemas.microsoft.com/office/drawing/2010/main" val="0"/>
+                        </a:ext>
+                      </a:extLst>
+                    </a:blip>
+                    <a:stretch>
+                      <a:fillRect/>
+                    </a:stretch>
+                  </pic:blipFill>
+                  <pic:spPr>
+                    <a:xfrm>
+                      <a:off x="0" y="0"/>
+                      <a:ext cx="6076950" cy="2105025"/>
+                    </a:xfrm>
+                    <a:prstGeom prst="rect">
+                      <a:avLst/>
+                    </a:prstGeom>
+                  </pic:spPr>
+                </pic:pic>
+              </a:graphicData>
+            </a:graphic>
+          </wp:anchor>
+        </w:drawing>
+      </w:r>
+      <w:r>
+        <w:t xml:space="preserve">I will start this task by adding a date checker to my booking route. This will check </w:t>
+      </w:r>
+      <w:r>
+        <w:t>whether the date is valid, i.e. it will check whether the date given is after todays date, as it should be impossible for someone to book an accommodation in the past.</w:t>
+      </w:r>
+      <w:r>
+        <w:t xml:space="preserve"> Since the dates in the database are in a non-standard format, I will also need to parse the dates so it can be used with the Date() method. To parse the </w:t>
+      </w:r>
+      <w:r>
+        <w:t>dates,</w:t>
+      </w:r>
+      <w:r>
+        <w:t xml:space="preserve"> I will need to use substrings which will extract the individual parts of the dates. This will then be compared with a new Date() being todays date. If the date given is after today’s date a HTML error is raised.</w:t>
+      </w:r>
+    </w:p>
+    <w:p>
+      <w:r>
+        <w:lastRenderedPageBreak/>
         <w:tab/>
       </w:r>
     </w:p>
-    <w:p/>
-    <w:p/>
-    <w:p/>
+    <w:p>
+      <w:pPr>
+        <w:ind w:left="720"/>
+      </w:pPr>
+      <w:r>
+        <w:rPr>
+          <w:noProof/>
+        </w:rPr>
+        <w:drawing>
+          <wp:anchor distT="0" distB="0" distL="114300" distR="114300" simplePos="0" relativeHeight="251676672" behindDoc="0" locked="0" layoutInCell="1" allowOverlap="1" wp14:anchorId="31ADA2B6" wp14:editId="61783B7A">
+            <wp:simplePos x="0" y="0"/>
+            <wp:positionH relativeFrom="margin">
+              <wp:align>right</wp:align>
+            </wp:positionH>
+            <wp:positionV relativeFrom="paragraph">
+              <wp:posOffset>1040130</wp:posOffset>
+            </wp:positionV>
+            <wp:extent cx="6858000" cy="1572260"/>
+            <wp:effectExtent l="0" t="0" r="0" b="8890"/>
+            <wp:wrapTopAndBottom/>
+            <wp:docPr id="1774811720" name="Picture 1"/>
+            <wp:cNvGraphicFramePr>
+              <a:graphicFrameLocks xmlns:a="http://schemas.openxmlformats.org/drawingml/2006/main" noChangeAspect="1"/>
+            </wp:cNvGraphicFramePr>
+            <a:graphic xmlns:a="http://schemas.openxmlformats.org/drawingml/2006/main">
+              <a:graphicData uri="http://schemas.openxmlformats.org/drawingml/2006/picture">
+                <pic:pic xmlns:pic="http://schemas.openxmlformats.org/drawingml/2006/picture">
+                  <pic:nvPicPr>
+                    <pic:cNvPr id="1774811720" name=""/>
+                    <pic:cNvPicPr/>
+                  </pic:nvPicPr>
+                  <pic:blipFill>
+                    <a:blip r:embed="rId23">
+                      <a:extLst>
+                        <a:ext uri="{28A0092B-C50C-407E-A947-70E740481C1C}">
+                          <a14:useLocalDpi xmlns:a14="http://schemas.microsoft.com/office/drawing/2010/main" val="0"/>
+                        </a:ext>
+                      </a:extLst>
+                    </a:blip>
+                    <a:stretch>
+                      <a:fillRect/>
+                    </a:stretch>
+                  </pic:blipFill>
+                  <pic:spPr>
+                    <a:xfrm>
+                      <a:off x="0" y="0"/>
+                      <a:ext cx="6858000" cy="1572260"/>
+                    </a:xfrm>
+                    <a:prstGeom prst="rect">
+                      <a:avLst/>
+                    </a:prstGeom>
+                  </pic:spPr>
+                </pic:pic>
+              </a:graphicData>
+            </a:graphic>
+          </wp:anchor>
+        </w:drawing>
+      </w:r>
+      <w:r>
+        <w:t>I will next add the availability checker</w:t>
+      </w:r>
+      <w:r>
+        <w:t>. This will use a prepared statement to find the number of availabilities left</w:t>
+      </w:r>
+      <w:r>
+        <w:t xml:space="preserve"> using the </w:t>
+      </w:r>
+      <w:proofErr w:type="spellStart"/>
+      <w:r>
+        <w:t>accID</w:t>
+      </w:r>
+      <w:proofErr w:type="spellEnd"/>
+      <w:r>
+        <w:t xml:space="preserve">. I will then compare the amount of people on the booking to the number of availabilities left, if there are more people than there are bookings a HTML error is then raised. The database obviously doesn’t contain </w:t>
+      </w:r>
+      <w:r>
+        <w:rPr>
+          <w:i/>
+          <w:iCs/>
+        </w:rPr>
+        <w:t>all</w:t>
+      </w:r>
+      <w:r>
+        <w:t xml:space="preserve"> future dates so I will also add a checker to make sure that there </w:t>
+      </w:r>
+      <w:r>
+        <w:t>are</w:t>
+      </w:r>
+      <w:r>
+        <w:t xml:space="preserve"> availabilit</w:t>
+      </w:r>
+      <w:r>
+        <w:t>ies</w:t>
+      </w:r>
+      <w:r>
+        <w:t xml:space="preserve"> </w:t>
+      </w:r>
+      <w:r>
+        <w:t>for the dates specifically within the database.</w:t>
+      </w:r>
+    </w:p>
+    <w:p>
+      <w:pPr>
+        <w:ind w:left="720"/>
+      </w:pPr>
+    </w:p>
+    <w:p>
+      <w:pPr>
+        <w:ind w:left="720"/>
+      </w:pPr>
+    </w:p>
+    <w:p>
+      <w:pPr>
+        <w:ind w:left="720"/>
+      </w:pPr>
+      <w:r>
+        <w:t>To finalise these changes</w:t>
+      </w:r>
+      <w:r>
+        <w:t>,</w:t>
+      </w:r>
+      <w:r>
+        <w:t xml:space="preserve"> </w:t>
+      </w:r>
+      <w:r>
+        <w:t xml:space="preserve">I will next add onto my </w:t>
+      </w:r>
+      <w:proofErr w:type="spellStart"/>
+      <w:r>
+        <w:t>ResultsComponents</w:t>
+      </w:r>
+      <w:proofErr w:type="spellEnd"/>
+      <w:r>
+        <w:t xml:space="preserve"> response status checker. Since I have use multiple errors for the same error code, I plan to change the message that is show on response to a 400 ERROR to include the specific error that had occurred using </w:t>
+      </w:r>
+      <w:proofErr w:type="spellStart"/>
+      <w:r>
+        <w:t>json.error</w:t>
+      </w:r>
+      <w:proofErr w:type="spellEnd"/>
+      <w:r>
+        <w:t>. This will show the user specifically what had caused the error.</w:t>
+      </w:r>
+    </w:p>
+    <w:p>
+      <w:pPr>
+        <w:ind w:left="720"/>
+      </w:pPr>
+      <w:r>
+        <w:rPr>
+          <w:noProof/>
+        </w:rPr>
+        <w:drawing>
+          <wp:anchor distT="0" distB="0" distL="114300" distR="114300" simplePos="0" relativeHeight="251677696" behindDoc="0" locked="0" layoutInCell="1" allowOverlap="1" wp14:anchorId="10F62EE5" wp14:editId="075F15F9">
+            <wp:simplePos x="0" y="0"/>
+            <wp:positionH relativeFrom="margin">
+              <wp:align>center</wp:align>
+            </wp:positionH>
+            <wp:positionV relativeFrom="paragraph">
+              <wp:posOffset>190500</wp:posOffset>
+            </wp:positionV>
+            <wp:extent cx="6010275" cy="2358390"/>
+            <wp:effectExtent l="0" t="0" r="9525" b="3810"/>
+            <wp:wrapTopAndBottom/>
+            <wp:docPr id="1865240964" name="Picture 1"/>
+            <wp:cNvGraphicFramePr>
+              <a:graphicFrameLocks xmlns:a="http://schemas.openxmlformats.org/drawingml/2006/main" noChangeAspect="1"/>
+            </wp:cNvGraphicFramePr>
+            <a:graphic xmlns:a="http://schemas.openxmlformats.org/drawingml/2006/main">
+              <a:graphicData uri="http://schemas.openxmlformats.org/drawingml/2006/picture">
+                <pic:pic xmlns:pic="http://schemas.openxmlformats.org/drawingml/2006/picture">
+                  <pic:nvPicPr>
+                    <pic:cNvPr id="1865240964" name=""/>
+                    <pic:cNvPicPr/>
+                  </pic:nvPicPr>
+                  <pic:blipFill>
+                    <a:blip r:embed="rId24">
+                      <a:extLst>
+                        <a:ext uri="{28A0092B-C50C-407E-A947-70E740481C1C}">
+                          <a14:useLocalDpi xmlns:a14="http://schemas.microsoft.com/office/drawing/2010/main" val="0"/>
+                        </a:ext>
+                      </a:extLst>
+                    </a:blip>
+                    <a:stretch>
+                      <a:fillRect/>
+                    </a:stretch>
+                  </pic:blipFill>
+                  <pic:spPr>
+                    <a:xfrm>
+                      <a:off x="0" y="0"/>
+                      <a:ext cx="6010275" cy="2358390"/>
+                    </a:xfrm>
+                    <a:prstGeom prst="rect">
+                      <a:avLst/>
+                    </a:prstGeom>
+                  </pic:spPr>
+                </pic:pic>
+              </a:graphicData>
+            </a:graphic>
+            <wp14:sizeRelH relativeFrom="margin">
+              <wp14:pctWidth>0</wp14:pctWidth>
+            </wp14:sizeRelH>
+            <wp14:sizeRelV relativeFrom="margin">
+              <wp14:pctHeight>0</wp14:pctHeight>
+            </wp14:sizeRelV>
+          </wp:anchor>
+        </w:drawing>
+      </w:r>
+      <w:r>
+        <w:t xml:space="preserve"> </w:t>
+      </w:r>
+    </w:p>
+    <w:p>
+      <w:pPr>
+        <w:ind w:left="720"/>
+      </w:pPr>
+    </w:p>
+    <w:p>
+      <w:pPr>
+        <w:ind w:left="720"/>
+      </w:pPr>
+      <w:r>
+        <w:rPr>
+          <w:noProof/>
+        </w:rPr>
+        <w:drawing>
+          <wp:anchor distT="0" distB="0" distL="114300" distR="114300" simplePos="0" relativeHeight="251678720" behindDoc="0" locked="0" layoutInCell="1" allowOverlap="1" wp14:anchorId="45BFFFEC" wp14:editId="1A905E00">
+            <wp:simplePos x="0" y="0"/>
+            <wp:positionH relativeFrom="margin">
+              <wp:align>center</wp:align>
+            </wp:positionH>
+            <wp:positionV relativeFrom="paragraph">
+              <wp:posOffset>787400</wp:posOffset>
+            </wp:positionV>
+            <wp:extent cx="3686175" cy="419100"/>
+            <wp:effectExtent l="0" t="0" r="9525" b="0"/>
+            <wp:wrapTopAndBottom/>
+            <wp:docPr id="1453880430" name="Picture 1"/>
+            <wp:cNvGraphicFramePr>
+              <a:graphicFrameLocks xmlns:a="http://schemas.openxmlformats.org/drawingml/2006/main" noChangeAspect="1"/>
+            </wp:cNvGraphicFramePr>
+            <a:graphic xmlns:a="http://schemas.openxmlformats.org/drawingml/2006/main">
+              <a:graphicData uri="http://schemas.openxmlformats.org/drawingml/2006/picture">
+                <pic:pic xmlns:pic="http://schemas.openxmlformats.org/drawingml/2006/picture">
+                  <pic:nvPicPr>
+                    <pic:cNvPr id="1453880430" name=""/>
+                    <pic:cNvPicPr/>
+                  </pic:nvPicPr>
+                  <pic:blipFill>
+                    <a:blip r:embed="rId25">
+                      <a:extLst>
+                        <a:ext uri="{28A0092B-C50C-407E-A947-70E740481C1C}">
+                          <a14:useLocalDpi xmlns:a14="http://schemas.microsoft.com/office/drawing/2010/main" val="0"/>
+                        </a:ext>
+                      </a:extLst>
+                    </a:blip>
+                    <a:stretch>
+                      <a:fillRect/>
+                    </a:stretch>
+                  </pic:blipFill>
+                  <pic:spPr>
+                    <a:xfrm>
+                      <a:off x="0" y="0"/>
+                      <a:ext cx="3686175" cy="419100"/>
+                    </a:xfrm>
+                    <a:prstGeom prst="rect">
+                      <a:avLst/>
+                    </a:prstGeom>
+                  </pic:spPr>
+                </pic:pic>
+              </a:graphicData>
+            </a:graphic>
+          </wp:anchor>
+        </w:drawing>
+      </w:r>
+      <w:r>
+        <w:t>At this stage I had not yet added an input for the user to set how many people would be on the booking</w:t>
+      </w:r>
+      <w:r>
+        <w:t xml:space="preserve"> or when the booking would be for</w:t>
+      </w:r>
+      <w:r>
+        <w:t xml:space="preserve">. I will now implement this at this stage to help with testing. </w:t>
+      </w:r>
+      <w:r>
+        <w:t xml:space="preserve">I will simply do this by adding two new state variables to my </w:t>
+      </w:r>
+      <w:proofErr w:type="spellStart"/>
+      <w:r>
+        <w:t>ResultsComponent</w:t>
+      </w:r>
+      <w:proofErr w:type="spellEnd"/>
+      <w:r>
+        <w:t xml:space="preserve">, one for the number of people and another for the date of the booking. </w:t>
+      </w:r>
+    </w:p>
+    <w:p>
+      <w:pPr>
+        <w:ind w:left="720"/>
+      </w:pPr>
+    </w:p>
+    <w:p>
+      <w:pPr>
+        <w:ind w:left="720"/>
+      </w:pPr>
+    </w:p>
+    <w:p>
+      <w:pPr>
+        <w:ind w:left="720"/>
+      </w:pPr>
+    </w:p>
+    <w:p>
+      <w:pPr>
+        <w:ind w:left="720"/>
+      </w:pPr>
+    </w:p>
+    <w:p>
+      <w:pPr>
+        <w:ind w:left="720"/>
+      </w:pPr>
+    </w:p>
+    <w:p>
+      <w:pPr>
+        <w:ind w:left="720"/>
+      </w:pPr>
+    </w:p>
+    <w:p>
+      <w:pPr>
+        <w:ind w:left="720"/>
+      </w:pPr>
+    </w:p>
+    <w:p>
+      <w:pPr>
+        <w:ind w:left="720"/>
+      </w:pPr>
+      <w:r>
+        <w:rPr>
+          <w:noProof/>
+        </w:rPr>
+        <w:lastRenderedPageBreak/>
+        <w:drawing>
+          <wp:anchor distT="0" distB="0" distL="114300" distR="114300" simplePos="0" relativeHeight="251679744" behindDoc="0" locked="0" layoutInCell="1" allowOverlap="1" wp14:anchorId="703A30A4" wp14:editId="67D090E1">
+            <wp:simplePos x="0" y="0"/>
+            <wp:positionH relativeFrom="margin">
+              <wp:align>center</wp:align>
+            </wp:positionH>
+            <wp:positionV relativeFrom="paragraph">
+              <wp:posOffset>1152525</wp:posOffset>
+            </wp:positionV>
+            <wp:extent cx="4791075" cy="3124200"/>
+            <wp:effectExtent l="0" t="0" r="9525" b="0"/>
+            <wp:wrapTopAndBottom/>
+            <wp:docPr id="318966284" name="Picture 1"/>
+            <wp:cNvGraphicFramePr>
+              <a:graphicFrameLocks xmlns:a="http://schemas.openxmlformats.org/drawingml/2006/main" noChangeAspect="1"/>
+            </wp:cNvGraphicFramePr>
+            <a:graphic xmlns:a="http://schemas.openxmlformats.org/drawingml/2006/main">
+              <a:graphicData uri="http://schemas.openxmlformats.org/drawingml/2006/picture">
+                <pic:pic xmlns:pic="http://schemas.openxmlformats.org/drawingml/2006/picture">
+                  <pic:nvPicPr>
+                    <pic:cNvPr id="318966284" name=""/>
+                    <pic:cNvPicPr/>
+                  </pic:nvPicPr>
+                  <pic:blipFill>
+                    <a:blip r:embed="rId26">
+                      <a:extLst>
+                        <a:ext uri="{28A0092B-C50C-407E-A947-70E740481C1C}">
+                          <a14:useLocalDpi xmlns:a14="http://schemas.microsoft.com/office/drawing/2010/main" val="0"/>
+                        </a:ext>
+                      </a:extLst>
+                    </a:blip>
+                    <a:stretch>
+                      <a:fillRect/>
+                    </a:stretch>
+                  </pic:blipFill>
+                  <pic:spPr>
+                    <a:xfrm>
+                      <a:off x="0" y="0"/>
+                      <a:ext cx="4791075" cy="3124200"/>
+                    </a:xfrm>
+                    <a:prstGeom prst="rect">
+                      <a:avLst/>
+                    </a:prstGeom>
+                  </pic:spPr>
+                </pic:pic>
+              </a:graphicData>
+            </a:graphic>
+          </wp:anchor>
+        </w:drawing>
+      </w:r>
+      <w:r>
+        <w:t xml:space="preserve">I will then add the inputs to the returned HTML of my </w:t>
+      </w:r>
+      <w:proofErr w:type="spellStart"/>
+      <w:r>
+        <w:t>ResultsComponent</w:t>
+      </w:r>
+      <w:proofErr w:type="spellEnd"/>
+      <w:r>
+        <w:t>. These will both be labelled with the appropriate titles. I will set the type of the number of people input to “number”; this prevents the user from inputting anything other than a number. With this, I can also set the minimum amount to one, which will prevent the user from attempting to book with a negative or zero number. I will also need to parse the input to an integer as this matches the database. For the date, I will use the “date” type to allow for an easy input for the user which will also prevent any non-numbers from being used.</w:t>
+      </w:r>
+    </w:p>
+    <w:p>
+      <w:pPr>
+        <w:ind w:left="720"/>
+      </w:pPr>
+    </w:p>
+    <w:p>
+      <w:pPr>
+        <w:ind w:left="720"/>
+      </w:pPr>
+      <w:r>
+        <w:rPr>
+          <w:noProof/>
+        </w:rPr>
+        <w:drawing>
+          <wp:anchor distT="0" distB="0" distL="114300" distR="114300" simplePos="0" relativeHeight="251680768" behindDoc="0" locked="0" layoutInCell="1" allowOverlap="1" wp14:anchorId="7FB01277" wp14:editId="7224BB98">
+            <wp:simplePos x="0" y="0"/>
+            <wp:positionH relativeFrom="margin">
+              <wp:align>center</wp:align>
+            </wp:positionH>
+            <wp:positionV relativeFrom="paragraph">
+              <wp:posOffset>1339215</wp:posOffset>
+            </wp:positionV>
+            <wp:extent cx="3895725" cy="1495425"/>
+            <wp:effectExtent l="0" t="0" r="9525" b="9525"/>
+            <wp:wrapTopAndBottom/>
+            <wp:docPr id="876033306" name="Picture 1"/>
+            <wp:cNvGraphicFramePr>
+              <a:graphicFrameLocks xmlns:a="http://schemas.openxmlformats.org/drawingml/2006/main" noChangeAspect="1"/>
+            </wp:cNvGraphicFramePr>
+            <a:graphic xmlns:a="http://schemas.openxmlformats.org/drawingml/2006/main">
+              <a:graphicData uri="http://schemas.openxmlformats.org/drawingml/2006/picture">
+                <pic:pic xmlns:pic="http://schemas.openxmlformats.org/drawingml/2006/picture">
+                  <pic:nvPicPr>
+                    <pic:cNvPr id="876033306" name=""/>
+                    <pic:cNvPicPr/>
+                  </pic:nvPicPr>
+                  <pic:blipFill>
+                    <a:blip r:embed="rId27">
+                      <a:extLst>
+                        <a:ext uri="{28A0092B-C50C-407E-A947-70E740481C1C}">
+                          <a14:useLocalDpi xmlns:a14="http://schemas.microsoft.com/office/drawing/2010/main" val="0"/>
+                        </a:ext>
+                      </a:extLst>
+                    </a:blip>
+                    <a:stretch>
+                      <a:fillRect/>
+                    </a:stretch>
+                  </pic:blipFill>
+                  <pic:spPr>
+                    <a:xfrm>
+                      <a:off x="0" y="0"/>
+                      <a:ext cx="3895725" cy="1495425"/>
+                    </a:xfrm>
+                    <a:prstGeom prst="rect">
+                      <a:avLst/>
+                    </a:prstGeom>
+                  </pic:spPr>
+                </pic:pic>
+              </a:graphicData>
+            </a:graphic>
+          </wp:anchor>
+        </w:drawing>
+      </w:r>
+      <w:r>
+        <w:t xml:space="preserve">Now to reflect these changes, I will need to change my hard coded number of people and date in my </w:t>
+      </w:r>
+      <w:proofErr w:type="spellStart"/>
+      <w:r>
+        <w:t>bookAccommodation</w:t>
+      </w:r>
+      <w:proofErr w:type="spellEnd"/>
+      <w:r>
+        <w:t xml:space="preserve"> function. For the date specifically, I will need to use the replace() method to remove the dashes from the return date from the HTML. This is because using the “date” type in HTML returns the date using dashes (</w:t>
+      </w:r>
+      <w:r>
+        <w:t>2026</w:t>
+      </w:r>
+      <w:r>
+        <w:t>-</w:t>
+      </w:r>
+      <w:r>
+        <w:t>22</w:t>
+      </w:r>
+      <w:r>
+        <w:t>-</w:t>
+      </w:r>
+      <w:r>
+        <w:t>04</w:t>
+      </w:r>
+      <w:r>
+        <w:t xml:space="preserve"> instead of </w:t>
+      </w:r>
+      <w:r>
+        <w:t>20262204</w:t>
+      </w:r>
+      <w:r>
+        <w:t>) instead of without like the database. The date is also returned with the full year (2026 instead of 26)</w:t>
+      </w:r>
+      <w:r>
+        <w:t xml:space="preserve"> unlike the database. To correct this, I will use a substring() to remove the first two digits, being 20, to make the posted date match the database’s.</w:t>
+      </w:r>
+    </w:p>
+    <w:p>
+      <w:pPr>
+        <w:ind w:left="720"/>
+      </w:pPr>
+    </w:p>
+    <w:p>
+      <w:pPr>
+        <w:ind w:left="720"/>
+      </w:pPr>
+    </w:p>
+    <w:p>
+      <w:pPr>
+        <w:ind w:left="720"/>
+      </w:pPr>
+    </w:p>
     <w:sectPr>
       <w:pgSz w:w="12240" w:h="15840"/>
       <w:pgMar w:top="720" w:right="720" w:bottom="720" w:left="720" w:header="720" w:footer="720" w:gutter="0"/>

</xml_diff>

<commit_message>
updated code for hashed passwords and added readme file for instructions
</commit_message>
<xml_diff>
--- a/WAD_Report.docx
+++ b/WAD_Report.docx
@@ -326,10 +326,17 @@
     <w:p/>
     <w:p/>
     <w:p/>
+    <w:p/>
+    <w:p/>
+    <w:p/>
+    <w:p/>
+    <w:p/>
+    <w:p/>
     <w:p>
       <w:pPr>
         <w:pStyle w:val="Heading1"/>
         <w:spacing w:before="0" w:after="240"/>
+        <w:jc w:val="center"/>
         <w:rPr>
           <w:rFonts w:ascii="Trebuchet MS" w:eastAsia="Trebuchet MS" w:hAnsi="Trebuchet MS" w:cs="Trebuchet MS"/>
           <w:b/>
@@ -340,6 +347,16 @@
       <w:bookmarkStart w:id="4" w:name="_kuiu5rdksvnj" w:colFirst="0" w:colLast="0"/>
       <w:bookmarkEnd w:id="3"/>
       <w:bookmarkEnd w:id="4"/>
+      <w:r>
+        <w:rPr>
+          <w:rFonts w:ascii="Trebuchet MS" w:eastAsia="Trebuchet MS" w:hAnsi="Trebuchet MS" w:cs="Trebuchet MS"/>
+          <w:b/>
+          <w:bCs/>
+          <w:highlight w:val="yellow"/>
+        </w:rPr>
+        <w:lastRenderedPageBreak/>
+        <w:t>Logins and How to Run in Readme.md</w:t>
+      </w:r>
     </w:p>
     <w:p>
       <w:pPr>
@@ -415,13 +432,27 @@
         <w:rPr>
           <w:rFonts w:ascii="Trebuchet MS" w:eastAsia="Trebuchet MS" w:hAnsi="Trebuchet MS" w:cs="Trebuchet MS"/>
         </w:rPr>
-        <w:t xml:space="preserve">For this first task, I will create a simple GET endpoint at /accommodation/location/:location. The location will be taken as a URL parameter and passed into a prepared statement querying the accommodation table of the given database. This should then return the full result set as JSON, and because it's a GET </w:t>
+        <w:t>For this first task, I will create a simple GET endpoint at /accommodation/location</w:t>
       </w:r>
       <w:proofErr w:type="gramStart"/>
       <w:r>
         <w:rPr>
           <w:rFonts w:ascii="Trebuchet MS" w:eastAsia="Trebuchet MS" w:hAnsi="Trebuchet MS" w:cs="Trebuchet MS"/>
         </w:rPr>
+        <w:t>/:location</w:t>
+      </w:r>
+      <w:proofErr w:type="gramEnd"/>
+      <w:r>
+        <w:rPr>
+          <w:rFonts w:ascii="Trebuchet MS" w:eastAsia="Trebuchet MS" w:hAnsi="Trebuchet MS" w:cs="Trebuchet MS"/>
+        </w:rPr>
+        <w:t xml:space="preserve">. The location will be taken as a URL parameter and passed into a prepared statement querying the accommodation table of the given database. This should then return the full result set as JSON, and because it's a GET </w:t>
+      </w:r>
+      <w:proofErr w:type="gramStart"/>
+      <w:r>
+        <w:rPr>
+          <w:rFonts w:ascii="Trebuchet MS" w:eastAsia="Trebuchet MS" w:hAnsi="Trebuchet MS" w:cs="Trebuchet MS"/>
+        </w:rPr>
         <w:t>request</w:t>
       </w:r>
       <w:proofErr w:type="gramEnd"/>
@@ -429,7 +460,35 @@
         <w:rPr>
           <w:rFonts w:ascii="Trebuchet MS" w:eastAsia="Trebuchet MS" w:hAnsi="Trebuchet MS" w:cs="Trebuchet MS"/>
         </w:rPr>
-        <w:t xml:space="preserve"> I can then test it directly in the browser. I will finally contain this in a try{} and catch{} statement so if the GET request results in an error, the error will be returned in place of the JSON from the database.</w:t>
+        <w:t xml:space="preserve"> I can then test it directly in the browser. I will finally contain this in a </w:t>
+      </w:r>
+      <w:proofErr w:type="gramStart"/>
+      <w:r>
+        <w:rPr>
+          <w:rFonts w:ascii="Trebuchet MS" w:eastAsia="Trebuchet MS" w:hAnsi="Trebuchet MS" w:cs="Trebuchet MS"/>
+        </w:rPr>
+        <w:t>try{</w:t>
+      </w:r>
+      <w:proofErr w:type="gramEnd"/>
+      <w:r>
+        <w:rPr>
+          <w:rFonts w:ascii="Trebuchet MS" w:eastAsia="Trebuchet MS" w:hAnsi="Trebuchet MS" w:cs="Trebuchet MS"/>
+        </w:rPr>
+        <w:t xml:space="preserve">} and </w:t>
+      </w:r>
+      <w:proofErr w:type="gramStart"/>
+      <w:r>
+        <w:rPr>
+          <w:rFonts w:ascii="Trebuchet MS" w:eastAsia="Trebuchet MS" w:hAnsi="Trebuchet MS" w:cs="Trebuchet MS"/>
+        </w:rPr>
+        <w:t>catch{</w:t>
+      </w:r>
+      <w:proofErr w:type="gramEnd"/>
+      <w:r>
+        <w:rPr>
+          <w:rFonts w:ascii="Trebuchet MS" w:eastAsia="Trebuchet MS" w:hAnsi="Trebuchet MS" w:cs="Trebuchet MS"/>
+        </w:rPr>
+        <w:t>} statement so if the GET request results in an error, the error will be returned in place of the JSON from the database.</w:t>
       </w:r>
       <w:r>
         <w:rPr>
@@ -542,7 +601,35 @@
         <w:rPr>
           <w:rFonts w:ascii="Trebuchet MS" w:eastAsia="Trebuchet MS" w:hAnsi="Trebuchet MS" w:cs="Trebuchet MS"/>
         </w:rPr>
-        <w:t xml:space="preserve">For Task 2, I will add a second GET endpoint at /accommodation/location/:location/type/:type. By using two URL parameters for the location and type, both parameters will then feed into a single prepared statement filtering using both the location and </w:t>
+        <w:t>For Task 2, I will add a second GET endpoint at /accommodation/location</w:t>
+      </w:r>
+      <w:proofErr w:type="gramStart"/>
+      <w:r>
+        <w:rPr>
+          <w:rFonts w:ascii="Trebuchet MS" w:eastAsia="Trebuchet MS" w:hAnsi="Trebuchet MS" w:cs="Trebuchet MS"/>
+        </w:rPr>
+        <w:t>/:location</w:t>
+      </w:r>
+      <w:proofErr w:type="gramEnd"/>
+      <w:r>
+        <w:rPr>
+          <w:rFonts w:ascii="Trebuchet MS" w:eastAsia="Trebuchet MS" w:hAnsi="Trebuchet MS" w:cs="Trebuchet MS"/>
+        </w:rPr>
+        <w:t>/type</w:t>
+      </w:r>
+      <w:proofErr w:type="gramStart"/>
+      <w:r>
+        <w:rPr>
+          <w:rFonts w:ascii="Trebuchet MS" w:eastAsia="Trebuchet MS" w:hAnsi="Trebuchet MS" w:cs="Trebuchet MS"/>
+        </w:rPr>
+        <w:t>/:type</w:t>
+      </w:r>
+      <w:proofErr w:type="gramEnd"/>
+      <w:r>
+        <w:rPr>
+          <w:rFonts w:ascii="Trebuchet MS" w:eastAsia="Trebuchet MS" w:hAnsi="Trebuchet MS" w:cs="Trebuchet MS"/>
+        </w:rPr>
+        <w:t xml:space="preserve">. By using two URL parameters for the location and type, both parameters will then feed into a single prepared statement filtering using both the location and </w:t>
       </w:r>
       <w:proofErr w:type="spellStart"/>
       <w:r>
@@ -719,6 +806,7 @@
         <w:t xml:space="preserve">, inside a </w:t>
       </w:r>
       <w:proofErr w:type="spellStart"/>
+      <w:proofErr w:type="gramStart"/>
       <w:r>
         <w:rPr>
           <w:rFonts w:ascii="Trebuchet MS" w:eastAsia="Trebuchet MS" w:hAnsi="Trebuchet MS" w:cs="Trebuchet MS"/>
@@ -726,11 +814,40 @@
         <w:t>db.transaction</w:t>
       </w:r>
       <w:proofErr w:type="spellEnd"/>
-      <w:r>
-        <w:rPr>
-          <w:rFonts w:ascii="Trebuchet MS" w:eastAsia="Trebuchet MS" w:hAnsi="Trebuchet MS" w:cs="Trebuchet MS"/>
-        </w:rPr>
-        <w:t>(). This will make sure that both operations will either succeed or fail together, this would prevent one change happening without the other in the event of an error which would make the database inaccurate. I will then test the endpoint using the Thunder Client. Like the previous tasks I will also wrap this inside a try{} and catch{} statement.</w:t>
+      <w:proofErr w:type="gramEnd"/>
+      <w:r>
+        <w:rPr>
+          <w:rFonts w:ascii="Trebuchet MS" w:eastAsia="Trebuchet MS" w:hAnsi="Trebuchet MS" w:cs="Trebuchet MS"/>
+        </w:rPr>
+        <w:t xml:space="preserve">(). This will make sure that both operations will either succeed or fail together, this would prevent one change happening without the other in the event of an error which would make the database inaccurate. I will then test the endpoint using the Thunder Client. Like the previous tasks I will also wrap this inside a </w:t>
+      </w:r>
+      <w:proofErr w:type="gramStart"/>
+      <w:r>
+        <w:rPr>
+          <w:rFonts w:ascii="Trebuchet MS" w:eastAsia="Trebuchet MS" w:hAnsi="Trebuchet MS" w:cs="Trebuchet MS"/>
+        </w:rPr>
+        <w:t>try{</w:t>
+      </w:r>
+      <w:proofErr w:type="gramEnd"/>
+      <w:r>
+        <w:rPr>
+          <w:rFonts w:ascii="Trebuchet MS" w:eastAsia="Trebuchet MS" w:hAnsi="Trebuchet MS" w:cs="Trebuchet MS"/>
+        </w:rPr>
+        <w:t xml:space="preserve">} and </w:t>
+      </w:r>
+      <w:proofErr w:type="gramStart"/>
+      <w:r>
+        <w:rPr>
+          <w:rFonts w:ascii="Trebuchet MS" w:eastAsia="Trebuchet MS" w:hAnsi="Trebuchet MS" w:cs="Trebuchet MS"/>
+        </w:rPr>
+        <w:t>catch{</w:t>
+      </w:r>
+      <w:proofErr w:type="gramEnd"/>
+      <w:r>
+        <w:rPr>
+          <w:rFonts w:ascii="Trebuchet MS" w:eastAsia="Trebuchet MS" w:hAnsi="Trebuchet MS" w:cs="Trebuchet MS"/>
+        </w:rPr>
+        <w:t>} statement.</w:t>
       </w:r>
       <w:r>
         <w:rPr>
@@ -1262,7 +1379,21 @@
         <w:rPr>
           <w:rFonts w:ascii="Trebuchet MS" w:eastAsia="Trebuchet MS" w:hAnsi="Trebuchet MS" w:cs="Trebuchet MS"/>
         </w:rPr>
-        <w:t xml:space="preserve"> I will create will manage its own location input state. When the user clicks Search, it will fire an async fetch to /accommodation/location/:location and pass the parsed JSON up to App via the </w:t>
+        <w:t xml:space="preserve"> I will create will manage its own location input state. When the user clicks Search, it will fire an async fetch to /accommodation/location</w:t>
+      </w:r>
+      <w:proofErr w:type="gramStart"/>
+      <w:r>
+        <w:rPr>
+          <w:rFonts w:ascii="Trebuchet MS" w:eastAsia="Trebuchet MS" w:hAnsi="Trebuchet MS" w:cs="Trebuchet MS"/>
+        </w:rPr>
+        <w:t>/:location</w:t>
+      </w:r>
+      <w:proofErr w:type="gramEnd"/>
+      <w:r>
+        <w:rPr>
+          <w:rFonts w:ascii="Trebuchet MS" w:eastAsia="Trebuchet MS" w:hAnsi="Trebuchet MS" w:cs="Trebuchet MS"/>
+        </w:rPr>
+        <w:t xml:space="preserve"> and pass the parsed JSON up to App via the </w:t>
       </w:r>
       <w:proofErr w:type="spellStart"/>
       <w:r>
@@ -3109,15 +3240,7 @@
           <w:i/>
           <w:iCs/>
         </w:rPr>
-        <w:t>“</w:t>
-      </w:r>
-      <w:r>
-        <w:rPr>
-          <w:rFonts w:ascii="Trebuchet MS" w:hAnsi="Trebuchet MS" w:cs="Trebuchet MS"/>
-          <w:i/>
-          <w:iCs/>
-        </w:rPr>
-        <w:t xml:space="preserve">Modify task 3 to check that there is availability at that accommodation for that number of people on the specified date. Return an appropriate HTTP error code if there is no availability or if the date is in the </w:t>
+        <w:t xml:space="preserve">“Modify task 3 to check that there is availability at that accommodation for that number of people on the specified date. Return an appropriate HTTP error code if there is no availability or if the date is in the </w:t>
       </w:r>
       <w:proofErr w:type="gramStart"/>
       <w:r>
@@ -3126,7 +3249,7 @@
           <w:i/>
           <w:iCs/>
         </w:rPr>
-        <w:t>past , and</w:t>
+        <w:t>past ,</w:t>
       </w:r>
       <w:proofErr w:type="gramEnd"/>
       <w:r>
@@ -3135,15 +3258,7 @@
           <w:i/>
           <w:iCs/>
         </w:rPr>
-        <w:t xml:space="preserve"> include the specific error within the JSON message sent back. Also, again modify task 5 to test the HTTP code returned from the server and display an appropriate user-friendly message to the user.</w:t>
-      </w:r>
-      <w:r>
-        <w:rPr>
-          <w:rFonts w:ascii="Trebuchet MS" w:hAnsi="Trebuchet MS" w:cs="Trebuchet MS"/>
-          <w:i/>
-          <w:iCs/>
-        </w:rPr>
-        <w:t>”</w:t>
+        <w:t xml:space="preserve"> and include the specific error within the JSON message sent back. Also, again modify task 5 to test the HTTP code returned from the server and display an appropriate user-friendly message to the user.”</w:t>
       </w:r>
     </w:p>
     <w:p>
@@ -3218,13 +3333,29 @@
         <w:t>whether the date is valid, i.e. it will check whether the date given is after todays date, as it should be impossible for someone to book an accommodation in the past.</w:t>
       </w:r>
       <w:r>
-        <w:t xml:space="preserve"> Since the dates in the database are in a non-standard format, I will also need to parse the dates so it can be used with the Date() method. To parse the </w:t>
+        <w:t xml:space="preserve"> Since the dates in the database are in a non-standard format, I will also need to parse the dates so it can be used with the </w:t>
+      </w:r>
+      <w:proofErr w:type="gramStart"/>
+      <w:r>
+        <w:t>Date(</w:t>
+      </w:r>
+      <w:proofErr w:type="gramEnd"/>
+      <w:r>
+        <w:t xml:space="preserve">) method. To parse the </w:t>
       </w:r>
       <w:r>
         <w:t>dates,</w:t>
       </w:r>
       <w:r>
-        <w:t xml:space="preserve"> I will need to use substrings which will extract the individual parts of the dates. This will then be compared with a new Date() being todays date. If the date given is after today’s date a HTML error is raised.</w:t>
+        <w:t xml:space="preserve"> I will need to use substrings which will extract the individual parts of the dates. This will then be compared with a new </w:t>
+      </w:r>
+      <w:proofErr w:type="gramStart"/>
+      <w:r>
+        <w:t>Date(</w:t>
+      </w:r>
+      <w:proofErr w:type="gramEnd"/>
+      <w:r>
+        <w:t>) being todays date. If the date given is after today’s date a HTML error is raised.</w:t>
       </w:r>
     </w:p>
     <w:p>
@@ -3369,10 +3500,12 @@
         <w:t xml:space="preserve"> response status checker. Since I have use multiple errors for the same error code, I plan to change the message that is show on response to a 400 ERROR to include the specific error that had occurred using </w:t>
       </w:r>
       <w:proofErr w:type="spellStart"/>
+      <w:proofErr w:type="gramStart"/>
       <w:r>
         <w:t>json.error</w:t>
       </w:r>
       <w:proofErr w:type="spellEnd"/>
+      <w:proofErr w:type="gramEnd"/>
       <w:r>
         <w:t>. This will show the user specifically what had caused the error.</w:t>
       </w:r>
@@ -3707,7 +3840,15 @@
       </w:r>
       <w:proofErr w:type="spellEnd"/>
       <w:r>
-        <w:t xml:space="preserve"> function. For the date specifically, I will need to use the replace() method to remove the dashes from the return date from the HTML. This is because using the “date” type in HTML returns the date using dashes (</w:t>
+        <w:t xml:space="preserve"> function. For the date specifically, I will need to use the </w:t>
+      </w:r>
+      <w:proofErr w:type="gramStart"/>
+      <w:r>
+        <w:t>replace(</w:t>
+      </w:r>
+      <w:proofErr w:type="gramEnd"/>
+      <w:r>
+        <w:t>) method to remove the dashes from the return date from the HTML. This is because using the “date” type in HTML returns the date using dashes (</w:t>
       </w:r>
       <w:r>
         <w:t>2026</w:t>
@@ -3734,18 +3875,436 @@
         <w:t>) instead of without like the database. The date is also returned with the full year (2026 instead of 26)</w:t>
       </w:r>
       <w:r>
-        <w:t xml:space="preserve"> unlike the database. To correct this, I will use a substring() to remove the first two digits, being 20, to make the posted date match the database’s.</w:t>
-      </w:r>
-    </w:p>
-    <w:p>
-      <w:pPr>
-        <w:ind w:left="720"/>
-      </w:pPr>
-    </w:p>
-    <w:p>
-      <w:pPr>
-        <w:ind w:left="720"/>
-      </w:pPr>
+        <w:t xml:space="preserve"> unlike the database. To correct this, I will use a </w:t>
+      </w:r>
+      <w:proofErr w:type="gramStart"/>
+      <w:r>
+        <w:t>substring(</w:t>
+      </w:r>
+      <w:proofErr w:type="gramEnd"/>
+      <w:r>
+        <w:t xml:space="preserve">) to remove the first two digits, being 20, to make the posted date match the </w:t>
+      </w:r>
+      <w:proofErr w:type="gramStart"/>
+      <w:r>
+        <w:t>database’s</w:t>
+      </w:r>
+      <w:proofErr w:type="gramEnd"/>
+      <w:r>
+        <w:t>.</w:t>
+      </w:r>
+    </w:p>
+    <w:p>
+      <w:pPr>
+        <w:ind w:left="720"/>
+      </w:pPr>
+    </w:p>
+    <w:p>
+      <w:pPr>
+        <w:ind w:left="720"/>
+      </w:pPr>
+    </w:p>
+    <w:p>
+      <w:pPr>
+        <w:ind w:left="720"/>
+      </w:pPr>
+    </w:p>
+    <w:p>
+      <w:pPr>
+        <w:ind w:left="720"/>
+      </w:pPr>
+    </w:p>
+    <w:p>
+      <w:pPr>
+        <w:ind w:left="720"/>
+      </w:pPr>
+    </w:p>
+    <w:p>
+      <w:pPr>
+        <w:ind w:left="720"/>
+      </w:pPr>
+    </w:p>
+    <w:p>
+      <w:pPr>
+        <w:ind w:left="720"/>
+      </w:pPr>
+    </w:p>
+    <w:p>
+      <w:pPr>
+        <w:ind w:left="720"/>
+      </w:pPr>
+    </w:p>
+    <w:p>
+      <w:pPr>
+        <w:ind w:left="720"/>
+      </w:pPr>
+    </w:p>
+    <w:p>
+      <w:pPr>
+        <w:ind w:left="720"/>
+      </w:pPr>
+    </w:p>
+    <w:p>
+      <w:pPr>
+        <w:rPr>
+          <w:rFonts w:ascii="Trebuchet MS" w:hAnsi="Trebuchet MS" w:cs="Trebuchet MS"/>
+          <w:i/>
+          <w:iCs/>
+        </w:rPr>
+      </w:pPr>
+      <w:r>
+        <w:rPr>
+          <w:rFonts w:ascii="Trebuchet MS" w:hAnsi="Trebuchet MS" w:cs="Trebuchet MS"/>
+        </w:rPr>
+        <w:lastRenderedPageBreak/>
+        <w:t xml:space="preserve">11. </w:t>
+      </w:r>
+      <w:r>
+        <w:rPr>
+          <w:rFonts w:ascii="Trebuchet MS" w:hAnsi="Trebuchet MS" w:cs="Trebuchet MS"/>
+          <w:i/>
+          <w:iCs/>
+        </w:rPr>
+        <w:t>“</w:t>
+      </w:r>
+      <w:r>
+        <w:rPr>
+          <w:rFonts w:ascii="Trebuchet MS" w:hAnsi="Trebuchet MS" w:cs="Trebuchet MS"/>
+          <w:b/>
+          <w:bCs/>
+          <w:i/>
+          <w:iCs/>
+          <w:shd w:val="clear" w:color="auto" w:fill="FFFF00"/>
+        </w:rPr>
+        <w:t>Enhance your booking facility (Task 5) so that the user can enter the date and the number of people (this need NOT appear on the popup).</w:t>
+      </w:r>
+      <w:r>
+        <w:rPr>
+          <w:rFonts w:ascii="Trebuchet MS" w:hAnsi="Trebuchet MS" w:cs="Trebuchet MS"/>
+          <w:i/>
+          <w:iCs/>
+        </w:rPr>
+        <w:t xml:space="preserve"> You should use a user-friendly approach to picking a date. When the button is clicked, the data should be sent over to appropriate routes on your REST API. Check for each type of error returned from the REST API and communicate these to the user in a user-friendly way.”</w:t>
+      </w:r>
+    </w:p>
+    <w:p>
+      <w:pPr>
+        <w:rPr>
+          <w:rFonts w:ascii="Trebuchet MS" w:hAnsi="Trebuchet MS" w:cs="Trebuchet MS"/>
+          <w:i/>
+          <w:iCs/>
+        </w:rPr>
+      </w:pPr>
+    </w:p>
+    <w:p>
+      <w:pPr>
+        <w:ind w:left="720"/>
+        <w:rPr>
+          <w:rFonts w:ascii="Trebuchet MS" w:hAnsi="Trebuchet MS" w:cs="Trebuchet MS"/>
+        </w:rPr>
+      </w:pPr>
+      <w:r>
+        <w:rPr>
+          <w:rFonts w:ascii="Trebuchet MS" w:hAnsi="Trebuchet MS" w:cs="Trebuchet MS"/>
+        </w:rPr>
+        <w:t>I had unintentionally completed task 11 within my task 10 answer. The user-friendly approach to picking a date had been created using the HTML label types. These allow for an easy-to-understand input format for the user. Errors are also presented to the user if an invalid input is given.</w:t>
+      </w:r>
+    </w:p>
+    <w:p>
+      <w:pPr>
+        <w:rPr>
+          <w:rFonts w:ascii="Trebuchet MS" w:hAnsi="Trebuchet MS" w:cs="Trebuchet MS"/>
+        </w:rPr>
+      </w:pPr>
+    </w:p>
+    <w:p>
+      <w:pPr>
+        <w:pStyle w:val="Heading1"/>
+        <w:spacing w:after="240"/>
+        <w:rPr>
+          <w:b/>
+          <w:bCs/>
+        </w:rPr>
+      </w:pPr>
+      <w:r>
+        <w:rPr>
+          <w:b/>
+          <w:bCs/>
+        </w:rPr>
+        <w:t>Part F – Security</w:t>
+      </w:r>
+    </w:p>
+    <w:p>
+      <w:pPr>
+        <w:ind w:left="720"/>
+      </w:pPr>
+      <w:r>
+        <w:t xml:space="preserve">It was at this point where I will begin to implement the security. I will first begin by </w:t>
+      </w:r>
+      <w:r>
+        <w:t xml:space="preserve">hashing my passwords using bycrpt. I will begin by changing the login route in </w:t>
+      </w:r>
+      <w:proofErr w:type="spellStart"/>
+      <w:r>
+        <w:t>server.ts</w:t>
+      </w:r>
+      <w:proofErr w:type="spellEnd"/>
+      <w:r>
+        <w:t xml:space="preserve"> </w:t>
+      </w:r>
+      <w:r>
+        <w:t xml:space="preserve">so that </w:t>
+      </w:r>
+      <w:proofErr w:type="spellStart"/>
+      <w:r>
+        <w:t>bcrypt</w:t>
+      </w:r>
+      <w:proofErr w:type="spellEnd"/>
+      <w:r>
+        <w:t xml:space="preserve"> compares the encrypted version of the given password with the hashed password within the database. If it matches the user is logged in.</w:t>
+      </w:r>
+    </w:p>
+    <w:p>
+      <w:pPr>
+        <w:ind w:left="720"/>
+      </w:pPr>
+      <w:r>
+        <w:drawing>
+          <wp:anchor distT="0" distB="0" distL="114300" distR="114300" simplePos="0" relativeHeight="251685888" behindDoc="0" locked="0" layoutInCell="1" allowOverlap="1" wp14:anchorId="07C63D1A" wp14:editId="0366808C">
+            <wp:simplePos x="0" y="0"/>
+            <wp:positionH relativeFrom="margin">
+              <wp:align>right</wp:align>
+            </wp:positionH>
+            <wp:positionV relativeFrom="paragraph">
+              <wp:posOffset>160655</wp:posOffset>
+            </wp:positionV>
+            <wp:extent cx="6858000" cy="1659890"/>
+            <wp:effectExtent l="0" t="0" r="0" b="0"/>
+            <wp:wrapTopAndBottom/>
+            <wp:docPr id="286395475" name="Picture 1"/>
+            <wp:cNvGraphicFramePr>
+              <a:graphicFrameLocks xmlns:a="http://schemas.openxmlformats.org/drawingml/2006/main" noChangeAspect="1"/>
+            </wp:cNvGraphicFramePr>
+            <a:graphic xmlns:a="http://schemas.openxmlformats.org/drawingml/2006/main">
+              <a:graphicData uri="http://schemas.openxmlformats.org/drawingml/2006/picture">
+                <pic:pic xmlns:pic="http://schemas.openxmlformats.org/drawingml/2006/picture">
+                  <pic:nvPicPr>
+                    <pic:cNvPr id="286395475" name=""/>
+                    <pic:cNvPicPr/>
+                  </pic:nvPicPr>
+                  <pic:blipFill>
+                    <a:blip r:embed="rId28" cstate="print">
+                      <a:extLst>
+                        <a:ext uri="{28A0092B-C50C-407E-A947-70E740481C1C}">
+                          <a14:useLocalDpi xmlns:a14="http://schemas.microsoft.com/office/drawing/2010/main" val="0"/>
+                        </a:ext>
+                      </a:extLst>
+                    </a:blip>
+                    <a:stretch>
+                      <a:fillRect/>
+                    </a:stretch>
+                  </pic:blipFill>
+                  <pic:spPr>
+                    <a:xfrm>
+                      <a:off x="0" y="0"/>
+                      <a:ext cx="6858000" cy="1659890"/>
+                    </a:xfrm>
+                    <a:prstGeom prst="rect">
+                      <a:avLst/>
+                    </a:prstGeom>
+                  </pic:spPr>
+                </pic:pic>
+              </a:graphicData>
+            </a:graphic>
+          </wp:anchor>
+        </w:drawing>
+      </w:r>
+    </w:p>
+    <w:p/>
+    <w:p>
+      <w:pPr>
+        <w:ind w:left="720"/>
+      </w:pPr>
+      <w:r>
+        <w:drawing>
+          <wp:anchor distT="0" distB="0" distL="114300" distR="114300" simplePos="0" relativeHeight="251686912" behindDoc="0" locked="0" layoutInCell="1" allowOverlap="1" wp14:anchorId="364C8281" wp14:editId="7C54036D">
+            <wp:simplePos x="0" y="0"/>
+            <wp:positionH relativeFrom="column">
+              <wp:posOffset>2857500</wp:posOffset>
+            </wp:positionH>
+            <wp:positionV relativeFrom="paragraph">
+              <wp:posOffset>2585720</wp:posOffset>
+            </wp:positionV>
+            <wp:extent cx="4051300" cy="706755"/>
+            <wp:effectExtent l="0" t="0" r="6350" b="0"/>
+            <wp:wrapTopAndBottom/>
+            <wp:docPr id="584983131" name="Picture 1"/>
+            <wp:cNvGraphicFramePr>
+              <a:graphicFrameLocks xmlns:a="http://schemas.openxmlformats.org/drawingml/2006/main" noChangeAspect="1"/>
+            </wp:cNvGraphicFramePr>
+            <a:graphic xmlns:a="http://schemas.openxmlformats.org/drawingml/2006/main">
+              <a:graphicData uri="http://schemas.openxmlformats.org/drawingml/2006/picture">
+                <pic:pic xmlns:pic="http://schemas.openxmlformats.org/drawingml/2006/picture">
+                  <pic:nvPicPr>
+                    <pic:cNvPr id="584983131" name=""/>
+                    <pic:cNvPicPr/>
+                  </pic:nvPicPr>
+                  <pic:blipFill>
+                    <a:blip r:embed="rId29">
+                      <a:extLst>
+                        <a:ext uri="{28A0092B-C50C-407E-A947-70E740481C1C}">
+                          <a14:useLocalDpi xmlns:a14="http://schemas.microsoft.com/office/drawing/2010/main" val="0"/>
+                        </a:ext>
+                      </a:extLst>
+                    </a:blip>
+                    <a:stretch>
+                      <a:fillRect/>
+                    </a:stretch>
+                  </pic:blipFill>
+                  <pic:spPr>
+                    <a:xfrm>
+                      <a:off x="0" y="0"/>
+                      <a:ext cx="4051300" cy="706755"/>
+                    </a:xfrm>
+                    <a:prstGeom prst="rect">
+                      <a:avLst/>
+                    </a:prstGeom>
+                  </pic:spPr>
+                </pic:pic>
+              </a:graphicData>
+            </a:graphic>
+            <wp14:sizeRelH relativeFrom="margin">
+              <wp14:pctWidth>0</wp14:pctWidth>
+            </wp14:sizeRelH>
+            <wp14:sizeRelV relativeFrom="margin">
+              <wp14:pctHeight>0</wp14:pctHeight>
+            </wp14:sizeRelV>
+          </wp:anchor>
+        </w:drawing>
+      </w:r>
+      <w:r>
+        <w:drawing>
+          <wp:anchor distT="0" distB="0" distL="114300" distR="114300" simplePos="0" relativeHeight="251683840" behindDoc="0" locked="0" layoutInCell="1" allowOverlap="1" wp14:anchorId="5FCD8533" wp14:editId="785EC9FC">
+            <wp:simplePos x="0" y="0"/>
+            <wp:positionH relativeFrom="column">
+              <wp:posOffset>806450</wp:posOffset>
+            </wp:positionH>
+            <wp:positionV relativeFrom="paragraph">
+              <wp:posOffset>2578100</wp:posOffset>
+            </wp:positionV>
+            <wp:extent cx="1854200" cy="723900"/>
+            <wp:effectExtent l="0" t="0" r="0" b="0"/>
+            <wp:wrapTopAndBottom/>
+            <wp:docPr id="1761927811" name="Picture 1"/>
+            <wp:cNvGraphicFramePr>
+              <a:graphicFrameLocks xmlns:a="http://schemas.openxmlformats.org/drawingml/2006/main" noChangeAspect="1"/>
+            </wp:cNvGraphicFramePr>
+            <a:graphic xmlns:a="http://schemas.openxmlformats.org/drawingml/2006/main">
+              <a:graphicData uri="http://schemas.openxmlformats.org/drawingml/2006/picture">
+                <pic:pic xmlns:pic="http://schemas.openxmlformats.org/drawingml/2006/picture">
+                  <pic:nvPicPr>
+                    <pic:cNvPr id="1761927811" name=""/>
+                    <pic:cNvPicPr/>
+                  </pic:nvPicPr>
+                  <pic:blipFill>
+                    <a:blip r:embed="rId30">
+                      <a:extLst>
+                        <a:ext uri="{28A0092B-C50C-407E-A947-70E740481C1C}">
+                          <a14:useLocalDpi xmlns:a14="http://schemas.microsoft.com/office/drawing/2010/main" val="0"/>
+                        </a:ext>
+                      </a:extLst>
+                    </a:blip>
+                    <a:stretch>
+                      <a:fillRect/>
+                    </a:stretch>
+                  </pic:blipFill>
+                  <pic:spPr>
+                    <a:xfrm>
+                      <a:off x="0" y="0"/>
+                      <a:ext cx="1854200" cy="723900"/>
+                    </a:xfrm>
+                    <a:prstGeom prst="rect">
+                      <a:avLst/>
+                    </a:prstGeom>
+                  </pic:spPr>
+                </pic:pic>
+              </a:graphicData>
+            </a:graphic>
+          </wp:anchor>
+        </w:drawing>
+      </w:r>
+      <w:r>
+        <w:drawing>
+          <wp:anchor distT="0" distB="0" distL="114300" distR="114300" simplePos="0" relativeHeight="251684864" behindDoc="0" locked="0" layoutInCell="1" allowOverlap="1" wp14:anchorId="2134F0B7" wp14:editId="45E52919">
+            <wp:simplePos x="0" y="0"/>
+            <wp:positionH relativeFrom="margin">
+              <wp:align>center</wp:align>
+            </wp:positionH>
+            <wp:positionV relativeFrom="paragraph">
+              <wp:posOffset>762635</wp:posOffset>
+            </wp:positionV>
+            <wp:extent cx="4171950" cy="1689100"/>
+            <wp:effectExtent l="0" t="0" r="0" b="6350"/>
+            <wp:wrapTopAndBottom/>
+            <wp:docPr id="1677917461" name="Picture 1"/>
+            <wp:cNvGraphicFramePr>
+              <a:graphicFrameLocks xmlns:a="http://schemas.openxmlformats.org/drawingml/2006/main" noChangeAspect="1"/>
+            </wp:cNvGraphicFramePr>
+            <a:graphic xmlns:a="http://schemas.openxmlformats.org/drawingml/2006/main">
+              <a:graphicData uri="http://schemas.openxmlformats.org/drawingml/2006/picture">
+                <pic:pic xmlns:pic="http://schemas.openxmlformats.org/drawingml/2006/picture">
+                  <pic:nvPicPr>
+                    <pic:cNvPr id="1677917461" name=""/>
+                    <pic:cNvPicPr/>
+                  </pic:nvPicPr>
+                  <pic:blipFill>
+                    <a:blip r:embed="rId31" cstate="print">
+                      <a:extLst>
+                        <a:ext uri="{28A0092B-C50C-407E-A947-70E740481C1C}">
+                          <a14:useLocalDpi xmlns:a14="http://schemas.microsoft.com/office/drawing/2010/main" val="0"/>
+                        </a:ext>
+                      </a:extLst>
+                    </a:blip>
+                    <a:stretch>
+                      <a:fillRect/>
+                    </a:stretch>
+                  </pic:blipFill>
+                  <pic:spPr>
+                    <a:xfrm>
+                      <a:off x="0" y="0"/>
+                      <a:ext cx="4171950" cy="1689100"/>
+                    </a:xfrm>
+                    <a:prstGeom prst="rect">
+                      <a:avLst/>
+                    </a:prstGeom>
+                  </pic:spPr>
+                </pic:pic>
+              </a:graphicData>
+            </a:graphic>
+            <wp14:sizeRelH relativeFrom="margin">
+              <wp14:pctWidth>0</wp14:pctWidth>
+            </wp14:sizeRelH>
+            <wp14:sizeRelV relativeFrom="margin">
+              <wp14:pctHeight>0</wp14:pctHeight>
+            </wp14:sizeRelV>
+          </wp:anchor>
+        </w:drawing>
+      </w:r>
+      <w:r>
+        <w:rPr>
+          <w:noProof/>
+        </w:rPr>
+        <w:t xml:space="preserve"> </w:t>
+      </w:r>
+      <w:r>
+        <w:t xml:space="preserve">I am aware that the passwords within the given database are not already hashed so the code that I will create won’t work on it. To resolve this, I will also create a </w:t>
+      </w:r>
+      <w:r>
+        <w:t>one-time</w:t>
+      </w:r>
+      <w:r>
+        <w:t xml:space="preserve"> file which will select all the users from the database and update their passwords with their hashed versions. I’ll will use the appropriate console logs to confirm that the conversion is successful.</w:t>
+      </w:r>
     </w:p>
     <w:p>
       <w:pPr>

</xml_diff>

<commit_message>
Added code for xss prevention
</commit_message>
<xml_diff>
--- a/WAD_Report.docx
+++ b/WAD_Report.docx
@@ -4063,14 +4063,20 @@
       <w:r>
         <w:t xml:space="preserve"> compares the encrypted version of the given password with the hashed password within the database. If it matches the user is logged in.</w:t>
       </w:r>
-    </w:p>
-    <w:p>
-      <w:pPr>
-        <w:ind w:left="720"/>
-      </w:pPr>
-      <w:r>
+      <w:r>
+        <w:t xml:space="preserve"> In the event of a data breach this prevents the person from see passwords in plain text.</w:t>
+      </w:r>
+    </w:p>
+    <w:p>
+      <w:pPr>
+        <w:ind w:left="720"/>
+      </w:pPr>
+      <w:r>
+        <w:rPr>
+          <w:noProof/>
+        </w:rPr>
         <w:drawing>
-          <wp:anchor distT="0" distB="0" distL="114300" distR="114300" simplePos="0" relativeHeight="251685888" behindDoc="0" locked="0" layoutInCell="1" allowOverlap="1" wp14:anchorId="07C63D1A" wp14:editId="0366808C">
+          <wp:anchor distT="0" distB="0" distL="114300" distR="114300" simplePos="0" relativeHeight="251685888" behindDoc="0" locked="0" layoutInCell="1" allowOverlap="1" wp14:anchorId="07C63D1A" wp14:editId="2D334A88">
             <wp:simplePos x="0" y="0"/>
             <wp:positionH relativeFrom="margin">
               <wp:align>right</wp:align>
@@ -4126,6 +4132,9 @@
         <w:ind w:left="720"/>
       </w:pPr>
       <w:r>
+        <w:rPr>
+          <w:noProof/>
+        </w:rPr>
         <w:drawing>
           <wp:anchor distT="0" distB="0" distL="114300" distR="114300" simplePos="0" relativeHeight="251686912" behindDoc="0" locked="0" layoutInCell="1" allowOverlap="1" wp14:anchorId="364C8281" wp14:editId="7C54036D">
             <wp:simplePos x="0" y="0"/>
@@ -4183,6 +4192,9 @@
         </w:drawing>
       </w:r>
       <w:r>
+        <w:rPr>
+          <w:noProof/>
+        </w:rPr>
         <w:drawing>
           <wp:anchor distT="0" distB="0" distL="114300" distR="114300" simplePos="0" relativeHeight="251683840" behindDoc="0" locked="0" layoutInCell="1" allowOverlap="1" wp14:anchorId="5FCD8533" wp14:editId="785EC9FC">
             <wp:simplePos x="0" y="0"/>
@@ -4234,6 +4246,9 @@
         </w:drawing>
       </w:r>
       <w:r>
+        <w:rPr>
+          <w:noProof/>
+        </w:rPr>
         <w:drawing>
           <wp:anchor distT="0" distB="0" distL="114300" distR="114300" simplePos="0" relativeHeight="251684864" behindDoc="0" locked="0" layoutInCell="1" allowOverlap="1" wp14:anchorId="2134F0B7" wp14:editId="45E52919">
             <wp:simplePos x="0" y="0"/>
@@ -4304,6 +4319,187 @@
       </w:r>
       <w:r>
         <w:t xml:space="preserve"> file which will select all the users from the database and update their passwords with their hashed versions. I’ll will use the appropriate console logs to confirm that the conversion is successful.</w:t>
+      </w:r>
+    </w:p>
+    <w:p>
+      <w:pPr>
+        <w:ind w:left="720"/>
+      </w:pPr>
+    </w:p>
+    <w:p>
+      <w:pPr>
+        <w:ind w:left="720"/>
+      </w:pPr>
+    </w:p>
+    <w:p>
+      <w:pPr>
+        <w:ind w:left="720"/>
+      </w:pPr>
+      <w:r>
+        <w:lastRenderedPageBreak/>
+        <w:drawing>
+          <wp:anchor distT="0" distB="0" distL="114300" distR="114300" simplePos="0" relativeHeight="251688960" behindDoc="0" locked="0" layoutInCell="1" allowOverlap="1" wp14:anchorId="6F3F219F" wp14:editId="437D0BC5">
+            <wp:simplePos x="0" y="0"/>
+            <wp:positionH relativeFrom="column">
+              <wp:posOffset>3632200</wp:posOffset>
+            </wp:positionH>
+            <wp:positionV relativeFrom="paragraph">
+              <wp:posOffset>1238250</wp:posOffset>
+            </wp:positionV>
+            <wp:extent cx="3295650" cy="1859280"/>
+            <wp:effectExtent l="0" t="0" r="0" b="7620"/>
+            <wp:wrapTopAndBottom/>
+            <wp:docPr id="682833408" name="Picture 1"/>
+            <wp:cNvGraphicFramePr>
+              <a:graphicFrameLocks xmlns:a="http://schemas.openxmlformats.org/drawingml/2006/main" noChangeAspect="1"/>
+            </wp:cNvGraphicFramePr>
+            <a:graphic xmlns:a="http://schemas.openxmlformats.org/drawingml/2006/main">
+              <a:graphicData uri="http://schemas.openxmlformats.org/drawingml/2006/picture">
+                <pic:pic xmlns:pic="http://schemas.openxmlformats.org/drawingml/2006/picture">
+                  <pic:nvPicPr>
+                    <pic:cNvPr id="682833408" name=""/>
+                    <pic:cNvPicPr/>
+                  </pic:nvPicPr>
+                  <pic:blipFill>
+                    <a:blip r:embed="rId32" cstate="print">
+                      <a:extLst>
+                        <a:ext uri="{28A0092B-C50C-407E-A947-70E740481C1C}">
+                          <a14:useLocalDpi xmlns:a14="http://schemas.microsoft.com/office/drawing/2010/main" val="0"/>
+                        </a:ext>
+                      </a:extLst>
+                    </a:blip>
+                    <a:stretch>
+                      <a:fillRect/>
+                    </a:stretch>
+                  </pic:blipFill>
+                  <pic:spPr>
+                    <a:xfrm>
+                      <a:off x="0" y="0"/>
+                      <a:ext cx="3295650" cy="1859280"/>
+                    </a:xfrm>
+                    <a:prstGeom prst="rect">
+                      <a:avLst/>
+                    </a:prstGeom>
+                  </pic:spPr>
+                </pic:pic>
+              </a:graphicData>
+            </a:graphic>
+            <wp14:sizeRelH relativeFrom="margin">
+              <wp14:pctWidth>0</wp14:pctWidth>
+            </wp14:sizeRelH>
+            <wp14:sizeRelV relativeFrom="margin">
+              <wp14:pctHeight>0</wp14:pctHeight>
+            </wp14:sizeRelV>
+          </wp:anchor>
+        </w:drawing>
+      </w:r>
+      <w:r>
+        <w:drawing>
+          <wp:anchor distT="0" distB="0" distL="114300" distR="114300" simplePos="0" relativeHeight="251687936" behindDoc="0" locked="0" layoutInCell="1" allowOverlap="1" wp14:anchorId="3D190494" wp14:editId="0B7931ED">
+            <wp:simplePos x="0" y="0"/>
+            <wp:positionH relativeFrom="page">
+              <wp:posOffset>127000</wp:posOffset>
+            </wp:positionH>
+            <wp:positionV relativeFrom="paragraph">
+              <wp:posOffset>1311910</wp:posOffset>
+            </wp:positionV>
+            <wp:extent cx="3702050" cy="1726565"/>
+            <wp:effectExtent l="0" t="0" r="0" b="6985"/>
+            <wp:wrapTopAndBottom/>
+            <wp:docPr id="1404703085" name="Picture 1"/>
+            <wp:cNvGraphicFramePr>
+              <a:graphicFrameLocks xmlns:a="http://schemas.openxmlformats.org/drawingml/2006/main" noChangeAspect="1"/>
+            </wp:cNvGraphicFramePr>
+            <a:graphic xmlns:a="http://schemas.openxmlformats.org/drawingml/2006/main">
+              <a:graphicData uri="http://schemas.openxmlformats.org/drawingml/2006/picture">
+                <pic:pic xmlns:pic="http://schemas.openxmlformats.org/drawingml/2006/picture">
+                  <pic:nvPicPr>
+                    <pic:cNvPr id="1404703085" name=""/>
+                    <pic:cNvPicPr/>
+                  </pic:nvPicPr>
+                  <pic:blipFill>
+                    <a:blip r:embed="rId33" cstate="print">
+                      <a:extLst>
+                        <a:ext uri="{28A0092B-C50C-407E-A947-70E740481C1C}">
+                          <a14:useLocalDpi xmlns:a14="http://schemas.microsoft.com/office/drawing/2010/main" val="0"/>
+                        </a:ext>
+                      </a:extLst>
+                    </a:blip>
+                    <a:stretch>
+                      <a:fillRect/>
+                    </a:stretch>
+                  </pic:blipFill>
+                  <pic:spPr>
+                    <a:xfrm>
+                      <a:off x="0" y="0"/>
+                      <a:ext cx="3702050" cy="1726565"/>
+                    </a:xfrm>
+                    <a:prstGeom prst="rect">
+                      <a:avLst/>
+                    </a:prstGeom>
+                  </pic:spPr>
+                </pic:pic>
+              </a:graphicData>
+            </a:graphic>
+            <wp14:sizeRelH relativeFrom="margin">
+              <wp14:pctWidth>0</wp14:pctWidth>
+            </wp14:sizeRelH>
+            <wp14:sizeRelV relativeFrom="margin">
+              <wp14:pctHeight>0</wp14:pctHeight>
+            </wp14:sizeRelV>
+          </wp:anchor>
+        </w:drawing>
+      </w:r>
+      <w:r>
+        <w:t xml:space="preserve">My next plan is to prevent XSS attacks by using the XSS module to sanitise my </w:t>
+      </w:r>
+      <w:r>
+        <w:t xml:space="preserve">GET routes. These routes are most at risk as they </w:t>
+      </w:r>
+      <w:r>
+        <w:t xml:space="preserve">return accommodation data from the database, </w:t>
+      </w:r>
+      <w:r>
+        <w:t>which</w:t>
+      </w:r>
+      <w:r>
+        <w:t xml:space="preserve"> is then rendered in the browser</w:t>
+      </w:r>
+      <w:r>
+        <w:t xml:space="preserve">. The </w:t>
+      </w:r>
+      <w:proofErr w:type="spellStart"/>
+      <w:proofErr w:type="gramStart"/>
+      <w:r>
+        <w:t>xss</w:t>
+      </w:r>
+      <w:proofErr w:type="spellEnd"/>
+      <w:r>
+        <w:t>(</w:t>
+      </w:r>
+      <w:proofErr w:type="gramEnd"/>
+      <w:r>
+        <w:t>)</w:t>
+      </w:r>
+      <w:r>
+        <w:t xml:space="preserve"> scans the data coming out of </w:t>
+      </w:r>
+      <w:r>
+        <w:t>the</w:t>
+      </w:r>
+      <w:r>
+        <w:t xml:space="preserve"> database and replaces any HTML characters that could be used for an attack with safe versions before sending them to the browser</w:t>
+      </w:r>
+      <w:r>
+        <w:t xml:space="preserve">. </w:t>
+      </w:r>
+      <w:proofErr w:type="gramStart"/>
+      <w:r>
+        <w:t>So</w:t>
+      </w:r>
+      <w:proofErr w:type="gramEnd"/>
+      <w:r>
+        <w:t xml:space="preserve"> I will set up my code, so each piece of information retrieved by the GET request from the database is sanitised before it is sent to the browser.</w:t>
       </w:r>
     </w:p>
     <w:p>
@@ -4962,7 +5158,6 @@
   <w:style w:type="character" w:default="1" w:styleId="DefaultParagraphFont">
     <w:name w:val="Default Paragraph Font"/>
     <w:uiPriority w:val="1"/>
-    <w:semiHidden/>
     <w:unhideWhenUsed/>
   </w:style>
   <w:style w:type="table" w:default="1" w:styleId="TableNormal">

</xml_diff>